<commit_message>
feat(repo): sincroniza consolidacion documental y tooling de control
</commit_message>
<xml_diff>
--- a/DOCS - ANEJOS/3.- Estudio Geotecnico/Anexo 3 - Estudio Geotecnico.docx
+++ b/DOCS - ANEJOS/3.- Estudio Geotecnico/Anexo 3 - Estudio Geotecnico.docx
@@ -3,7 +3,7 @@
 <w:document xmlns:wpc="http://schemas.microsoft.com/office/word/2010/wordprocessingCanvas" xmlns:cx="http://schemas.microsoft.com/office/drawing/2014/chartex" xmlns:cx1="http://schemas.microsoft.com/office/drawing/2015/9/8/chartex" xmlns:cx2="http://schemas.microsoft.com/office/drawing/2015/10/21/chartex" xmlns:cx3="http://schemas.microsoft.com/office/drawing/2016/5/9/chartex" xmlns:cx4="http://schemas.microsoft.com/office/drawing/2016/5/10/chartex" xmlns:cx5="http://schemas.microsoft.com/office/drawing/2016/5/11/chartex" xmlns:cx6="http://schemas.microsoft.com/office/drawing/2016/5/12/chartex" xmlns:cx7="http://schemas.microsoft.com/office/drawing/2016/5/13/chartex" xmlns:cx8="http://schemas.microsoft.com/office/drawing/2016/5/14/chartex" xmlns:mc="http://schemas.openxmlformats.org/markup-compatibility/2006" xmlns:aink="http://schemas.microsoft.com/office/drawing/2016/ink" xmlns:am3d="http://schemas.microsoft.com/office/drawing/2017/model3d" xmlns:o="urn:schemas-microsoft-com:office:office" xmlns:oel="http://schemas.microsoft.com/office/2019/extlst" xmlns:r="http://schemas.openxmlformats.org/officeDocument/2006/relationships" xmlns:m="http://schemas.openxmlformats.org/officeDocument/2006/math" xmlns:v="urn:schemas-microsoft-com:vml" xmlns:wp14="http://schemas.microsoft.com/office/word/2010/wordprocessingDrawing" xmlns:wp="http://schemas.openxmlformats.org/drawingml/2006/wordprocessingDrawing" xmlns:w10="urn:schemas-microsoft-com:office:word" xmlns:w="http://schemas.openxmlformats.org/wordprocessingml/2006/main" xmlns:w14="http://schemas.microsoft.com/office/word/2010/wordml" xmlns:w15="http://schemas.microsoft.com/office/word/2012/wordml" xmlns:w16cex="http://schemas.microsoft.com/office/word/2018/wordml/cex" xmlns:w16cid="http://schemas.microsoft.com/office/word/2016/wordml/cid" xmlns:w16="http://schemas.microsoft.com/office/word/2018/wordml" xmlns:w16du="http://schemas.microsoft.com/office/word/2023/wordml/word16du" xmlns:w16sdtdh="http://schemas.microsoft.com/office/word/2020/wordml/sdtdatahash" xmlns:w16sdtfl="http://schemas.microsoft.com/office/word/2024/wordml/sdtformatlock" xmlns:w16se="http://schemas.microsoft.com/office/word/2015/wordml/symex" xmlns:wpg="http://schemas.microsoft.com/office/word/2010/wordprocessingGroup" xmlns:wpi="http://schemas.microsoft.com/office/word/2010/wordprocessingInk" xmlns:wne="http://schemas.microsoft.com/office/word/2006/wordml" xmlns:wps="http://schemas.microsoft.com/office/word/2010/wordprocessingShape" mc:Ignorable="w14 w15 w16se w16cid w16 w16cex w16sdtdh w16sdtfl w16du wp14">
   <w:body>
     <w:p>
-      <w:pPr>
+      <w:pPr xmlns:w="http://schemas.openxmlformats.org/wordprocessingml/2006/main">
         <w:pBdr>
           <w:bottom w:val="single" w:sz="12" w:space="4" w:color="366092"/>
         </w:pBdr>
@@ -33,7 +33,7 @@
       </w:pPr>
     </w:p>
     <w:p>
-      <w:pPr>
+      <w:pPr xmlns:w="http://schemas.openxmlformats.org/wordprocessingml/2006/main">
         <w:pBdr>
           <w:top w:val="single" w:sz="4" w:space="1" w:color="auto"/>
           <w:left w:val="single" w:sz="4" w:space="4" w:color="auto"/>
@@ -56,7 +56,7 @@
       </w:r>
     </w:p>
     <w:p>
-      <w:pPr>
+      <w:pPr xmlns:w="http://schemas.openxmlformats.org/wordprocessingml/2006/main">
         <w:pBdr>
           <w:top w:val="single" w:sz="4" w:space="1" w:color="auto"/>
           <w:left w:val="single" w:sz="4" w:space="4" w:color="auto"/>
@@ -82,7 +82,7 @@
       </w:r>
     </w:p>
     <w:p>
-      <w:pPr>
+      <w:pPr xmlns:w="http://schemas.openxmlformats.org/wordprocessingml/2006/main">
         <w:spacing w:before="240" w:after="60"/>
         <w:jc w:val="center"/>
       </w:pPr>
@@ -95,7 +95,7 @@
       </w:r>
     </w:p>
     <w:p>
-      <w:pPr>
+      <w:pPr xmlns:w="http://schemas.openxmlformats.org/wordprocessingml/2006/main">
         <w:spacing w:after="120"/>
         <w:jc w:val="center"/>
       </w:pPr>
@@ -1122,7 +1122,7 @@
       </w:pPr>
     </w:p>
     <w:p xmlns:w14="http://schemas.microsoft.com/office/word/2010/wordml" xmlns:w="http://schemas.openxmlformats.org/wordprocessingml/2006/main">
-      <w:pPr>
+      <w:pPr xmlns:w="http://schemas.openxmlformats.org/wordprocessingml/2006/main">
         <w:pBdr>
           <w:top w:val="single" w:sz="4" w:space="1" w:color="auto"/>
           <w:left w:val="single" w:sz="4" w:space="4" w:color="auto"/>
@@ -1145,7 +1145,7 @@
       </w:r>
     </w:p>
     <w:p xmlns:w14="http://schemas.microsoft.com/office/word/2010/wordml" xmlns:w="http://schemas.openxmlformats.org/wordprocessingml/2006/main">
-      <w:pPr>
+      <w:pPr xmlns:w="http://schemas.openxmlformats.org/wordprocessingml/2006/main">
         <w:pBdr>
           <w:top w:val="single" w:sz="4" w:space="1" w:color="auto"/>
           <w:left w:val="single" w:sz="4" w:space="4" w:color="auto"/>
@@ -1171,7 +1171,7 @@
       </w:r>
     </w:p>
     <w:p xmlns:w14="http://schemas.microsoft.com/office/word/2010/wordml" xmlns:w="http://schemas.openxmlformats.org/wordprocessingml/2006/main">
-      <w:pPr>
+      <w:pPr xmlns:w="http://schemas.openxmlformats.org/wordprocessingml/2006/main">
         <w:spacing w:before="240" w:after="60"/>
         <w:jc w:val="center"/>
       </w:pPr>
@@ -1186,6 +1186,8 @@
     <w:p>
       <w:pPr>
         <w:pStyle w:val="Ttulo2"/>
+        <w:spacing w:before="220" w:after="120" w:lineRule="auto"/>
+        <w:keepNext/>
       </w:pPr>
       <w:bookmarkStart w:id="0" w:name="_TocPM000001"/>
       <w:r>
@@ -1195,7 +1197,7 @@
     </w:p>
     <w:p xmlns:w14="http://schemas.microsoft.com/office/word/2010/wordml" xmlns:w="http://schemas.openxmlformats.org/wordprocessingml/2006/main">
       <w:pPr>
-        <w:spacing w:after="120"/>
+        <w:spacing w:after="0" w:before="0" w:line="288" w:lineRule="auto"/>
       </w:pPr>
       <w:r>
         <w:t xml:space="preserve">El presente anejo tiene por objeto dejar iniciado el estudio geotécnico asociado al Proyecto de Urbanización - Ampliación Plaza Mayor, encajando la documentación disponible dentro de una estructura técnica homogénea con el resto del expediente. En esta fase se limita a ordenar la base documental y a señalar la necesidad de incorporar y verificar los datos geotécnicos específicos del ámbito.</w:t>
@@ -1204,6 +1206,8 @@
     <w:p>
       <w:pPr>
         <w:pStyle w:val="Ttulo2"/>
+        <w:spacing w:before="220" w:after="120" w:lineRule="auto"/>
+        <w:keepNext/>
       </w:pPr>
       <w:bookmarkStart w:id="1" w:name="_TocPM000002"/>
       <w:r>
@@ -1214,6 +1218,8 @@
     <w:p>
       <w:pPr>
         <w:pStyle w:val="Ttulo2"/>
+        <w:spacing w:before="220" w:after="120" w:lineRule="auto"/>
+        <w:keepNext/>
       </w:pPr>
       <w:bookmarkStart w:id="2" w:name="_TocPM000003"/>
       <w:r>
@@ -1224,6 +1230,8 @@
     <w:p>
       <w:pPr>
         <w:pStyle w:val="Ttulo3"/>
+        <w:spacing w:before="180" w:after="100" w:lineRule="auto"/>
+        <w:keepNext/>
       </w:pPr>
       <w:bookmarkStart w:id="3" w:name="_TocPM000004"/>
       <w:r>
@@ -1234,6 +1242,8 @@
     <w:p>
       <w:pPr>
         <w:pStyle w:val="Ttulo3"/>
+        <w:spacing w:before="180" w:after="100" w:lineRule="auto"/>
+        <w:keepNext/>
       </w:pPr>
       <w:bookmarkStart w:id="4" w:name="_TocPM000005"/>
       <w:r>
@@ -1244,6 +1254,8 @@
     <w:p>
       <w:pPr>
         <w:pStyle w:val="Ttulo4"/>
+        <w:spacing w:before="160" w:after="80" w:lineRule="auto"/>
+        <w:keepNext/>
       </w:pPr>
       <w:bookmarkStart w:id="5" w:name="_TocPM000006"/>
       <w:r>
@@ -1254,6 +1266,8 @@
     <w:p>
       <w:pPr>
         <w:pStyle w:val="Ttulo4"/>
+        <w:spacing w:before="160" w:after="80" w:lineRule="auto"/>
+        <w:keepNext/>
       </w:pPr>
       <w:bookmarkStart w:id="6" w:name="_TocPM000007"/>
       <w:r>
@@ -1264,6 +1278,8 @@
     <w:p>
       <w:pPr>
         <w:pStyle w:val="Ttulo4"/>
+        <w:spacing w:before="160" w:after="80" w:lineRule="auto"/>
+        <w:keepNext/>
       </w:pPr>
       <w:bookmarkStart w:id="7" w:name="_TocPM000008"/>
       <w:r>
@@ -1274,6 +1290,8 @@
     <w:p>
       <w:pPr>
         <w:pStyle w:val="Ttulo3"/>
+        <w:spacing w:before="180" w:after="100" w:lineRule="auto"/>
+        <w:keepNext/>
       </w:pPr>
       <w:bookmarkStart w:id="8" w:name="_TocPM000009"/>
       <w:r>
@@ -1284,6 +1302,8 @@
     <w:p>
       <w:pPr>
         <w:pStyle w:val="Ttulo2"/>
+        <w:spacing w:before="220" w:after="120" w:lineRule="auto"/>
+        <w:keepNext/>
       </w:pPr>
       <w:bookmarkStart w:id="9" w:name="_TocPM000010"/>
       <w:r>
@@ -1294,6 +1314,8 @@
     <w:p>
       <w:pPr>
         <w:pStyle w:val="Ttulo3"/>
+        <w:spacing w:before="180" w:after="100" w:lineRule="auto"/>
+        <w:keepNext/>
       </w:pPr>
       <w:bookmarkStart w:id="10" w:name="_TocPM000011"/>
       <w:r>
@@ -1304,6 +1326,8 @@
     <w:p>
       <w:pPr>
         <w:pStyle w:val="Ttulo3"/>
+        <w:spacing w:before="180" w:after="100" w:lineRule="auto"/>
+        <w:keepNext/>
       </w:pPr>
       <w:bookmarkStart w:id="11" w:name="_TocPM000012"/>
       <w:r>
@@ -1314,6 +1338,8 @@
     <w:p>
       <w:pPr>
         <w:pStyle w:val="Ttulo3"/>
+        <w:spacing w:before="180" w:after="100" w:lineRule="auto"/>
+        <w:keepNext/>
       </w:pPr>
       <w:bookmarkStart w:id="12" w:name="_TocPM000013"/>
       <w:r>
@@ -1324,6 +1350,8 @@
     <w:p>
       <w:pPr>
         <w:pStyle w:val="Ttulo3"/>
+        <w:spacing w:before="180" w:after="100" w:lineRule="auto"/>
+        <w:keepNext/>
       </w:pPr>
       <w:bookmarkStart w:id="13" w:name="_TocPM000014"/>
       <w:r>
@@ -1334,6 +1362,8 @@
     <w:p>
       <w:pPr>
         <w:pStyle w:val="Ttulo3"/>
+        <w:spacing w:before="180" w:after="100" w:lineRule="auto"/>
+        <w:keepNext/>
       </w:pPr>
       <w:bookmarkStart w:id="14" w:name="_TocPM000015"/>
       <w:r>
@@ -1344,6 +1374,8 @@
     <w:p>
       <w:pPr>
         <w:pStyle w:val="Ttulo2"/>
+        <w:spacing w:before="220" w:after="120" w:lineRule="auto"/>
+        <w:keepNext/>
       </w:pPr>
       <w:bookmarkStart w:id="15" w:name="_TocPM000016"/>
       <w:r>
@@ -1383,2009 +1415,2009 @@
 </file>
 
 <file path=word/footer1.xml><?xml version="1.0" encoding="utf-8"?>
-<w:ftr xmlns:wpc="http://schemas.microsoft.com/office/word/2010/wordprocessingCanvas" xmlns:cx="http://schemas.microsoft.com/office/drawing/2014/chartex" xmlns:cx1="http://schemas.microsoft.com/office/drawing/2015/9/8/chartex" xmlns:cx2="http://schemas.microsoft.com/office/drawing/2015/10/21/chartex" xmlns:cx3="http://schemas.microsoft.com/office/drawing/2016/5/9/chartex" xmlns:cx4="http://schemas.microsoft.com/office/drawing/2016/5/10/chartex" xmlns:cx5="http://schemas.microsoft.com/office/drawing/2016/5/11/chartex" xmlns:cx6="http://schemas.microsoft.com/office/drawing/2016/5/12/chartex" xmlns:cx7="http://schemas.microsoft.com/office/drawing/2016/5/13/chartex" xmlns:cx8="http://schemas.microsoft.com/office/drawing/2016/5/14/chartex" xmlns:mc="http://schemas.openxmlformats.org/markup-compatibility/2006" xmlns:aink="http://schemas.microsoft.com/office/drawing/2016/ink" xmlns:am3d="http://schemas.microsoft.com/office/drawing/2017/model3d" xmlns:o="urn:schemas-microsoft-com:office:office" xmlns:oel="http://schemas.microsoft.com/office/2019/extlst" xmlns:r="http://schemas.openxmlformats.org/officeDocument/2006/relationships" xmlns:m="http://schemas.openxmlformats.org/officeDocument/2006/math" xmlns:v="urn:schemas-microsoft-com:vml" xmlns:wp14="http://schemas.microsoft.com/office/word/2010/wordprocessingDrawing" xmlns:wp="http://schemas.openxmlformats.org/drawingml/2006/wordprocessingDrawing" xmlns:w10="urn:schemas-microsoft-com:office:word" xmlns:w="http://schemas.openxmlformats.org/wordprocessingml/2006/main" xmlns:w14="http://schemas.microsoft.com/office/word/2010/wordml" xmlns:w15="http://schemas.microsoft.com/office/word/2012/wordml" xmlns:w16cex="http://schemas.microsoft.com/office/word/2018/wordml/cex" xmlns:w16cid="http://schemas.microsoft.com/office/word/2016/wordml/cid" xmlns:w16="http://schemas.microsoft.com/office/word/2018/wordml" xmlns:w16du="http://schemas.microsoft.com/office/word/2023/wordml/word16du" xmlns:w16sdtdh="http://schemas.microsoft.com/office/word/2020/wordml/sdtdatahash" xmlns:w16sdtfl="http://schemas.microsoft.com/office/word/2024/wordml/sdtformatlock" xmlns:w16se="http://schemas.microsoft.com/office/word/2015/wordml/symex" xmlns:wpg="http://schemas.microsoft.com/office/word/2010/wordprocessingGroup" xmlns:wpi="http://schemas.microsoft.com/office/word/2010/wordprocessingInk" xmlns:wne="http://schemas.microsoft.com/office/word/2006/wordml" xmlns:wps="http://schemas.microsoft.com/office/word/2010/wordprocessingShape" mc:Ignorable="w14 w15 w16se w16cid w16 w16cex w16sdtdh w16sdtfl w16du wp14">
-  <w:p>
-    <w:r>
-      <w:rPr>
-        <w:noProof/>
-      </w:rPr>
-      <mc:AlternateContent>
-        <mc:Choice Requires="wps">
-          <w:drawing>
-            <wp:anchor distT="0" distB="0" distL="114300" distR="114300" simplePos="0" relativeHeight="251660288" behindDoc="0" locked="0" layoutInCell="1" allowOverlap="1" wp14:anchorId="32FBE6F8" wp14:editId="03361862">
-              <wp:simplePos x="0" y="0"/>
-              <wp:positionH relativeFrom="page">
-                <wp:posOffset>4058285</wp:posOffset>
-              </wp:positionH>
-              <wp:positionV relativeFrom="page">
-                <wp:posOffset>10132695</wp:posOffset>
-              </wp:positionV>
-              <wp:extent cx="1714500" cy="342900"/>
-              <wp:effectExtent l="0" t="0" r="0" b="0"/>
-              <wp:wrapThrough wrapText="bothSides">
-                <wp:wrapPolygon edited="0">
-                  <wp:start x="480" y="0"/>
-                  <wp:lineTo x="480" y="20400"/>
-                  <wp:lineTo x="20880" y="20400"/>
-                  <wp:lineTo x="20880" y="0"/>
-                  <wp:lineTo x="480" y="0"/>
-                </wp:wrapPolygon>
-              </wp:wrapThrough>
-              <wp:docPr id="2" name="Text Box 10"/>
-              <wp:cNvGraphicFramePr>
-                <a:graphicFrameLocks xmlns:a="http://schemas.openxmlformats.org/drawingml/2006/main"/>
-              </wp:cNvGraphicFramePr>
-              <a:graphic xmlns:a="http://schemas.openxmlformats.org/drawingml/2006/main">
-                <a:graphicData uri="http://schemas.microsoft.com/office/word/2010/wordprocessingShape">
-                  <wps:wsp>
-                    <wps:cNvSpPr txBox="1">
-                      <a:spLocks/>
-                    </wps:cNvSpPr>
-                    <wps:spPr>
-                      <a:xfrm>
-                        <a:off x="0" y="0"/>
-                        <a:ext cx="1714500" cy="342900"/>
-                      </a:xfrm>
-                      <a:prstGeom prst="rect">
-                        <a:avLst/>
-                      </a:prstGeom>
-                      <a:noFill/>
-                      <a:ln>
-                        <a:noFill/>
-                      </a:ln>
-                      <a:effectLst/>
-                      <a:extLst>
-                        <a:ext uri="{C572A759-6A51-4108-AA02-DFA0A04FC94B}">
-                          <ma14:wrappingTextBoxFlag xmlns:ma14="http://schemas.microsoft.com/office/mac/drawingml/2011/main" xmlns:w="http://schemas.openxmlformats.org/wordprocessingml/2006/main" xmlns:w10="urn:schemas-microsoft-com:office:word" xmlns:v="urn:schemas-microsoft-com:vml" xmlns:o="urn:schemas-microsoft-com:office:office" xmlns:mv="urn:schemas-microsoft-com:mac:vml" xmlns:mo="http://schemas.microsoft.com/office/mac/office/2008/main" xmlns=""/>
-                        </a:ext>
-                      </a:extLst>
-                    </wps:spPr>
-                    <wps:txbx>
-                      <w:txbxContent>
-                        <w:p>
-                          <w:pPr>
-                            <w:rPr>
-                              <w:sz w:val="14"/>
-                              <w:szCs w:val="14"/>
-                              <w:lang w:val="es-ES_tradnl"/>
-                            </w:rPr>
-                          </w:pPr>
-                          <w:r>
-                            <w:rPr>
-                              <w:sz w:val="14"/>
-                              <w:szCs w:val="14"/>
-                              <w:lang w:val="es-ES_tradnl"/>
-                            </w:rPr>
-                            <w:t>Avda. de la Aurora, 55, entreplanta</w:t>
-                          </w:r>
-                        </w:p>
-                        <w:p>
-                          <w:pPr>
-                            <w:rPr>
-                              <w:sz w:val="14"/>
-                              <w:szCs w:val="14"/>
-                              <w:lang w:val="es-ES_tradnl"/>
-                            </w:rPr>
-                          </w:pPr>
-                          <w:r>
-                            <w:rPr>
-                              <w:sz w:val="14"/>
-                              <w:szCs w:val="14"/>
-                              <w:lang w:val="es-ES_tradnl"/>
-                            </w:rPr>
-                            <w:t>29006 Málaga (España)</w:t>
-                          </w:r>
-                        </w:p>
-                      </w:txbxContent>
-                    </wps:txbx>
-                    <wps:bodyPr rot="0" spcFirstLastPara="0" vertOverflow="overflow" horzOverflow="overflow" vert="horz" wrap="square" lIns="91440" tIns="45720" rIns="91440" bIns="45720" numCol="1" spcCol="0" rtlCol="0" fromWordArt="0" anchor="t" anchorCtr="0" forceAA="0" compatLnSpc="1">
-                      <a:prstTxWarp prst="textNoShape">
-                        <a:avLst/>
-                      </a:prstTxWarp>
-                      <a:noAutofit/>
-                    </wps:bodyPr>
-                  </wps:wsp>
-                </a:graphicData>
-              </a:graphic>
-              <wp14:sizeRelH relativeFrom="margin">
-                <wp14:pctWidth>0</wp14:pctWidth>
-              </wp14:sizeRelH>
-              <wp14:sizeRelV relativeFrom="margin">
-                <wp14:pctHeight>0</wp14:pctHeight>
-              </wp14:sizeRelV>
-            </wp:anchor>
-          </w:drawing>
-        </mc:Choice>
-        <mc:Fallback>
-          <w:pict>
-            <v:shapetype w14:anchorId="32FBE6F8" id="_x0000_t202" coordsize="21600,21600" o:spt="202" path="m,l,21600r21600,l21600,xe">
-              <v:stroke joinstyle="miter"/>
-              <v:path gradientshapeok="t" o:connecttype="rect"/>
-            </v:shapetype>
-            <v:shape id="Text Box 10" o:spid="_x0000_s1027" type="#_x0000_t202" style="position:absolute;left:0;text-align:left;margin-left:319.55pt;margin-top:797.85pt;width:135pt;height:27pt;z-index:251660288;visibility:visible;mso-wrap-style:square;mso-width-percent:0;mso-height-percent:0;mso-wrap-distance-left:9pt;mso-wrap-distance-top:0;mso-wrap-distance-right:9pt;mso-wrap-distance-bottom:0;mso-position-horizontal:absolute;mso-position-horizontal-relative:page;mso-position-vertical:absolute;mso-position-vertical-relative:page;mso-width-percent:0;mso-height-percent:0;mso-width-relative:margin;mso-height-relative:margin;v-text-anchor:top" o:gfxdata="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" filled="f" stroked="f">
-              <v:textbox>
-                <w:txbxContent>
-                  <w:p>
-                    <w:pPr>
-                      <w:rPr>
-                        <w:sz w:val="14"/>
-                        <w:szCs w:val="14"/>
-                        <w:lang w:val="es-ES_tradnl"/>
-                      </w:rPr>
-                    </w:pPr>
-                    <w:r>
-                      <w:rPr>
-                        <w:sz w:val="14"/>
-                        <w:szCs w:val="14"/>
-                        <w:lang w:val="es-ES_tradnl"/>
-                      </w:rPr>
-                      <w:t>Avda. de la Aurora, 55, entreplanta</w:t>
-                    </w:r>
-                  </w:p>
-                  <w:p>
-                    <w:pPr>
-                      <w:rPr>
-                        <w:sz w:val="14"/>
-                        <w:szCs w:val="14"/>
-                        <w:lang w:val="es-ES_tradnl"/>
-                      </w:rPr>
-                    </w:pPr>
-                    <w:r>
-                      <w:rPr>
-                        <w:sz w:val="14"/>
-                        <w:szCs w:val="14"/>
-                        <w:lang w:val="es-ES_tradnl"/>
-                      </w:rPr>
-                      <w:t>29006 Málaga (España)</w:t>
-                    </w:r>
-                  </w:p>
-                </w:txbxContent>
-              </v:textbox>
-              <w10:wrap type="through" anchorx="page" anchory="page"/>
-            </v:shape>
-          </w:pict>
-        </mc:Fallback>
-      </mc:AlternateContent>
-    </w:r>
-    <w:r>
-      <w:rPr>
-        <w:noProof/>
-      </w:rPr>
-      <mc:AlternateContent>
-        <mc:Choice Requires="wps">
-          <w:drawing>
-            <wp:anchor distT="0" distB="0" distL="114300" distR="114300" simplePos="0" relativeHeight="251650048" behindDoc="0" locked="0" layoutInCell="1" allowOverlap="1" wp14:anchorId="003E73B6" wp14:editId="76E9C323">
-              <wp:simplePos x="0" y="0"/>
-              <wp:positionH relativeFrom="page">
-                <wp:posOffset>1429385</wp:posOffset>
-              </wp:positionH>
-              <wp:positionV relativeFrom="page">
-                <wp:posOffset>10132695</wp:posOffset>
-              </wp:positionV>
-              <wp:extent cx="800100" cy="342900"/>
-              <wp:effectExtent l="0" t="0" r="0" b="0"/>
-              <wp:wrapThrough wrapText="bothSides">
-                <wp:wrapPolygon edited="0">
-                  <wp:start x="1029" y="0"/>
-                  <wp:lineTo x="1029" y="20400"/>
-                  <wp:lineTo x="20057" y="20400"/>
-                  <wp:lineTo x="20057" y="0"/>
-                  <wp:lineTo x="1029" y="0"/>
-                </wp:wrapPolygon>
-              </wp:wrapThrough>
-              <wp:docPr id="3" name="Text Box 10"/>
-              <wp:cNvGraphicFramePr>
-                <a:graphicFrameLocks xmlns:a="http://schemas.openxmlformats.org/drawingml/2006/main"/>
-              </wp:cNvGraphicFramePr>
-              <a:graphic xmlns:a="http://schemas.openxmlformats.org/drawingml/2006/main">
-                <a:graphicData uri="http://schemas.microsoft.com/office/word/2010/wordprocessingShape">
-                  <wps:wsp>
-                    <wps:cNvSpPr txBox="1">
-                      <a:spLocks/>
-                    </wps:cNvSpPr>
-                    <wps:spPr>
-                      <a:xfrm>
-                        <a:off x="0" y="0"/>
-                        <a:ext cx="800100" cy="342900"/>
-                      </a:xfrm>
-                      <a:prstGeom prst="rect">
-                        <a:avLst/>
-                      </a:prstGeom>
-                      <a:noFill/>
-                      <a:ln>
-                        <a:noFill/>
-                      </a:ln>
-                      <a:effectLst/>
-                      <a:extLst>
-                        <a:ext uri="{C572A759-6A51-4108-AA02-DFA0A04FC94B}">
-                          <ma14:wrappingTextBoxFlag xmlns:ma14="http://schemas.microsoft.com/office/mac/drawingml/2011/main" xmlns:w="http://schemas.openxmlformats.org/wordprocessingml/2006/main" xmlns:w10="urn:schemas-microsoft-com:office:word" xmlns:v="urn:schemas-microsoft-com:vml" xmlns:o="urn:schemas-microsoft-com:office:office" xmlns:mv="urn:schemas-microsoft-com:mac:vml" xmlns:mo="http://schemas.microsoft.com/office/mac/office/2008/main" xmlns=""/>
-                        </a:ext>
-                      </a:extLst>
-                    </wps:spPr>
-                    <wps:txbx>
-                      <w:txbxContent>
-                        <w:p>
-                          <w:pPr>
-                            <w:rPr>
-                              <w:sz w:val="14"/>
-                              <w:szCs w:val="12"/>
-                              <w:lang w:val="es-ES_tradnl"/>
-                            </w:rPr>
-                          </w:pPr>
-                          <w:r>
-                            <w:rPr>
-                              <w:sz w:val="14"/>
-                              <w:szCs w:val="12"/>
-                              <w:lang w:val="es-ES_tradnl"/>
-                            </w:rPr>
-                            <w:t>952 04 10 47</w:t>
-                          </w:r>
-                        </w:p>
-                        <w:p>
-                          <w:pPr>
-                            <w:rPr>
-                              <w:sz w:val="14"/>
-                              <w:szCs w:val="14"/>
-                              <w:lang w:val="es-ES_tradnl"/>
-                            </w:rPr>
-                          </w:pPr>
-                          <w:r>
-                            <w:rPr>
-                              <w:sz w:val="14"/>
-                              <w:szCs w:val="14"/>
-                              <w:lang w:val="es-ES_tradnl"/>
-                            </w:rPr>
-                            <w:t>952 34 41 00</w:t>
-                          </w:r>
-                        </w:p>
-                      </w:txbxContent>
-                    </wps:txbx>
-                    <wps:bodyPr rot="0" spcFirstLastPara="0" vertOverflow="overflow" horzOverflow="overflow" vert="horz" wrap="square" lIns="91440" tIns="45720" rIns="91440" bIns="45720" numCol="1" spcCol="0" rtlCol="0" fromWordArt="0" anchor="t" anchorCtr="0" forceAA="0" compatLnSpc="1">
-                      <a:prstTxWarp prst="textNoShape">
-                        <a:avLst/>
-                      </a:prstTxWarp>
-                      <a:noAutofit/>
-                    </wps:bodyPr>
-                  </wps:wsp>
-                </a:graphicData>
-              </a:graphic>
-              <wp14:sizeRelH relativeFrom="margin">
-                <wp14:pctWidth>0</wp14:pctWidth>
-              </wp14:sizeRelH>
-              <wp14:sizeRelV relativeFrom="margin">
-                <wp14:pctHeight>0</wp14:pctHeight>
-              </wp14:sizeRelV>
-            </wp:anchor>
-          </w:drawing>
-        </mc:Choice>
-        <mc:Fallback>
-          <w:pict>
-            <v:shape w14:anchorId="003E73B6" id="_x0000_s1028" type="#_x0000_t202" style="position:absolute;left:0;text-align:left;margin-left:112.55pt;margin-top:797.85pt;width:63pt;height:27pt;z-index:251650048;visibility:visible;mso-wrap-style:square;mso-width-percent:0;mso-height-percent:0;mso-wrap-distance-left:9pt;mso-wrap-distance-top:0;mso-wrap-distance-right:9pt;mso-wrap-distance-bottom:0;mso-position-horizontal:absolute;mso-position-horizontal-relative:page;mso-position-vertical:absolute;mso-position-vertical-relative:page;mso-width-percent:0;mso-height-percent:0;mso-width-relative:margin;mso-height-relative:margin;v-text-anchor:top" o:gfxdata="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" filled="f" stroked="f">
-              <v:textbox>
-                <w:txbxContent>
-                  <w:p>
-                    <w:pPr>
-                      <w:rPr>
-                        <w:sz w:val="14"/>
-                        <w:szCs w:val="12"/>
-                        <w:lang w:val="es-ES_tradnl"/>
-                      </w:rPr>
-                    </w:pPr>
-                    <w:r>
-                      <w:rPr>
-                        <w:sz w:val="14"/>
-                        <w:szCs w:val="12"/>
-                        <w:lang w:val="es-ES_tradnl"/>
-                      </w:rPr>
-                      <w:t>952 04 10 47</w:t>
-                    </w:r>
-                  </w:p>
-                  <w:p>
-                    <w:pPr>
-                      <w:rPr>
-                        <w:sz w:val="14"/>
-                        <w:szCs w:val="14"/>
-                        <w:lang w:val="es-ES_tradnl"/>
-                      </w:rPr>
-                    </w:pPr>
-                    <w:r>
-                      <w:rPr>
-                        <w:sz w:val="14"/>
-                        <w:szCs w:val="14"/>
-                        <w:lang w:val="es-ES_tradnl"/>
-                      </w:rPr>
-                      <w:t>952 34 41 00</w:t>
-                    </w:r>
-                  </w:p>
-                </w:txbxContent>
-              </v:textbox>
-              <w10:wrap type="through" anchorx="page" anchory="page"/>
-            </v:shape>
-          </w:pict>
-        </mc:Fallback>
-      </mc:AlternateContent>
-    </w:r>
-    <w:r>
-      <w:rPr>
-        <w:noProof/>
-      </w:rPr>
-      <mc:AlternateContent>
-        <mc:Choice Requires="wps">
-          <w:drawing>
-            <wp:anchor distT="0" distB="0" distL="114300" distR="114300" simplePos="0" relativeHeight="251656192" behindDoc="0" locked="0" layoutInCell="1" allowOverlap="1" wp14:anchorId="00F01480" wp14:editId="154F1AE4">
-              <wp:simplePos x="0" y="0"/>
-              <wp:positionH relativeFrom="page">
-                <wp:posOffset>2686685</wp:posOffset>
-              </wp:positionH>
-              <wp:positionV relativeFrom="page">
-                <wp:posOffset>10132695</wp:posOffset>
-              </wp:positionV>
-              <wp:extent cx="1371600" cy="342900"/>
-              <wp:effectExtent l="0" t="0" r="0" b="0"/>
-              <wp:wrapThrough wrapText="bothSides">
-                <wp:wrapPolygon edited="0">
-                  <wp:start x="600" y="0"/>
-                  <wp:lineTo x="600" y="20400"/>
-                  <wp:lineTo x="20700" y="20400"/>
-                  <wp:lineTo x="20700" y="0"/>
-                  <wp:lineTo x="600" y="0"/>
-                </wp:wrapPolygon>
-              </wp:wrapThrough>
-              <wp:docPr id="23" name="Text Box 10"/>
-              <wp:cNvGraphicFramePr>
-                <a:graphicFrameLocks xmlns:a="http://schemas.openxmlformats.org/drawingml/2006/main"/>
-              </wp:cNvGraphicFramePr>
-              <a:graphic xmlns:a="http://schemas.openxmlformats.org/drawingml/2006/main">
-                <a:graphicData uri="http://schemas.microsoft.com/office/word/2010/wordprocessingShape">
-                  <wps:wsp>
-                    <wps:cNvSpPr txBox="1">
-                      <a:spLocks/>
-                    </wps:cNvSpPr>
-                    <wps:spPr>
-                      <a:xfrm>
-                        <a:off x="0" y="0"/>
-                        <a:ext cx="1371600" cy="342900"/>
-                      </a:xfrm>
-                      <a:prstGeom prst="rect">
-                        <a:avLst/>
-                      </a:prstGeom>
-                      <a:noFill/>
-                      <a:ln>
-                        <a:noFill/>
-                      </a:ln>
-                      <a:effectLst/>
-                      <a:extLst>
-                        <a:ext uri="{C572A759-6A51-4108-AA02-DFA0A04FC94B}">
-                          <ma14:wrappingTextBoxFlag xmlns:ma14="http://schemas.microsoft.com/office/mac/drawingml/2011/main" xmlns:w="http://schemas.openxmlformats.org/wordprocessingml/2006/main" xmlns:w10="urn:schemas-microsoft-com:office:word" xmlns:v="urn:schemas-microsoft-com:vml" xmlns:o="urn:schemas-microsoft-com:office:office" xmlns:mv="urn:schemas-microsoft-com:mac:vml" xmlns:mo="http://schemas.microsoft.com/office/mac/office/2008/main" xmlns=""/>
-                        </a:ext>
-                      </a:extLst>
-                    </wps:spPr>
-                    <wps:txbx>
-                      <w:txbxContent>
-                        <w:p>
-                          <w:pPr>
-                            <w:rPr>
-                              <w:sz w:val="14"/>
-                              <w:szCs w:val="14"/>
-                              <w:lang w:val="es-ES_tradnl"/>
-                            </w:rPr>
-                          </w:pPr>
-                          <w:r>
-                            <w:rPr>
-                              <w:sz w:val="14"/>
-                              <w:szCs w:val="14"/>
-                              <w:lang w:val="es-ES_tradnl"/>
-                            </w:rPr>
-                            <w:t>edp@edp-sl.com</w:t>
-                          </w:r>
-                        </w:p>
-                        <w:p>
-                          <w:pPr>
-                            <w:rPr>
-                              <w:color w:val="0070C0"/>
-                              <w:sz w:val="14"/>
-                              <w:szCs w:val="14"/>
-                              <w:lang w:val="es-ES_tradnl"/>
-                            </w:rPr>
-                          </w:pPr>
-                          <w:r>
-                            <w:rPr>
-                              <w:color w:val="0070C0"/>
-                              <w:sz w:val="14"/>
-                              <w:szCs w:val="14"/>
-                              <w:lang w:val="es-ES_tradnl"/>
-                            </w:rPr>
-                            <w:t>www.edp-sl.com</w:t>
-                          </w:r>
-                        </w:p>
-                      </w:txbxContent>
-                    </wps:txbx>
-                    <wps:bodyPr rot="0" spcFirstLastPara="0" vertOverflow="overflow" horzOverflow="overflow" vert="horz" wrap="square" lIns="91440" tIns="45720" rIns="91440" bIns="45720" numCol="1" spcCol="0" rtlCol="0" fromWordArt="0" anchor="t" anchorCtr="0" forceAA="0" compatLnSpc="1">
-                      <a:prstTxWarp prst="textNoShape">
-                        <a:avLst/>
-                      </a:prstTxWarp>
-                      <a:noAutofit/>
-                    </wps:bodyPr>
-                  </wps:wsp>
-                </a:graphicData>
-              </a:graphic>
-              <wp14:sizeRelH relativeFrom="margin">
-                <wp14:pctWidth>0</wp14:pctWidth>
-              </wp14:sizeRelH>
-              <wp14:sizeRelV relativeFrom="margin">
-                <wp14:pctHeight>0</wp14:pctHeight>
-              </wp14:sizeRelV>
-            </wp:anchor>
-          </w:drawing>
-        </mc:Choice>
-        <mc:Fallback>
-          <w:pict>
-            <v:shape w14:anchorId="00F01480" id="_x0000_s1029" type="#_x0000_t202" style="position:absolute;left:0;text-align:left;margin-left:211.55pt;margin-top:797.85pt;width:108pt;height:27pt;z-index:251656192;visibility:visible;mso-wrap-style:square;mso-width-percent:0;mso-height-percent:0;mso-wrap-distance-left:9pt;mso-wrap-distance-top:0;mso-wrap-distance-right:9pt;mso-wrap-distance-bottom:0;mso-position-horizontal:absolute;mso-position-horizontal-relative:page;mso-position-vertical:absolute;mso-position-vertical-relative:page;mso-width-percent:0;mso-height-percent:0;mso-width-relative:margin;mso-height-relative:margin;v-text-anchor:top" o:gfxdata="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" filled="f" stroked="f">
-              <v:textbox>
-                <w:txbxContent>
-                  <w:p>
-                    <w:pPr>
-                      <w:rPr>
-                        <w:sz w:val="14"/>
-                        <w:szCs w:val="14"/>
-                        <w:lang w:val="es-ES_tradnl"/>
-                      </w:rPr>
-                    </w:pPr>
-                    <w:r>
-                      <w:rPr>
-                        <w:sz w:val="14"/>
-                        <w:szCs w:val="14"/>
-                        <w:lang w:val="es-ES_tradnl"/>
-                      </w:rPr>
-                      <w:t>edp@edp-sl.com</w:t>
-                    </w:r>
-                  </w:p>
-                  <w:p>
-                    <w:pPr>
-                      <w:rPr>
-                        <w:color w:val="0070C0"/>
-                        <w:sz w:val="14"/>
-                        <w:szCs w:val="14"/>
-                        <w:lang w:val="es-ES_tradnl"/>
-                      </w:rPr>
-                    </w:pPr>
-                    <w:r>
-                      <w:rPr>
-                        <w:color w:val="0070C0"/>
-                        <w:sz w:val="14"/>
-                        <w:szCs w:val="14"/>
-                        <w:lang w:val="es-ES_tradnl"/>
-                      </w:rPr>
-                      <w:t>www.edp-sl.com</w:t>
-                    </w:r>
-                  </w:p>
-                </w:txbxContent>
-              </v:textbox>
-              <w10:wrap type="through" anchorx="page" anchory="page"/>
-            </v:shape>
-          </w:pict>
-        </mc:Fallback>
-      </mc:AlternateContent>
-    </w:r>
-    <w:r>
-      <w:rPr>
-        <w:noProof/>
-      </w:rPr>
-      <mc:AlternateContent>
-        <mc:Choice Requires="wps">
-          <w:drawing>
-            <wp:anchor distT="0" distB="0" distL="114300" distR="114300" simplePos="0" relativeHeight="251662336" behindDoc="0" locked="0" layoutInCell="1" allowOverlap="1" wp14:anchorId="16C74CA3" wp14:editId="76D3C3D8">
-              <wp:simplePos x="0" y="0"/>
-              <wp:positionH relativeFrom="column">
-                <wp:posOffset>2971800</wp:posOffset>
-              </wp:positionH>
-              <wp:positionV relativeFrom="paragraph">
-                <wp:posOffset>226695</wp:posOffset>
-              </wp:positionV>
-              <wp:extent cx="0" cy="457200"/>
-              <wp:effectExtent l="0" t="0" r="38100" b="19050"/>
-              <wp:wrapNone/>
-              <wp:docPr id="28" name="Conector recto 28"/>
-              <wp:cNvGraphicFramePr/>
-              <a:graphic xmlns:a="http://schemas.openxmlformats.org/drawingml/2006/main">
-                <a:graphicData uri="http://schemas.microsoft.com/office/word/2010/wordprocessingShape">
-                  <wps:wsp>
-                    <wps:cNvCnPr/>
-                    <wps:spPr>
-                      <a:xfrm>
-                        <a:off x="0" y="0"/>
-                        <a:ext cx="0" cy="457200"/>
-                      </a:xfrm>
-                      <a:prstGeom prst="line">
-                        <a:avLst/>
-                      </a:prstGeom>
-                      <a:noFill/>
-                      <a:ln w="6350" cap="flat" cmpd="sng" algn="ctr">
-                        <a:solidFill>
-                          <a:sysClr val="windowText" lastClr="000000"/>
-                        </a:solidFill>
-                        <a:prstDash val="solid"/>
-                        <a:miter lim="800000"/>
-                      </a:ln>
-                      <a:effectLst/>
-                    </wps:spPr>
-                    <wps:bodyPr/>
-                  </wps:wsp>
-                </a:graphicData>
-              </a:graphic>
-            </wp:anchor>
-          </w:drawing>
-        </mc:Choice>
-        <mc:Fallback>
-          <w:pict>
-            <v:line w14:anchorId="3B8E2307" id="Conector recto 28" o:spid="_x0000_s1026" style="position:absolute;z-index:251668480;visibility:visible;mso-wrap-style:square;mso-wrap-distance-left:9pt;mso-wrap-distance-top:0;mso-wrap-distance-right:9pt;mso-wrap-distance-bottom:0;mso-position-horizontal:absolute;mso-position-horizontal-relative:text;mso-position-vertical:absolute;mso-position-vertical-relative:text" from="234pt,17.85pt" to="234pt,53.85pt" o:gfxdata="UEsDBBQABgAIAAAAIQC2gziS/gAAAOEBAAATAAAAW0NvbnRlbnRfVHlwZXNdLnhtbJSRQU7DMBBF 90jcwfIWJU67QAgl6YK0S0CoHGBkTxKLZGx5TGhvj5O2G0SRWNoz/78nu9wcxkFMGNg6quQqL6RA 0s5Y6ir5vt9lD1JwBDIwOMJKHpHlpr69KfdHjyxSmriSfYz+USnWPY7AufNIadK6MEJMx9ApD/oD OlTrorhX2lFEilmcO2RdNtjC5xDF9pCuTyYBB5bi6bQ4syoJ3g9WQ0ymaiLzg5KdCXlKLjvcW893 SUOqXwnz5DrgnHtJTxOsQfEKIT7DmDSUCaxw7Rqn8787ZsmRM9e2VmPeBN4uqYvTtW7jvijg9N/y JsXecLq0q+WD6m8AAAD//wMAUEsDBBQABgAIAAAAIQA4/SH/1gAAAJQBAAALAAAAX3JlbHMvLnJl bHOkkMFqwzAMhu+DvYPRfXGawxijTi+j0GvpHsDYimMaW0Yy2fr2M4PBMnrbUb/Q94l/f/hMi1qR JVI2sOt6UJgd+ZiDgffL8ekFlFSbvV0oo4EbChzGx4f9GRdb25HMsYhqlCwG5lrLq9biZkxWOiqY 22YiTra2kYMu1l1tQD30/bPm3wwYN0x18gb45AdQl1tp5j/sFB2T0FQ7R0nTNEV3j6o9feQzro1i OWA14Fm+Q8a1a8+Bvu/d/dMb2JY5uiPbhG/ktn4cqGU/er3pcvwCAAD//wMAUEsDBBQABgAIAAAA IQB2XM8xrwEAAFgDAAAOAAAAZHJzL2Uyb0RvYy54bWysU01vEzEQvSPxHyzfidNCS7WK00OjckFQ ifIDpv7YteQveUw2+feMvSENcEPswWvPeN7Oe/N2c38Inu1NQZei5FerNWcmqqRdHCX//vz47o4z rBA1+BSN5EeD/H779s1mzoO5TlPy2hRGIBGHOUs+1ZoHIVBNJgCuUjaRkjaVAJWOZRS6wEzowYvr 9fpWzKnoXJIyiBTdLUm+7fjWGlW/WoumMi859Vb7Wvr60lax3cAwFsiTU6c24B+6COAiffQMtYMK 7Edxf0EFp0rCZOtKpSCStU6ZzoHYXK3/YPNtgmw6FxIH81km/H+w6sv+IT4VkmHOOGB+Ko3FwZbQ 3tQfO3SxjmexzKEytQQVRT/cfKQ5NB3Fa10uWD+ZFFjbSO5dbDRggP1nrMvVX1daOKZH530fhY9s lvz2/Q0NSwEZwnqotA1ZS45x5Az8SE5TtXRETN7pVt1w8IgPvrA90LDJIzrNz9QtZx6wUoIo9OfU 7G+lrZ0d4LQU99TijeAqGdS7IPndZbWP7YumW+xE6lXBtntJ+tiFFe1E4+sKnazW/HF5pv3lD7H9 CQAA//8DAFBLAwQUAAYACAAAACEAsPHN7N4AAAAKAQAADwAAAGRycy9kb3ducmV2LnhtbEyPTU/D MAyG70j8h8hI3FgChXXqmk5oaAduo4DEMWvcj9E4VZNu5d9jxAGOth+9ft58M7tenHAMnScNtwsF AqnytqNGw9vr7mYFIkRD1vSeUMMXBtgUlxe5yaw/0wueytgIDqGQGQ1tjEMmZahadCYs/IDEt9qP zkQex0ba0Zw53PXyTqmldKYj/tCaAbctVp/l5DRM+22tul0yHz+SUk7P6f79qW60vr6aH9cgIs7x D4YffVaHgp0OfiIbRK/hfrniLlFD8pCCYOB3cWBSpSnIIpf/KxTfAAAA//8DAFBLAQItABQABgAI AAAAIQC2gziS/gAAAOEBAAATAAAAAAAAAAAAAAAAAAAAAABbQ29udGVudF9UeXBlc10ueG1sUEsB Ai0AFAAGAAgAAAAhADj9If/WAAAAlAEAAAsAAAAAAAAAAAAAAAAALwEAAF9yZWxzLy5yZWxzUEsB Ai0AFAAGAAgAAAAhAHZczzGvAQAAWAMAAA4AAAAAAAAAAAAAAAAALgIAAGRycy9lMm9Eb2MueG1s UEsBAi0AFAAGAAgAAAAhALDxzezeAAAACgEAAA8AAAAAAAAAAAAAAAAACQQAAGRycy9kb3ducmV2 LnhtbFBLBQYAAAAABAAEAPMAAAAUBQAAAAA= " strokecolor="windowText" strokeweight=".5pt">
-              <v:stroke joinstyle="miter"/>
-            </v:line>
-          </w:pict>
-        </mc:Fallback>
-      </mc:AlternateContent>
-    </w:r>
-    <w:r>
-      <w:rPr>
-        <w:noProof/>
-      </w:rPr>
-      <mc:AlternateContent>
-        <mc:Choice Requires="wps">
-          <w:drawing>
-            <wp:anchor distT="0" distB="0" distL="114300" distR="114300" simplePos="0" relativeHeight="251652096" behindDoc="0" locked="0" layoutInCell="1" allowOverlap="1" wp14:anchorId="350D279F" wp14:editId="54B5E171">
-              <wp:simplePos x="0" y="0"/>
-              <wp:positionH relativeFrom="column">
-                <wp:posOffset>228600</wp:posOffset>
-              </wp:positionH>
-              <wp:positionV relativeFrom="paragraph">
-                <wp:posOffset>112395</wp:posOffset>
-              </wp:positionV>
-              <wp:extent cx="6400800" cy="0"/>
-              <wp:effectExtent l="0" t="0" r="25400" b="25400"/>
-              <wp:wrapNone/>
-              <wp:docPr id="217511060" name="Conector recto 217511060"/>
-              <wp:cNvGraphicFramePr/>
-              <a:graphic xmlns:a="http://schemas.openxmlformats.org/drawingml/2006/main">
-                <a:graphicData uri="http://schemas.microsoft.com/office/word/2010/wordprocessingShape">
-                  <wps:wsp>
-                    <wps:cNvCnPr/>
-                    <wps:spPr>
-                      <a:xfrm>
-                        <a:off x="0" y="0"/>
-                        <a:ext cx="6400800" cy="0"/>
-                      </a:xfrm>
-                      <a:prstGeom prst="line">
-                        <a:avLst/>
-                      </a:prstGeom>
-                      <a:noFill/>
-                      <a:ln w="6350" cap="flat" cmpd="sng" algn="ctr">
-                        <a:solidFill>
-                          <a:srgbClr val="5B9BD5"/>
-                        </a:solidFill>
-                        <a:prstDash val="solid"/>
-                        <a:miter lim="800000"/>
-                      </a:ln>
-                      <a:effectLst/>
-                    </wps:spPr>
-                    <wps:bodyPr/>
-                  </wps:wsp>
-                </a:graphicData>
-              </a:graphic>
-            </wp:anchor>
-          </w:drawing>
-        </mc:Choice>
-        <mc:Fallback>
-          <w:pict>
-            <v:line w14:anchorId="256B0012" id="Conector recto 217511060" o:spid="_x0000_s1026" style="position:absolute;z-index:251663360;visibility:visible;mso-wrap-style:square;mso-wrap-distance-left:9pt;mso-wrap-distance-top:0;mso-wrap-distance-right:9pt;mso-wrap-distance-bottom:0;mso-position-horizontal:absolute;mso-position-horizontal-relative:text;mso-position-vertical:absolute;mso-position-vertical-relative:text" from="18pt,8.85pt" to="522pt,8.85pt" o:gfxdata="UEsDBBQABgAIAAAAIQC2gziS/gAAAOEBAAATAAAAW0NvbnRlbnRfVHlwZXNdLnhtbJSRQU7DMBBF 90jcwfIWJU67QAgl6YK0S0CoHGBkTxKLZGx5TGhvj5O2G0SRWNoz/78nu9wcxkFMGNg6quQqL6RA 0s5Y6ir5vt9lD1JwBDIwOMJKHpHlpr69KfdHjyxSmriSfYz+USnWPY7AufNIadK6MEJMx9ApD/oD OlTrorhX2lFEilmcO2RdNtjC5xDF9pCuTyYBB5bi6bQ4syoJ3g9WQ0ymaiLzg5KdCXlKLjvcW893 SUOqXwnz5DrgnHtJTxOsQfEKIT7DmDSUCaxw7Rqn8787ZsmRM9e2VmPeBN4uqYvTtW7jvijg9N/y JsXecLq0q+WD6m8AAAD//wMAUEsDBBQABgAIAAAAIQA4/SH/1gAAAJQBAAALAAAAX3JlbHMvLnJl bHOkkMFqwzAMhu+DvYPRfXGawxijTi+j0GvpHsDYimMaW0Yy2fr2M4PBMnrbUb/Q94l/f/hMi1qR JVI2sOt6UJgd+ZiDgffL8ekFlFSbvV0oo4EbChzGx4f9GRdb25HMsYhqlCwG5lrLq9biZkxWOiqY 22YiTra2kYMu1l1tQD30/bPm3wwYN0x18gb45AdQl1tp5j/sFB2T0FQ7R0nTNEV3j6o9feQzro1i OWA14Fm+Q8a1a8+Bvu/d/dMb2JY5uiPbhG/ktn4cqGU/er3pcvwCAAD//wMAUEsDBBQABgAIAAAA IQASzCNUqwEAAEUDAAAOAAAAZHJzL2Uyb0RvYy54bWysUk1v2zAMvQ/YfxB0X+x2S9EZcQq0QXsp tgLbfgAjS7YAfYHU4uTfl1LStOtuw3yQKZF65Ht6q5u9d2KnkWwMvbxYtFLooOJgw9jLXz/vP11L QRnCAC4G3cuDJnmz/vhhNadOX8YpukGjYJBA3Zx6OeWcuqYhNWkPtIhJB06aiB4yb3FsBoSZ0b1r Ltv2qpkjDgmj0kR8ujkm5briG6NV/m4M6SxcL3m2XFes67aszXoF3YiQJqtOY8A/TOHBBm56htpA BvEb7V9Q3iqMFE1eqOibaIxVunJgNhftOzY/Jki6cmFxKJ1lov8Hq77t7sITsgxzoo7SExYWe4O+ /Hk+sa9iHc5i6X0Wig+vvrTtdcuaqpdc83oxIeUHHb0oQS+dDYUHdLB7pMzNuPSlpByHeG+dq2/h gpgZ/POyIAM7wjjIHPo09JLCKAW4ka2mMlZEis4O5XbBIRy3dw7FDvi5l7dfbzfL8sLc7Y+y0noD NB3raupoBG8zu9FZ30umxt/ptgsFXVc/nQi8ylWibRwOVcWm7PitatOTr4oZ3u45fuv+9TMAAAD/ /wMAUEsDBBQABgAIAAAAIQAyLg083QAAAAkBAAAPAAAAZHJzL2Rvd25yZXYueG1sTI9BSwMxEIXv gv8hjODNJmptZd1sKYJQQQqtgnrLbsbdxWSyJGm7/nun9KDH+d7jzXvlYvRO7DGmPpCG64kCgdQE 21Or4e316eoeRMqGrHGBUMMPJlhU52elKWw40Ab329wKDqFUGA1dzkMhZWo69CZNwoDE2leI3mQ+ YyttNAcO907eKDWT3vTEHzoz4GOHzfd25zXU6xg/7j7fB7d82aj1mFYhPq+0vrwYlw8gMo75zwzH +lwdKu5Uhx3ZJJyG2xlPyczncxBHXU2nTOoTkVUp/y+ofgEAAP//AwBQSwECLQAUAAYACAAAACEA toM4kv4AAADhAQAAEwAAAAAAAAAAAAAAAAAAAAAAW0NvbnRlbnRfVHlwZXNdLnhtbFBLAQItABQA BgAIAAAAIQA4/SH/1gAAAJQBAAALAAAAAAAAAAAAAAAAAC8BAABfcmVscy8ucmVsc1BLAQItABQA BgAIAAAAIQASzCNUqwEAAEUDAAAOAAAAAAAAAAAAAAAAAC4CAABkcnMvZTJvRG9jLnhtbFBLAQIt ABQABgAIAAAAIQAyLg083QAAAAkBAAAPAAAAAAAAAAAAAAAAAAUEAABkcnMvZG93bnJldi54bWxQ SwUGAAAAAAQABADzAAAADwUAAAAA " strokecolor="#5b9bd5" strokeweight=".5pt">
-              <v:stroke joinstyle="miter"/>
-            </v:line>
-          </w:pict>
-        </mc:Fallback>
-      </mc:AlternateContent>
-    </w:r>
-  </w:p>
-  <w:p>
-    <w:r>
-      <w:rPr>
-        <w:noProof/>
-      </w:rPr>
-      <mc:AlternateContent>
-        <mc:Choice Requires="wps">
-          <w:drawing>
-            <wp:anchor distT="0" distB="0" distL="114300" distR="114300" simplePos="0" relativeHeight="251664384" behindDoc="0" locked="0" layoutInCell="1" allowOverlap="1" wp14:anchorId="60968E5B" wp14:editId="0AE01EE4">
-              <wp:simplePos x="0" y="0"/>
-              <wp:positionH relativeFrom="page">
-                <wp:posOffset>5890716</wp:posOffset>
-              </wp:positionH>
-              <wp:positionV relativeFrom="page">
-                <wp:posOffset>10161905</wp:posOffset>
-              </wp:positionV>
-              <wp:extent cx="1047115" cy="313690"/>
-              <wp:effectExtent l="0" t="0" r="0" b="0"/>
-              <wp:wrapThrough wrapText="bothSides">
-                <wp:wrapPolygon edited="0">
-                  <wp:start x="786" y="0"/>
-                  <wp:lineTo x="786" y="19676"/>
-                  <wp:lineTo x="20434" y="19676"/>
-                  <wp:lineTo x="20434" y="0"/>
-                  <wp:lineTo x="786" y="0"/>
-                </wp:wrapPolygon>
-              </wp:wrapThrough>
-              <wp:docPr id="34" name="Text Box 10"/>
-              <wp:cNvGraphicFramePr>
-                <a:graphicFrameLocks xmlns:a="http://schemas.openxmlformats.org/drawingml/2006/main"/>
-              </wp:cNvGraphicFramePr>
-              <a:graphic xmlns:a="http://schemas.openxmlformats.org/drawingml/2006/main">
-                <a:graphicData uri="http://schemas.microsoft.com/office/word/2010/wordprocessingShape">
-                  <wps:wsp>
-                    <wps:cNvSpPr txBox="1">
-                      <a:spLocks/>
-                    </wps:cNvSpPr>
-                    <wps:spPr>
-                      <a:xfrm>
-                        <a:off x="0" y="0"/>
-                        <a:ext cx="1047115" cy="313690"/>
-                      </a:xfrm>
-                      <a:prstGeom prst="rect">
-                        <a:avLst/>
-                      </a:prstGeom>
-                      <a:noFill/>
-                      <a:ln>
-                        <a:noFill/>
-                      </a:ln>
-                      <a:effectLst/>
-                      <a:extLst>
-                        <a:ext uri="{C572A759-6A51-4108-AA02-DFA0A04FC94B}">
-                          <ma14:wrappingTextBoxFlag xmlns:ma14="http://schemas.microsoft.com/office/mac/drawingml/2011/main" xmlns:w="http://schemas.openxmlformats.org/wordprocessingml/2006/main" xmlns:w10="urn:schemas-microsoft-com:office:word" xmlns:v="urn:schemas-microsoft-com:vml" xmlns:o="urn:schemas-microsoft-com:office:office" xmlns:mv="urn:schemas-microsoft-com:mac:vml" xmlns:mo="http://schemas.microsoft.com/office/mac/office/2008/main" xmlns=""/>
-                        </a:ext>
-                      </a:extLst>
-                    </wps:spPr>
-                    <wps:txbx>
-                      <w:txbxContent>
-                        <w:p>
-                          <w:pPr>
-                            <w:jc w:val="right"/>
-                            <w:rPr>
-                              <w:i/>
-                              <w:color w:val="0070C0"/>
-                              <w:sz w:val="14"/>
-                              <w:szCs w:val="14"/>
-                            </w:rPr>
-                          </w:pPr>
-                          <w:r>
-                            <w:rPr>
-                              <w:i/>
-                              <w:color w:val="0070C0"/>
-                              <w:sz w:val="14"/>
-                              <w:szCs w:val="14"/>
-                            </w:rPr>
-                            <w:t xml:space="preserve">Página </w:t>
-                          </w:r>
-                          <w:r>
-                            <w:rPr>
-                              <w:i/>
-                              <w:color w:val="0070C0"/>
-                              <w:sz w:val="14"/>
-                              <w:szCs w:val="14"/>
-                            </w:rPr>
-                            <w:fldChar w:fldCharType="begin"/>
-                          </w:r>
-                          <w:r>
-                            <w:rPr>
-                              <w:i/>
-                              <w:color w:val="0070C0"/>
-                              <w:sz w:val="14"/>
-                              <w:szCs w:val="14"/>
-                            </w:rPr>
-                            <w:instrText>PAGE   \* MERGEFORMAT</w:instrText>
-                          </w:r>
-                          <w:r>
-                            <w:rPr>
-                              <w:i/>
-                              <w:color w:val="0070C0"/>
-                              <w:sz w:val="14"/>
-                              <w:szCs w:val="14"/>
-                            </w:rPr>
-                            <w:fldChar w:fldCharType="separate"/>
-                          </w:r>
-                          <w:r>
-                            <w:rPr>
-                              <w:i/>
-                              <w:noProof/>
-                              <w:color w:val="0070C0"/>
-                              <w:sz w:val="14"/>
-                              <w:szCs w:val="14"/>
-                            </w:rPr>
-                            <w:t>19</w:t>
-                          </w:r>
-                          <w:r>
-                            <w:rPr>
-                              <w:i/>
-                              <w:color w:val="0070C0"/>
-                              <w:sz w:val="14"/>
-                              <w:szCs w:val="14"/>
-                            </w:rPr>
-                            <w:fldChar w:fldCharType="end"/>
-                          </w:r>
-                        </w:p>
-                        <w:p>
-                          <w:pPr>
-                            <w:jc w:val="right"/>
-                            <w:rPr>
-                              <w:i/>
-                              <w:color w:val="0070C0"/>
-                              <w:sz w:val="14"/>
-                              <w:szCs w:val="14"/>
-                            </w:rPr>
-                          </w:pPr>
-                          <w:r>
-                            <w:rPr>
-                              <w:i/>
-                              <w:color w:val="0070C0"/>
-                              <w:sz w:val="14"/>
-                              <w:szCs w:val="14"/>
-                            </w:rPr>
-                            <w:t>5</w:t>
-                          </w:r>
-                          <w:r>
-                            <w:rPr>
-                              <w:i/>
-                              <w:color w:val="0070C0"/>
-                              <w:sz w:val="14"/>
-                              <w:szCs w:val="14"/>
-                            </w:rPr>
-                            <w:t>35.2.2</w:t>
-                          </w:r>
-                        </w:p>
-                      </w:txbxContent>
-                    </wps:txbx>
-                    <wps:bodyPr rot="0" spcFirstLastPara="0" vertOverflow="overflow" horzOverflow="overflow" vert="horz" wrap="square" lIns="91440" tIns="45720" rIns="91440" bIns="45720" numCol="1" spcCol="0" rtlCol="0" fromWordArt="0" anchor="ctr" anchorCtr="0" forceAA="0" compatLnSpc="1">
-                      <a:prstTxWarp prst="textNoShape">
-                        <a:avLst/>
-                      </a:prstTxWarp>
-                      <a:noAutofit/>
-                    </wps:bodyPr>
-                  </wps:wsp>
-                </a:graphicData>
-              </a:graphic>
-              <wp14:sizeRelH relativeFrom="margin">
-                <wp14:pctWidth>0</wp14:pctWidth>
-              </wp14:sizeRelH>
-              <wp14:sizeRelV relativeFrom="margin">
-                <wp14:pctHeight>0</wp14:pctHeight>
-              </wp14:sizeRelV>
-            </wp:anchor>
-          </w:drawing>
-        </mc:Choice>
-        <mc:Fallback>
-          <w:pict>
-            <v:shape w14:anchorId="60968E5B" id="_x0000_s1030" type="#_x0000_t202" style="position:absolute;left:0;text-align:left;margin-left:463.85pt;margin-top:800.15pt;width:82.45pt;height:24.7pt;z-index:251664384;visibility:visible;mso-wrap-style:square;mso-width-percent:0;mso-height-percent:0;mso-wrap-distance-left:9pt;mso-wrap-distance-top:0;mso-wrap-distance-right:9pt;mso-wrap-distance-bottom:0;mso-position-horizontal:absolute;mso-position-horizontal-relative:page;mso-position-vertical:absolute;mso-position-vertical-relative:page;mso-width-percent:0;mso-height-percent:0;mso-width-relative:margin;mso-height-relative:margin;v-text-anchor:middle" o:gfxdata="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" filled="f" stroked="f">
-              <v:textbox>
-                <w:txbxContent>
-                  <w:p>
-                    <w:pPr>
-                      <w:jc w:val="right"/>
-                      <w:rPr>
-                        <w:i/>
-                        <w:color w:val="0070C0"/>
-                        <w:sz w:val="14"/>
-                        <w:szCs w:val="14"/>
-                      </w:rPr>
-                    </w:pPr>
-                    <w:r>
-                      <w:rPr>
-                        <w:i/>
-                        <w:color w:val="0070C0"/>
-                        <w:sz w:val="14"/>
-                        <w:szCs w:val="14"/>
-                      </w:rPr>
-                      <w:t xml:space="preserve">Página </w:t>
-                    </w:r>
-                    <w:r>
-                      <w:rPr>
-                        <w:i/>
-                        <w:color w:val="0070C0"/>
-                        <w:sz w:val="14"/>
-                        <w:szCs w:val="14"/>
-                      </w:rPr>
-                      <w:fldChar w:fldCharType="begin"/>
-                    </w:r>
-                    <w:r>
-                      <w:rPr>
-                        <w:i/>
-                        <w:color w:val="0070C0"/>
-                        <w:sz w:val="14"/>
-                        <w:szCs w:val="14"/>
-                      </w:rPr>
-                      <w:instrText>PAGE   \* MERGEFORMAT</w:instrText>
-                    </w:r>
-                    <w:r>
-                      <w:rPr>
-                        <w:i/>
-                        <w:color w:val="0070C0"/>
-                        <w:sz w:val="14"/>
-                        <w:szCs w:val="14"/>
-                      </w:rPr>
-                      <w:fldChar w:fldCharType="separate"/>
-                    </w:r>
-                    <w:r>
-                      <w:rPr>
-                        <w:i/>
-                        <w:noProof/>
-                        <w:color w:val="0070C0"/>
-                        <w:sz w:val="14"/>
-                        <w:szCs w:val="14"/>
-                      </w:rPr>
-                      <w:t>19</w:t>
-                    </w:r>
-                    <w:r>
-                      <w:rPr>
-                        <w:i/>
-                        <w:color w:val="0070C0"/>
-                        <w:sz w:val="14"/>
-                        <w:szCs w:val="14"/>
-                      </w:rPr>
-                      <w:fldChar w:fldCharType="end"/>
-                    </w:r>
-                  </w:p>
-                  <w:p>
-                    <w:pPr>
-                      <w:jc w:val="right"/>
-                      <w:rPr>
-                        <w:i/>
-                        <w:color w:val="0070C0"/>
-                        <w:sz w:val="14"/>
-                        <w:szCs w:val="14"/>
-                      </w:rPr>
-                    </w:pPr>
-                    <w:r>
-                      <w:rPr>
-                        <w:i/>
-                        <w:color w:val="0070C0"/>
-                        <w:sz w:val="14"/>
-                        <w:szCs w:val="14"/>
-                      </w:rPr>
-                      <w:t>5</w:t>
-                    </w:r>
-                    <w:r>
-                      <w:rPr>
-                        <w:i/>
-                        <w:color w:val="0070C0"/>
-                        <w:sz w:val="14"/>
-                        <w:szCs w:val="14"/>
-                      </w:rPr>
-                      <w:t>35.2.2</w:t>
-                    </w:r>
-                  </w:p>
-                </w:txbxContent>
-              </v:textbox>
-              <w10:wrap type="through" anchorx="page" anchory="page"/>
-            </v:shape>
-          </w:pict>
-        </mc:Fallback>
-      </mc:AlternateContent>
-    </w:r>
-    <w:r>
-      <w:rPr>
-        <w:noProof/>
-      </w:rPr>
-      <mc:AlternateContent>
-        <mc:Choice Requires="wps">
-          <w:drawing>
-            <wp:anchor distT="0" distB="0" distL="114300" distR="114300" simplePos="0" relativeHeight="251658240" behindDoc="0" locked="0" layoutInCell="1" allowOverlap="1" wp14:anchorId="530DBE89" wp14:editId="51535FF7">
-              <wp:simplePos x="0" y="0"/>
-              <wp:positionH relativeFrom="column">
-                <wp:posOffset>1562100</wp:posOffset>
-              </wp:positionH>
-              <wp:positionV relativeFrom="paragraph">
-                <wp:posOffset>51435</wp:posOffset>
-              </wp:positionV>
-              <wp:extent cx="0" cy="457200"/>
-              <wp:effectExtent l="0" t="0" r="38100" b="19050"/>
-              <wp:wrapNone/>
-              <wp:docPr id="30" name="Conector recto 30"/>
-              <wp:cNvGraphicFramePr/>
-              <a:graphic xmlns:a="http://schemas.openxmlformats.org/drawingml/2006/main">
-                <a:graphicData uri="http://schemas.microsoft.com/office/word/2010/wordprocessingShape">
-                  <wps:wsp>
-                    <wps:cNvCnPr/>
-                    <wps:spPr>
-                      <a:xfrm>
-                        <a:off x="0" y="0"/>
-                        <a:ext cx="0" cy="457200"/>
-                      </a:xfrm>
-                      <a:prstGeom prst="line">
-                        <a:avLst/>
-                      </a:prstGeom>
-                      <a:noFill/>
-                      <a:ln w="6350" cap="flat" cmpd="sng" algn="ctr">
-                        <a:solidFill>
-                          <a:sysClr val="windowText" lastClr="000000"/>
-                        </a:solidFill>
-                        <a:prstDash val="solid"/>
-                        <a:miter lim="800000"/>
-                      </a:ln>
-                      <a:effectLst/>
-                    </wps:spPr>
-                    <wps:bodyPr/>
-                  </wps:wsp>
-                </a:graphicData>
-              </a:graphic>
-            </wp:anchor>
-          </w:drawing>
-        </mc:Choice>
-        <mc:Fallback>
-          <w:pict>
-            <v:line w14:anchorId="29C75443" id="Conector recto 30" o:spid="_x0000_s1026" style="position:absolute;z-index:251666432;visibility:visible;mso-wrap-style:square;mso-wrap-distance-left:9pt;mso-wrap-distance-top:0;mso-wrap-distance-right:9pt;mso-wrap-distance-bottom:0;mso-position-horizontal:absolute;mso-position-horizontal-relative:text;mso-position-vertical:absolute;mso-position-vertical-relative:text" from="123pt,4.05pt" to="123pt,40.05pt" o:gfxdata="UEsDBBQABgAIAAAAIQC2gziS/gAAAOEBAAATAAAAW0NvbnRlbnRfVHlwZXNdLnhtbJSRQU7DMBBF 90jcwfIWJU67QAgl6YK0S0CoHGBkTxKLZGx5TGhvj5O2G0SRWNoz/78nu9wcxkFMGNg6quQqL6RA 0s5Y6ir5vt9lD1JwBDIwOMJKHpHlpr69KfdHjyxSmriSfYz+USnWPY7AufNIadK6MEJMx9ApD/oD OlTrorhX2lFEilmcO2RdNtjC5xDF9pCuTyYBB5bi6bQ4syoJ3g9WQ0ymaiLzg5KdCXlKLjvcW893 SUOqXwnz5DrgnHtJTxOsQfEKIT7DmDSUCaxw7Rqn8787ZsmRM9e2VmPeBN4uqYvTtW7jvijg9N/y JsXecLq0q+WD6m8AAAD//wMAUEsDBBQABgAIAAAAIQA4/SH/1gAAAJQBAAALAAAAX3JlbHMvLnJl bHOkkMFqwzAMhu+DvYPRfXGawxijTi+j0GvpHsDYimMaW0Yy2fr2M4PBMnrbUb/Q94l/f/hMi1qR JVI2sOt6UJgd+ZiDgffL8ekFlFSbvV0oo4EbChzGx4f9GRdb25HMsYhqlCwG5lrLq9biZkxWOiqY 22YiTra2kYMu1l1tQD30/bPm3wwYN0x18gb45AdQl1tp5j/sFB2T0FQ7R0nTNEV3j6o9feQzro1i OWA14Fm+Q8a1a8+Bvu/d/dMb2JY5uiPbhG/ktn4cqGU/er3pcvwCAAD//wMAUEsDBBQABgAIAAAA IQB2XM8xrwEAAFgDAAAOAAAAZHJzL2Uyb0RvYy54bWysU01vEzEQvSPxHyzfidNCS7WK00OjckFQ ifIDpv7YteQveUw2+feMvSENcEPswWvPeN7Oe/N2c38Inu1NQZei5FerNWcmqqRdHCX//vz47o4z rBA1+BSN5EeD/H779s1mzoO5TlPy2hRGIBGHOUs+1ZoHIVBNJgCuUjaRkjaVAJWOZRS6wEzowYvr 9fpWzKnoXJIyiBTdLUm+7fjWGlW/WoumMi859Vb7Wvr60lax3cAwFsiTU6c24B+6COAiffQMtYMK 7Edxf0EFp0rCZOtKpSCStU6ZzoHYXK3/YPNtgmw6FxIH81km/H+w6sv+IT4VkmHOOGB+Ko3FwZbQ 3tQfO3SxjmexzKEytQQVRT/cfKQ5NB3Fa10uWD+ZFFjbSO5dbDRggP1nrMvVX1daOKZH530fhY9s lvz2/Q0NSwEZwnqotA1ZS45x5Az8SE5TtXRETN7pVt1w8IgPvrA90LDJIzrNz9QtZx6wUoIo9OfU 7G+lrZ0d4LQU99TijeAqGdS7IPndZbWP7YumW+xE6lXBtntJ+tiFFe1E4+sKnazW/HF5pv3lD7H9 CQAA//8DAFBLAwQUAAYACAAAACEA3Ghnn9wAAAAIAQAADwAAAGRycy9kb3ducmV2LnhtbEyPy07D MBBF90j9B2sqsaN2WlSqEKeqWnXBrgSQWLrx5AHxOIqdNvw9g1jA8uiO7pybbSfXiQsOofWkIVko EEilty3VGl5fjncbECEasqbzhBq+MMA2n91kJrX+Ss94KWItuIRCajQ0MfaplKFs0Jmw8D0SZ5Uf nImMQy3tYK5c7jq5VGotnWmJPzSmx32D5WcxOg3jaV+p9riaPt5XhRyfHk5vh6rW+nY+7R5BRJzi 3zH86LM65Ox09iPZIDoNy/s1b4kaNgkIzn/5zKwSkHkm/w/IvwEAAP//AwBQSwECLQAUAAYACAAA ACEAtoM4kv4AAADhAQAAEwAAAAAAAAAAAAAAAAAAAAAAW0NvbnRlbnRfVHlwZXNdLnhtbFBLAQIt ABQABgAIAAAAIQA4/SH/1gAAAJQBAAALAAAAAAAAAAAAAAAAAC8BAABfcmVscy8ucmVsc1BLAQIt ABQABgAIAAAAIQB2XM8xrwEAAFgDAAAOAAAAAAAAAAAAAAAAAC4CAABkcnMvZTJvRG9jLnhtbFBL AQItABQABgAIAAAAIQDcaGef3AAAAAgBAAAPAAAAAAAAAAAAAAAAAAkEAABkcnMvZG93bnJldi54 bWxQSwUGAAAAAAQABADzAAAAEgUAAAAA " strokecolor="windowText" strokeweight=".5pt">
-              <v:stroke joinstyle="miter"/>
-            </v:line>
-          </w:pict>
-        </mc:Fallback>
-      </mc:AlternateContent>
-    </w:r>
-    <w:r>
-      <w:rPr>
-        <w:noProof/>
-      </w:rPr>
-      <mc:AlternateContent>
-        <mc:Choice Requires="wps">
-          <w:drawing>
-            <wp:anchor distT="0" distB="0" distL="114300" distR="114300" simplePos="0" relativeHeight="251654144" behindDoc="0" locked="0" layoutInCell="1" allowOverlap="1" wp14:anchorId="06956A8A" wp14:editId="2D24E183">
-              <wp:simplePos x="0" y="0"/>
-              <wp:positionH relativeFrom="column">
-                <wp:posOffset>304800</wp:posOffset>
-              </wp:positionH>
-              <wp:positionV relativeFrom="paragraph">
-                <wp:posOffset>51435</wp:posOffset>
-              </wp:positionV>
-              <wp:extent cx="0" cy="457200"/>
-              <wp:effectExtent l="0" t="0" r="38100" b="19050"/>
-              <wp:wrapNone/>
-              <wp:docPr id="31" name="Conector recto 31"/>
-              <wp:cNvGraphicFramePr/>
-              <a:graphic xmlns:a="http://schemas.openxmlformats.org/drawingml/2006/main">
-                <a:graphicData uri="http://schemas.microsoft.com/office/word/2010/wordprocessingShape">
-                  <wps:wsp>
-                    <wps:cNvCnPr/>
-                    <wps:spPr>
-                      <a:xfrm>
-                        <a:off x="0" y="0"/>
-                        <a:ext cx="0" cy="457200"/>
-                      </a:xfrm>
-                      <a:prstGeom prst="line">
-                        <a:avLst/>
-                      </a:prstGeom>
-                      <a:noFill/>
-                      <a:ln w="6350" cap="flat" cmpd="sng" algn="ctr">
-                        <a:solidFill>
-                          <a:sysClr val="windowText" lastClr="000000"/>
-                        </a:solidFill>
-                        <a:prstDash val="solid"/>
-                        <a:miter lim="800000"/>
-                      </a:ln>
-                      <a:effectLst/>
-                    </wps:spPr>
-                    <wps:bodyPr/>
-                  </wps:wsp>
-                </a:graphicData>
-              </a:graphic>
-            </wp:anchor>
-          </w:drawing>
-        </mc:Choice>
-        <mc:Fallback>
-          <w:pict>
-            <v:line w14:anchorId="26AC4FCA" id="Conector recto 31" o:spid="_x0000_s1026" style="position:absolute;z-index:251664384;visibility:visible;mso-wrap-style:square;mso-wrap-distance-left:9pt;mso-wrap-distance-top:0;mso-wrap-distance-right:9pt;mso-wrap-distance-bottom:0;mso-position-horizontal:absolute;mso-position-horizontal-relative:text;mso-position-vertical:absolute;mso-position-vertical-relative:text" from="24pt,4.05pt" to="24pt,40.05pt" o:gfxdata="UEsDBBQABgAIAAAAIQC2gziS/gAAAOEBAAATAAAAW0NvbnRlbnRfVHlwZXNdLnhtbJSRQU7DMBBF 90jcwfIWJU67QAgl6YK0S0CoHGBkTxKLZGx5TGhvj5O2G0SRWNoz/78nu9wcxkFMGNg6quQqL6RA 0s5Y6ir5vt9lD1JwBDIwOMJKHpHlpr69KfdHjyxSmriSfYz+USnWPY7AufNIadK6MEJMx9ApD/oD OlTrorhX2lFEilmcO2RdNtjC5xDF9pCuTyYBB5bi6bQ4syoJ3g9WQ0ymaiLzg5KdCXlKLjvcW893 SUOqXwnz5DrgnHtJTxOsQfEKIT7DmDSUCaxw7Rqn8787ZsmRM9e2VmPeBN4uqYvTtW7jvijg9N/y JsXecLq0q+WD6m8AAAD//wMAUEsDBBQABgAIAAAAIQA4/SH/1gAAAJQBAAALAAAAX3JlbHMvLnJl bHOkkMFqwzAMhu+DvYPRfXGawxijTi+j0GvpHsDYimMaW0Yy2fr2M4PBMnrbUb/Q94l/f/hMi1qR JVI2sOt6UJgd+ZiDgffL8ekFlFSbvV0oo4EbChzGx4f9GRdb25HMsYhqlCwG5lrLq9biZkxWOiqY 22YiTra2kYMu1l1tQD30/bPm3wwYN0x18gb45AdQl1tp5j/sFB2T0FQ7R0nTNEV3j6o9feQzro1i OWA14Fm+Q8a1a8+Bvu/d/dMb2JY5uiPbhG/ktn4cqGU/er3pcvwCAAD//wMAUEsDBBQABgAIAAAA IQB2XM8xrwEAAFgDAAAOAAAAZHJzL2Uyb0RvYy54bWysU01vEzEQvSPxHyzfidNCS7WK00OjckFQ ifIDpv7YteQveUw2+feMvSENcEPswWvPeN7Oe/N2c38Inu1NQZei5FerNWcmqqRdHCX//vz47o4z rBA1+BSN5EeD/H779s1mzoO5TlPy2hRGIBGHOUs+1ZoHIVBNJgCuUjaRkjaVAJWOZRS6wEzowYvr 9fpWzKnoXJIyiBTdLUm+7fjWGlW/WoumMi859Vb7Wvr60lax3cAwFsiTU6c24B+6COAiffQMtYMK 7Edxf0EFp0rCZOtKpSCStU6ZzoHYXK3/YPNtgmw6FxIH81km/H+w6sv+IT4VkmHOOGB+Ko3FwZbQ 3tQfO3SxjmexzKEytQQVRT/cfKQ5NB3Fa10uWD+ZFFjbSO5dbDRggP1nrMvVX1daOKZH530fhY9s lvz2/Q0NSwEZwnqotA1ZS45x5Az8SE5TtXRETN7pVt1w8IgPvrA90LDJIzrNz9QtZx6wUoIo9OfU 7G+lrZ0d4LQU99TijeAqGdS7IPndZbWP7YumW+xE6lXBtntJ+tiFFe1E4+sKnazW/HF5pv3lD7H9 CQAA//8DAFBLAwQUAAYACAAAACEAHxfvLNoAAAAGAQAADwAAAGRycy9kb3ducmV2LnhtbEyPy07D MBBF90j9B2sqsaN2WgRRiFNVRV2wKwEklm48eUA8jmKnDX/PwAaWR3d075l8O7tenHEMnScNyUqB QKq87ajR8PpyuElBhGjImt4TavjCANticZWbzPoLPeO5jI3gEgqZ0dDGOGRShqpFZ8LKD0ic1X50 JjKOjbSjuXC56+VaqTvpTEe80JoB9y1Wn+XkNEzHfa26w2b+eN+Ucnq6P7491o3W18t59wAi4hz/ juFHn9WhYKeTn8gG0Wu4TfmVqCFNQHD8iydGlYAscvlfv/gGAAD//wMAUEsBAi0AFAAGAAgAAAAh ALaDOJL+AAAA4QEAABMAAAAAAAAAAAAAAAAAAAAAAFtDb250ZW50X1R5cGVzXS54bWxQSwECLQAU AAYACAAAACEAOP0h/9YAAACUAQAACwAAAAAAAAAAAAAAAAAvAQAAX3JlbHMvLnJlbHNQSwECLQAU AAYACAAAACEAdlzPMa8BAABYAwAADgAAAAAAAAAAAAAAAAAuAgAAZHJzL2Uyb0RvYy54bWxQSwEC LQAUAAYACAAAACEAHxfvLNoAAAAGAQAADwAAAAAAAAAAAAAAAAAJBAAAZHJzL2Rvd25yZXYueG1s UEsFBgAAAAAEAAQA8wAAABAFAAAAAA== " strokecolor="windowText" strokeweight=".5pt">
-              <v:stroke joinstyle="miter"/>
-            </v:line>
-          </w:pict>
-        </mc:Fallback>
-      </mc:AlternateContent>
-    </w:r>
-  </w:p>
-</w:ftr>
+<ns0:ftr xmlns:ns0="http://schemas.openxmlformats.org/wordprocessingml/2006/main" xmlns:ns1="http://schemas.openxmlformats.org/markup-compatibility/2006" xmlns:ns10="urn:schemas-microsoft-com:office:word" xmlns:ns2="http://schemas.microsoft.com/office/word/2010/wordml" xmlns:ns3="http://schemas.openxmlformats.org/drawingml/2006/wordprocessingDrawing" xmlns:ns4="http://schemas.microsoft.com/office/word/2010/wordprocessingDrawing" xmlns:ns5="http://schemas.openxmlformats.org/drawingml/2006/main" xmlns:ns6="http://schemas.microsoft.com/office/word/2010/wordprocessingShape" xmlns:ns7="http://schemas.microsoft.com/office/mac/drawingml/2011/main" xmlns:ns8="urn:schemas-microsoft-com:vml" xmlns:ns9="urn:schemas-microsoft-com:office:office" ns1:Ignorable="w14 w15 w16se w16cid w16 w16cex w16sdtdh w16sdtfl w16du wp14">
+  <ns0:p ns2:paraId="240D8C91" ns2:textId="77777777" ns0:rsidR="008C47A6" ns0:rsidRDefault="00000000" ns0:rsidP="00E74375">
+    <ns0:r>
+      <ns0:rPr>
+        <ns0:noProof/>
+      </ns0:rPr>
+      <ns1:AlternateContent>
+        <ns1:Choice Requires="wps">
+          <ns0:drawing>
+            <ns3:anchor distT="0" distB="0" distL="114300" distR="114300" simplePos="0" relativeHeight="251660288" behindDoc="0" locked="0" layoutInCell="1" allowOverlap="1" ns4:anchorId="32FBE6F8" ns4:editId="03361862">
+              <ns3:simplePos x="0" y="0"/>
+              <ns3:positionH relativeFrom="page">
+                <ns3:posOffset>4058285</ns3:posOffset>
+              </ns3:positionH>
+              <ns3:positionV relativeFrom="page">
+                <ns3:posOffset>10132695</ns3:posOffset>
+              </ns3:positionV>
+              <ns3:extent cx="1714500" cy="342900"/>
+              <ns3:effectExtent l="0" t="0" r="0" b="0"/>
+              <ns3:wrapThrough wrapText="bothSides">
+                <ns3:wrapPolygon edited="0">
+                  <ns3:start x="480" y="0"/>
+                  <ns3:lineTo x="480" y="20400"/>
+                  <ns3:lineTo x="20880" y="20400"/>
+                  <ns3:lineTo x="20880" y="0"/>
+                  <ns3:lineTo x="480" y="0"/>
+                </ns3:wrapPolygon>
+              </ns3:wrapThrough>
+              <ns3:docPr id="2" name="Text Box 10"/>
+              <ns3:cNvGraphicFramePr>
+                <ns5:graphicFrameLocks/>
+              </ns3:cNvGraphicFramePr>
+              <ns5:graphic>
+                <ns5:graphicData uri="http://schemas.microsoft.com/office/word/2010/wordprocessingShape">
+                  <ns6:wsp>
+                    <ns6:cNvSpPr txBox="1">
+                      <ns5:spLocks/>
+                    </ns6:cNvSpPr>
+                    <ns6:spPr>
+                      <ns5:xfrm>
+                        <ns5:off x="0" y="0"/>
+                        <ns5:ext cx="1714500" cy="342900"/>
+                      </ns5:xfrm>
+                      <ns5:prstGeom prst="rect">
+                        <ns5:avLst/>
+                      </ns5:prstGeom>
+                      <ns5:noFill/>
+                      <ns5:ln>
+                        <ns5:noFill/>
+                      </ns5:ln>
+                      <ns5:effectLst/>
+                      <ns5:extLst>
+                        <ns5:ext uri="{C572A759-6A51-4108-AA02-DFA0A04FC94B}">
+                          <ns7:wrappingTextBoxFlag/>
+                        </ns5:ext>
+                      </ns5:extLst>
+                    </ns6:spPr>
+                    <ns6:txbx>
+                      <ns0:txbxContent>
+                        <ns0:p ns2:paraId="4B426C7A" ns2:textId="77777777" ns0:rsidR="008C47A6" ns0:rsidRPr="00C954D2" ns0:rsidRDefault="00000000" ns0:rsidP="00E74375">
+                          <ns0:pPr>
+                            <ns0:rPr>
+                              <ns0:sz ns0:val="14"/>
+                              <ns0:szCs ns0:val="14"/>
+                              <ns0:lang ns0:val="es-ES_tradnl"/>
+                            </ns0:rPr>
+                          </ns0:pPr>
+                          <ns0:r ns0:rsidRPr="00C954D2">
+                            <ns0:rPr>
+                              <ns0:sz ns0:val="14"/>
+                              <ns0:szCs ns0:val="14"/>
+                              <ns0:lang ns0:val="es-ES_tradnl"/>
+                            </ns0:rPr>
+                            <ns0:t>Avda. de la Aurora, 55, entreplanta</ns0:t>
+                          </ns0:r>
+                        </ns0:p>
+                        <ns0:p ns2:paraId="4E486CEB" ns2:textId="77777777" ns0:rsidR="008C47A6" ns0:rsidRPr="00C954D2" ns0:rsidRDefault="00000000" ns0:rsidP="00E74375">
+                          <ns0:pPr>
+                            <ns0:rPr>
+                              <ns0:sz ns0:val="14"/>
+                              <ns0:szCs ns0:val="14"/>
+                              <ns0:lang ns0:val="es-ES_tradnl"/>
+                            </ns0:rPr>
+                          </ns0:pPr>
+                          <ns0:r ns0:rsidRPr="00C954D2">
+                            <ns0:rPr>
+                              <ns0:sz ns0:val="14"/>
+                              <ns0:szCs ns0:val="14"/>
+                              <ns0:lang ns0:val="es-ES_tradnl"/>
+                            </ns0:rPr>
+                            <ns0:t>29006 Málaga (España)</ns0:t>
+                          </ns0:r>
+                        </ns0:p>
+                      </ns0:txbxContent>
+                    </ns6:txbx>
+                    <ns6:bodyPr rot="0" spcFirstLastPara="0" vertOverflow="overflow" horzOverflow="overflow" vert="horz" wrap="square" lIns="91440" tIns="45720" rIns="91440" bIns="45720" numCol="1" spcCol="0" rtlCol="0" fromWordArt="0" anchor="t" anchorCtr="0" forceAA="0" compatLnSpc="1">
+                      <ns5:prstTxWarp prst="textNoShape">
+                        <ns5:avLst/>
+                      </ns5:prstTxWarp>
+                      <ns5:noAutofit/>
+                    </ns6:bodyPr>
+                  </ns6:wsp>
+                </ns5:graphicData>
+              </ns5:graphic>
+              <ns4:sizeRelH relativeFrom="margin">
+                <ns4:pctWidth>0</ns4:pctWidth>
+              </ns4:sizeRelH>
+              <ns4:sizeRelV relativeFrom="margin">
+                <ns4:pctHeight>0</ns4:pctHeight>
+              </ns4:sizeRelV>
+            </ns3:anchor>
+          </ns0:drawing>
+        </ns1:Choice>
+        <ns1:Fallback>
+          <ns0:pict>
+            <ns8:shapetype ns2:anchorId="32FBE6F8" id="_x0000_t202" coordsize="21600,21600" ns9:spt="202" path="m,l,21600r21600,l21600,xe">
+              <ns8:stroke joinstyle="miter"/>
+              <ns8:path gradientshapeok="t" ns9:connecttype="rect"/>
+            </ns8:shapetype>
+            <ns8:shape id="Text Box 10" ns9:spid="_x0000_s1027" type="#_x0000_t202" style="position:absolute;left:0;text-align:left;margin-left:319.55pt;margin-top:797.85pt;width:135pt;height:27pt;z-index:251660288;visibility:visible;mso-wrap-style:square;mso-width-percent:0;mso-height-percent:0;mso-wrap-distance-left:9pt;mso-wrap-distance-top:0;mso-wrap-distance-right:9pt;mso-wrap-distance-bottom:0;mso-position-horizontal:absolute;mso-position-horizontal-relative:page;mso-position-vertical:absolute;mso-position-vertical-relative:page;mso-width-percent:0;mso-height-percent:0;mso-width-relative:margin;mso-height-relative:margin;v-text-anchor:top" ns9:gfxdata="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" filled="f" stroked="f">
+              <ns8:textbox>
+                <ns0:txbxContent>
+                  <ns0:p ns2:paraId="4B426C7A" ns2:textId="77777777" ns0:rsidR="008C47A6" ns0:rsidRPr="00C954D2" ns0:rsidRDefault="00000000" ns0:rsidP="00E74375">
+                    <ns0:pPr>
+                      <ns0:rPr>
+                        <ns0:sz ns0:val="14"/>
+                        <ns0:szCs ns0:val="14"/>
+                        <ns0:lang ns0:val="es-ES_tradnl"/>
+                      </ns0:rPr>
+                    </ns0:pPr>
+                    <ns0:r ns0:rsidRPr="00C954D2">
+                      <ns0:rPr>
+                        <ns0:sz ns0:val="14"/>
+                        <ns0:szCs ns0:val="14"/>
+                        <ns0:lang ns0:val="es-ES_tradnl"/>
+                      </ns0:rPr>
+                      <ns0:t>Avda. de la Aurora, 55, entreplanta</ns0:t>
+                    </ns0:r>
+                  </ns0:p>
+                  <ns0:p ns2:paraId="4E486CEB" ns2:textId="77777777" ns0:rsidR="008C47A6" ns0:rsidRPr="00C954D2" ns0:rsidRDefault="00000000" ns0:rsidP="00E74375">
+                    <ns0:pPr>
+                      <ns0:rPr>
+                        <ns0:sz ns0:val="14"/>
+                        <ns0:szCs ns0:val="14"/>
+                        <ns0:lang ns0:val="es-ES_tradnl"/>
+                      </ns0:rPr>
+                    </ns0:pPr>
+                    <ns0:r ns0:rsidRPr="00C954D2">
+                      <ns0:rPr>
+                        <ns0:sz ns0:val="14"/>
+                        <ns0:szCs ns0:val="14"/>
+                        <ns0:lang ns0:val="es-ES_tradnl"/>
+                      </ns0:rPr>
+                      <ns0:t>29006 Málaga (España)</ns0:t>
+                    </ns0:r>
+                  </ns0:p>
+                </ns0:txbxContent>
+              </ns8:textbox>
+              <ns10:wrap type="through" anchorx="page" anchory="page"/>
+            </ns8:shape>
+          </ns0:pict>
+        </ns1:Fallback>
+      </ns1:AlternateContent>
+    </ns0:r>
+    <ns0:r>
+      <ns0:rPr>
+        <ns0:noProof/>
+      </ns0:rPr>
+      <ns1:AlternateContent>
+        <ns1:Choice Requires="wps">
+          <ns0:drawing>
+            <ns3:anchor distT="0" distB="0" distL="114300" distR="114300" simplePos="0" relativeHeight="251650048" behindDoc="0" locked="0" layoutInCell="1" allowOverlap="1" ns4:anchorId="003E73B6" ns4:editId="76E9C323">
+              <ns3:simplePos x="0" y="0"/>
+              <ns3:positionH relativeFrom="page">
+                <ns3:posOffset>1429385</ns3:posOffset>
+              </ns3:positionH>
+              <ns3:positionV relativeFrom="page">
+                <ns3:posOffset>10132695</ns3:posOffset>
+              </ns3:positionV>
+              <ns3:extent cx="800100" cy="342900"/>
+              <ns3:effectExtent l="0" t="0" r="0" b="0"/>
+              <ns3:wrapThrough wrapText="bothSides">
+                <ns3:wrapPolygon edited="0">
+                  <ns3:start x="1029" y="0"/>
+                  <ns3:lineTo x="1029" y="20400"/>
+                  <ns3:lineTo x="20057" y="20400"/>
+                  <ns3:lineTo x="20057" y="0"/>
+                  <ns3:lineTo x="1029" y="0"/>
+                </ns3:wrapPolygon>
+              </ns3:wrapThrough>
+              <ns3:docPr id="3" name="Text Box 10"/>
+              <ns3:cNvGraphicFramePr>
+                <ns5:graphicFrameLocks/>
+              </ns3:cNvGraphicFramePr>
+              <ns5:graphic>
+                <ns5:graphicData uri="http://schemas.microsoft.com/office/word/2010/wordprocessingShape">
+                  <ns6:wsp>
+                    <ns6:cNvSpPr txBox="1">
+                      <ns5:spLocks/>
+                    </ns6:cNvSpPr>
+                    <ns6:spPr>
+                      <ns5:xfrm>
+                        <ns5:off x="0" y="0"/>
+                        <ns5:ext cx="800100" cy="342900"/>
+                      </ns5:xfrm>
+                      <ns5:prstGeom prst="rect">
+                        <ns5:avLst/>
+                      </ns5:prstGeom>
+                      <ns5:noFill/>
+                      <ns5:ln>
+                        <ns5:noFill/>
+                      </ns5:ln>
+                      <ns5:effectLst/>
+                      <ns5:extLst>
+                        <ns5:ext uri="{C572A759-6A51-4108-AA02-DFA0A04FC94B}">
+                          <ns7:wrappingTextBoxFlag/>
+                        </ns5:ext>
+                      </ns5:extLst>
+                    </ns6:spPr>
+                    <ns6:txbx>
+                      <ns0:txbxContent>
+                        <ns0:p ns2:paraId="23F13C87" ns2:textId="77777777" ns0:rsidR="008C47A6" ns0:rsidRPr="00C954D2" ns0:rsidRDefault="00000000" ns0:rsidP="00E74375">
+                          <ns0:pPr>
+                            <ns0:rPr>
+                              <ns0:sz ns0:val="14"/>
+                              <ns0:szCs ns0:val="12"/>
+                              <ns0:lang ns0:val="es-ES_tradnl"/>
+                            </ns0:rPr>
+                          </ns0:pPr>
+                          <ns0:r ns0:rsidRPr="00C954D2">
+                            <ns0:rPr>
+                              <ns0:sz ns0:val="14"/>
+                              <ns0:szCs ns0:val="12"/>
+                              <ns0:lang ns0:val="es-ES_tradnl"/>
+                            </ns0:rPr>
+                            <ns0:t>952 04 10 47</ns0:t>
+                          </ns0:r>
+                        </ns0:p>
+                        <ns0:p ns2:paraId="78ABD258" ns2:textId="77777777" ns0:rsidR="008C47A6" ns0:rsidRPr="00C954D2" ns0:rsidRDefault="00000000" ns0:rsidP="00E74375">
+                          <ns0:pPr>
+                            <ns0:rPr>
+                              <ns0:sz ns0:val="14"/>
+                              <ns0:szCs ns0:val="14"/>
+                              <ns0:lang ns0:val="es-ES_tradnl"/>
+                            </ns0:rPr>
+                          </ns0:pPr>
+                          <ns0:r ns0:rsidRPr="00C954D2">
+                            <ns0:rPr>
+                              <ns0:sz ns0:val="14"/>
+                              <ns0:szCs ns0:val="14"/>
+                              <ns0:lang ns0:val="es-ES_tradnl"/>
+                            </ns0:rPr>
+                            <ns0:t>952 34 41 00</ns0:t>
+                          </ns0:r>
+                        </ns0:p>
+                      </ns0:txbxContent>
+                    </ns6:txbx>
+                    <ns6:bodyPr rot="0" spcFirstLastPara="0" vertOverflow="overflow" horzOverflow="overflow" vert="horz" wrap="square" lIns="91440" tIns="45720" rIns="91440" bIns="45720" numCol="1" spcCol="0" rtlCol="0" fromWordArt="0" anchor="t" anchorCtr="0" forceAA="0" compatLnSpc="1">
+                      <ns5:prstTxWarp prst="textNoShape">
+                        <ns5:avLst/>
+                      </ns5:prstTxWarp>
+                      <ns5:noAutofit/>
+                    </ns6:bodyPr>
+                  </ns6:wsp>
+                </ns5:graphicData>
+              </ns5:graphic>
+              <ns4:sizeRelH relativeFrom="margin">
+                <ns4:pctWidth>0</ns4:pctWidth>
+              </ns4:sizeRelH>
+              <ns4:sizeRelV relativeFrom="margin">
+                <ns4:pctHeight>0</ns4:pctHeight>
+              </ns4:sizeRelV>
+            </ns3:anchor>
+          </ns0:drawing>
+        </ns1:Choice>
+        <ns1:Fallback>
+          <ns0:pict>
+            <ns8:shape ns2:anchorId="003E73B6" id="_x0000_s1028" type="#_x0000_t202" style="position:absolute;left:0;text-align:left;margin-left:112.55pt;margin-top:797.85pt;width:63pt;height:27pt;z-index:251650048;visibility:visible;mso-wrap-style:square;mso-width-percent:0;mso-height-percent:0;mso-wrap-distance-left:9pt;mso-wrap-distance-top:0;mso-wrap-distance-right:9pt;mso-wrap-distance-bottom:0;mso-position-horizontal:absolute;mso-position-horizontal-relative:page;mso-position-vertical:absolute;mso-position-vertical-relative:page;mso-width-percent:0;mso-height-percent:0;mso-width-relative:margin;mso-height-relative:margin;v-text-anchor:top" ns9:gfxdata="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" filled="f" stroked="f">
+              <ns8:textbox>
+                <ns0:txbxContent>
+                  <ns0:p ns2:paraId="23F13C87" ns2:textId="77777777" ns0:rsidR="008C47A6" ns0:rsidRPr="00C954D2" ns0:rsidRDefault="00000000" ns0:rsidP="00E74375">
+                    <ns0:pPr>
+                      <ns0:rPr>
+                        <ns0:sz ns0:val="14"/>
+                        <ns0:szCs ns0:val="12"/>
+                        <ns0:lang ns0:val="es-ES_tradnl"/>
+                      </ns0:rPr>
+                    </ns0:pPr>
+                    <ns0:r ns0:rsidRPr="00C954D2">
+                      <ns0:rPr>
+                        <ns0:sz ns0:val="14"/>
+                        <ns0:szCs ns0:val="12"/>
+                        <ns0:lang ns0:val="es-ES_tradnl"/>
+                      </ns0:rPr>
+                      <ns0:t>952 04 10 47</ns0:t>
+                    </ns0:r>
+                  </ns0:p>
+                  <ns0:p ns2:paraId="78ABD258" ns2:textId="77777777" ns0:rsidR="008C47A6" ns0:rsidRPr="00C954D2" ns0:rsidRDefault="00000000" ns0:rsidP="00E74375">
+                    <ns0:pPr>
+                      <ns0:rPr>
+                        <ns0:sz ns0:val="14"/>
+                        <ns0:szCs ns0:val="14"/>
+                        <ns0:lang ns0:val="es-ES_tradnl"/>
+                      </ns0:rPr>
+                    </ns0:pPr>
+                    <ns0:r ns0:rsidRPr="00C954D2">
+                      <ns0:rPr>
+                        <ns0:sz ns0:val="14"/>
+                        <ns0:szCs ns0:val="14"/>
+                        <ns0:lang ns0:val="es-ES_tradnl"/>
+                      </ns0:rPr>
+                      <ns0:t>952 34 41 00</ns0:t>
+                    </ns0:r>
+                  </ns0:p>
+                </ns0:txbxContent>
+              </ns8:textbox>
+              <ns10:wrap type="through" anchorx="page" anchory="page"/>
+            </ns8:shape>
+          </ns0:pict>
+        </ns1:Fallback>
+      </ns1:AlternateContent>
+    </ns0:r>
+    <ns0:r>
+      <ns0:rPr>
+        <ns0:noProof/>
+      </ns0:rPr>
+      <ns1:AlternateContent>
+        <ns1:Choice Requires="wps">
+          <ns0:drawing>
+            <ns3:anchor distT="0" distB="0" distL="114300" distR="114300" simplePos="0" relativeHeight="251656192" behindDoc="0" locked="0" layoutInCell="1" allowOverlap="1" ns4:anchorId="00F01480" ns4:editId="154F1AE4">
+              <ns3:simplePos x="0" y="0"/>
+              <ns3:positionH relativeFrom="page">
+                <ns3:posOffset>2686685</ns3:posOffset>
+              </ns3:positionH>
+              <ns3:positionV relativeFrom="page">
+                <ns3:posOffset>10132695</ns3:posOffset>
+              </ns3:positionV>
+              <ns3:extent cx="1371600" cy="342900"/>
+              <ns3:effectExtent l="0" t="0" r="0" b="0"/>
+              <ns3:wrapThrough wrapText="bothSides">
+                <ns3:wrapPolygon edited="0">
+                  <ns3:start x="600" y="0"/>
+                  <ns3:lineTo x="600" y="20400"/>
+                  <ns3:lineTo x="20700" y="20400"/>
+                  <ns3:lineTo x="20700" y="0"/>
+                  <ns3:lineTo x="600" y="0"/>
+                </ns3:wrapPolygon>
+              </ns3:wrapThrough>
+              <ns3:docPr id="23" name="Text Box 10"/>
+              <ns3:cNvGraphicFramePr>
+                <ns5:graphicFrameLocks/>
+              </ns3:cNvGraphicFramePr>
+              <ns5:graphic>
+                <ns5:graphicData uri="http://schemas.microsoft.com/office/word/2010/wordprocessingShape">
+                  <ns6:wsp>
+                    <ns6:cNvSpPr txBox="1">
+                      <ns5:spLocks/>
+                    </ns6:cNvSpPr>
+                    <ns6:spPr>
+                      <ns5:xfrm>
+                        <ns5:off x="0" y="0"/>
+                        <ns5:ext cx="1371600" cy="342900"/>
+                      </ns5:xfrm>
+                      <ns5:prstGeom prst="rect">
+                        <ns5:avLst/>
+                      </ns5:prstGeom>
+                      <ns5:noFill/>
+                      <ns5:ln>
+                        <ns5:noFill/>
+                      </ns5:ln>
+                      <ns5:effectLst/>
+                      <ns5:extLst>
+                        <ns5:ext uri="{C572A759-6A51-4108-AA02-DFA0A04FC94B}">
+                          <ns7:wrappingTextBoxFlag/>
+                        </ns5:ext>
+                      </ns5:extLst>
+                    </ns6:spPr>
+                    <ns6:txbx>
+                      <ns0:txbxContent>
+                        <ns0:p ns2:paraId="1B10B988" ns2:textId="77777777" ns0:rsidR="008C47A6" ns0:rsidRPr="00C954D2" ns0:rsidRDefault="00000000" ns0:rsidP="00E74375">
+                          <ns0:pPr>
+                            <ns0:rPr>
+                              <ns0:sz ns0:val="14"/>
+                              <ns0:szCs ns0:val="14"/>
+                              <ns0:lang ns0:val="es-ES_tradnl"/>
+                            </ns0:rPr>
+                          </ns0:pPr>
+                          <ns0:r ns0:rsidRPr="00C954D2">
+                            <ns0:rPr>
+                              <ns0:sz ns0:val="14"/>
+                              <ns0:szCs ns0:val="14"/>
+                              <ns0:lang ns0:val="es-ES_tradnl"/>
+                            </ns0:rPr>
+                            <ns0:t>edp@edp-sl.com</ns0:t>
+                          </ns0:r>
+                        </ns0:p>
+                        <ns0:p ns2:paraId="6BAA68C0" ns2:textId="77777777" ns0:rsidR="008C47A6" ns0:rsidRPr="00C954D2" ns0:rsidRDefault="00000000" ns0:rsidP="00E74375">
+                          <ns0:pPr>
+                            <ns0:rPr>
+                              <ns0:color ns0:val="0070C0"/>
+                              <ns0:sz ns0:val="14"/>
+                              <ns0:szCs ns0:val="14"/>
+                              <ns0:lang ns0:val="es-ES_tradnl"/>
+                            </ns0:rPr>
+                          </ns0:pPr>
+                          <ns0:r ns0:rsidRPr="00C954D2">
+                            <ns0:rPr>
+                              <ns0:color ns0:val="0070C0"/>
+                              <ns0:sz ns0:val="14"/>
+                              <ns0:szCs ns0:val="14"/>
+                              <ns0:lang ns0:val="es-ES_tradnl"/>
+                            </ns0:rPr>
+                            <ns0:t>www.edp-sl.com</ns0:t>
+                          </ns0:r>
+                        </ns0:p>
+                      </ns0:txbxContent>
+                    </ns6:txbx>
+                    <ns6:bodyPr rot="0" spcFirstLastPara="0" vertOverflow="overflow" horzOverflow="overflow" vert="horz" wrap="square" lIns="91440" tIns="45720" rIns="91440" bIns="45720" numCol="1" spcCol="0" rtlCol="0" fromWordArt="0" anchor="t" anchorCtr="0" forceAA="0" compatLnSpc="1">
+                      <ns5:prstTxWarp prst="textNoShape">
+                        <ns5:avLst/>
+                      </ns5:prstTxWarp>
+                      <ns5:noAutofit/>
+                    </ns6:bodyPr>
+                  </ns6:wsp>
+                </ns5:graphicData>
+              </ns5:graphic>
+              <ns4:sizeRelH relativeFrom="margin">
+                <ns4:pctWidth>0</ns4:pctWidth>
+              </ns4:sizeRelH>
+              <ns4:sizeRelV relativeFrom="margin">
+                <ns4:pctHeight>0</ns4:pctHeight>
+              </ns4:sizeRelV>
+            </ns3:anchor>
+          </ns0:drawing>
+        </ns1:Choice>
+        <ns1:Fallback>
+          <ns0:pict>
+            <ns8:shape ns2:anchorId="00F01480" id="_x0000_s1029" type="#_x0000_t202" style="position:absolute;left:0;text-align:left;margin-left:211.55pt;margin-top:797.85pt;width:108pt;height:27pt;z-index:251656192;visibility:visible;mso-wrap-style:square;mso-width-percent:0;mso-height-percent:0;mso-wrap-distance-left:9pt;mso-wrap-distance-top:0;mso-wrap-distance-right:9pt;mso-wrap-distance-bottom:0;mso-position-horizontal:absolute;mso-position-horizontal-relative:page;mso-position-vertical:absolute;mso-position-vertical-relative:page;mso-width-percent:0;mso-height-percent:0;mso-width-relative:margin;mso-height-relative:margin;v-text-anchor:top" ns9:gfxdata="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" filled="f" stroked="f">
+              <ns8:textbox>
+                <ns0:txbxContent>
+                  <ns0:p ns2:paraId="1B10B988" ns2:textId="77777777" ns0:rsidR="008C47A6" ns0:rsidRPr="00C954D2" ns0:rsidRDefault="00000000" ns0:rsidP="00E74375">
+                    <ns0:pPr>
+                      <ns0:rPr>
+                        <ns0:sz ns0:val="14"/>
+                        <ns0:szCs ns0:val="14"/>
+                        <ns0:lang ns0:val="es-ES_tradnl"/>
+                      </ns0:rPr>
+                    </ns0:pPr>
+                    <ns0:r ns0:rsidRPr="00C954D2">
+                      <ns0:rPr>
+                        <ns0:sz ns0:val="14"/>
+                        <ns0:szCs ns0:val="14"/>
+                        <ns0:lang ns0:val="es-ES_tradnl"/>
+                      </ns0:rPr>
+                      <ns0:t>edp@edp-sl.com</ns0:t>
+                    </ns0:r>
+                  </ns0:p>
+                  <ns0:p ns2:paraId="6BAA68C0" ns2:textId="77777777" ns0:rsidR="008C47A6" ns0:rsidRPr="00C954D2" ns0:rsidRDefault="00000000" ns0:rsidP="00E74375">
+                    <ns0:pPr>
+                      <ns0:rPr>
+                        <ns0:color ns0:val="0070C0"/>
+                        <ns0:sz ns0:val="14"/>
+                        <ns0:szCs ns0:val="14"/>
+                        <ns0:lang ns0:val="es-ES_tradnl"/>
+                      </ns0:rPr>
+                    </ns0:pPr>
+                    <ns0:r ns0:rsidRPr="00C954D2">
+                      <ns0:rPr>
+                        <ns0:color ns0:val="0070C0"/>
+                        <ns0:sz ns0:val="14"/>
+                        <ns0:szCs ns0:val="14"/>
+                        <ns0:lang ns0:val="es-ES_tradnl"/>
+                      </ns0:rPr>
+                      <ns0:t>www.edp-sl.com</ns0:t>
+                    </ns0:r>
+                  </ns0:p>
+                </ns0:txbxContent>
+              </ns8:textbox>
+              <ns10:wrap type="through" anchorx="page" anchory="page"/>
+            </ns8:shape>
+          </ns0:pict>
+        </ns1:Fallback>
+      </ns1:AlternateContent>
+    </ns0:r>
+    <ns0:r>
+      <ns0:rPr>
+        <ns0:noProof/>
+      </ns0:rPr>
+      <ns1:AlternateContent>
+        <ns1:Choice Requires="wps">
+          <ns0:drawing>
+            <ns3:anchor distT="0" distB="0" distL="114300" distR="114300" simplePos="0" relativeHeight="251662336" behindDoc="0" locked="0" layoutInCell="1" allowOverlap="1" ns4:anchorId="16C74CA3" ns4:editId="76D3C3D8">
+              <ns3:simplePos x="0" y="0"/>
+              <ns3:positionH relativeFrom="column">
+                <ns3:posOffset>2971800</ns3:posOffset>
+              </ns3:positionH>
+              <ns3:positionV relativeFrom="paragraph">
+                <ns3:posOffset>226695</ns3:posOffset>
+              </ns3:positionV>
+              <ns3:extent cx="0" cy="457200"/>
+              <ns3:effectExtent l="0" t="0" r="38100" b="19050"/>
+              <ns3:wrapNone/>
+              <ns3:docPr id="28" name="Conector recto 28"/>
+              <ns3:cNvGraphicFramePr/>
+              <ns5:graphic>
+                <ns5:graphicData uri="http://schemas.microsoft.com/office/word/2010/wordprocessingShape">
+                  <ns6:wsp>
+                    <ns6:cNvCnPr/>
+                    <ns6:spPr>
+                      <ns5:xfrm>
+                        <ns5:off x="0" y="0"/>
+                        <ns5:ext cx="0" cy="457200"/>
+                      </ns5:xfrm>
+                      <ns5:prstGeom prst="line">
+                        <ns5:avLst/>
+                      </ns5:prstGeom>
+                      <ns5:noFill/>
+                      <ns5:ln w="6350" cap="flat" cmpd="sng" algn="ctr">
+                        <ns5:solidFill>
+                          <ns5:sysClr val="windowText" lastClr="000000"/>
+                        </ns5:solidFill>
+                        <ns5:prstDash val="solid"/>
+                        <ns5:miter lim="800000"/>
+                      </ns5:ln>
+                      <ns5:effectLst/>
+                    </ns6:spPr>
+                    <ns6:bodyPr/>
+                  </ns6:wsp>
+                </ns5:graphicData>
+              </ns5:graphic>
+            </ns3:anchor>
+          </ns0:drawing>
+        </ns1:Choice>
+        <ns1:Fallback>
+          <ns0:pict>
+            <ns8:line ns2:anchorId="3B8E2307" id="Conector recto 28" ns9:spid="_x0000_s1026" style="position:absolute;z-index:251668480;visibility:visible;mso-wrap-style:square;mso-wrap-distance-left:9pt;mso-wrap-distance-top:0;mso-wrap-distance-right:9pt;mso-wrap-distance-bottom:0;mso-position-horizontal:absolute;mso-position-horizontal-relative:text;mso-position-vertical:absolute;mso-position-vertical-relative:text" from="234pt,17.85pt" to="234pt,53.85pt" ns9:gfxdata="UEsDBBQABgAIAAAAIQC2gziS/gAAAOEBAAATAAAAW0NvbnRlbnRfVHlwZXNdLnhtbJSRQU7DMBBF 90jcwfIWJU67QAgl6YK0S0CoHGBkTxKLZGx5TGhvj5O2G0SRWNoz/78nu9wcxkFMGNg6quQqL6RA 0s5Y6ir5vt9lD1JwBDIwOMJKHpHlpr69KfdHjyxSmriSfYz+USnWPY7AufNIadK6MEJMx9ApD/oD OlTrorhX2lFEilmcO2RdNtjC5xDF9pCuTyYBB5bi6bQ4syoJ3g9WQ0ymaiLzg5KdCXlKLjvcW893 SUOqXwnz5DrgnHtJTxOsQfEKIT7DmDSUCaxw7Rqn8787ZsmRM9e2VmPeBN4uqYvTtW7jvijg9N/y JsXecLq0q+WD6m8AAAD//wMAUEsDBBQABgAIAAAAIQA4/SH/1gAAAJQBAAALAAAAX3JlbHMvLnJl bHOkkMFqwzAMhu+DvYPRfXGawxijTi+j0GvpHsDYimMaW0Yy2fr2M4PBMnrbUb/Q94l/f/hMi1qR JVI2sOt6UJgd+ZiDgffL8ekFlFSbvV0oo4EbChzGx4f9GRdb25HMsYhqlCwG5lrLq9biZkxWOiqY 22YiTra2kYMu1l1tQD30/bPm3wwYN0x18gb45AdQl1tp5j/sFB2T0FQ7R0nTNEV3j6o9feQzro1i OWA14Fm+Q8a1a8+Bvu/d/dMb2JY5uiPbhG/ktn4cqGU/er3pcvwCAAD//wMAUEsDBBQABgAIAAAA IQB2XM8xrwEAAFgDAAAOAAAAZHJzL2Uyb0RvYy54bWysU01vEzEQvSPxHyzfidNCS7WK00OjckFQ ifIDpv7YteQveUw2+feMvSENcEPswWvPeN7Oe/N2c38Inu1NQZei5FerNWcmqqRdHCX//vz47o4z rBA1+BSN5EeD/H779s1mzoO5TlPy2hRGIBGHOUs+1ZoHIVBNJgCuUjaRkjaVAJWOZRS6wEzowYvr 9fpWzKnoXJIyiBTdLUm+7fjWGlW/WoumMi859Vb7Wvr60lax3cAwFsiTU6c24B+6COAiffQMtYMK 7Edxf0EFp0rCZOtKpSCStU6ZzoHYXK3/YPNtgmw6FxIH81km/H+w6sv+IT4VkmHOOGB+Ko3FwZbQ 3tQfO3SxjmexzKEytQQVRT/cfKQ5NB3Fa10uWD+ZFFjbSO5dbDRggP1nrMvVX1daOKZH530fhY9s lvz2/Q0NSwEZwnqotA1ZS45x5Az8SE5TtXRETN7pVt1w8IgPvrA90LDJIzrNz9QtZx6wUoIo9OfU 7G+lrZ0d4LQU99TijeAqGdS7IPndZbWP7YumW+xE6lXBtntJ+tiFFe1E4+sKnazW/HF5pv3lD7H9 CQAA//8DAFBLAwQUAAYACAAAACEAsPHN7N4AAAAKAQAADwAAAGRycy9kb3ducmV2LnhtbEyPTU/D MAyG70j8h8hI3FgChXXqmk5oaAduo4DEMWvcj9E4VZNu5d9jxAGOth+9ft58M7tenHAMnScNtwsF AqnytqNGw9vr7mYFIkRD1vSeUMMXBtgUlxe5yaw/0wueytgIDqGQGQ1tjEMmZahadCYs/IDEt9qP zkQex0ba0Zw53PXyTqmldKYj/tCaAbctVp/l5DRM+22tul0yHz+SUk7P6f79qW60vr6aH9cgIs7x D4YffVaHgp0OfiIbRK/hfrniLlFD8pCCYOB3cWBSpSnIIpf/KxTfAAAA//8DAFBLAQItABQABgAI AAAAIQC2gziS/gAAAOEBAAATAAAAAAAAAAAAAAAAAAAAAABbQ29udGVudF9UeXBlc10ueG1sUEsB Ai0AFAAGAAgAAAAhADj9If/WAAAAlAEAAAsAAAAAAAAAAAAAAAAALwEAAF9yZWxzLy5yZWxzUEsB Ai0AFAAGAAgAAAAhAHZczzGvAQAAWAMAAA4AAAAAAAAAAAAAAAAALgIAAGRycy9lMm9Eb2MueG1s UEsBAi0AFAAGAAgAAAAhALDxzezeAAAACgEAAA8AAAAAAAAAAAAAAAAACQQAAGRycy9kb3ducmV2 LnhtbFBLBQYAAAAABAAEAPMAAAAUBQAAAAA= " strokecolor="windowText" strokeweight=".5pt">
+              <ns8:stroke joinstyle="miter"/>
+            </ns8:line>
+          </ns0:pict>
+        </ns1:Fallback>
+      </ns1:AlternateContent>
+    </ns0:r>
+    <ns0:r>
+      <ns0:rPr>
+        <ns0:noProof/>
+      </ns0:rPr>
+      <ns1:AlternateContent>
+        <ns1:Choice Requires="wps">
+          <ns0:drawing>
+            <ns3:anchor distT="0" distB="0" distL="114300" distR="114300" simplePos="0" relativeHeight="251652096" behindDoc="0" locked="0" layoutInCell="1" allowOverlap="1" ns4:anchorId="350D279F" ns4:editId="54B5E171">
+              <ns3:simplePos x="0" y="0"/>
+              <ns3:positionH relativeFrom="column">
+                <ns3:posOffset>228600</ns3:posOffset>
+              </ns3:positionH>
+              <ns3:positionV relativeFrom="paragraph">
+                <ns3:posOffset>112395</ns3:posOffset>
+              </ns3:positionV>
+              <ns3:extent cx="6400800" cy="0"/>
+              <ns3:effectExtent l="0" t="0" r="25400" b="25400"/>
+              <ns3:wrapNone/>
+              <ns3:docPr id="217511060" name="Conector recto 217511060"/>
+              <ns3:cNvGraphicFramePr/>
+              <ns5:graphic>
+                <ns5:graphicData uri="http://schemas.microsoft.com/office/word/2010/wordprocessingShape">
+                  <ns6:wsp>
+                    <ns6:cNvCnPr/>
+                    <ns6:spPr>
+                      <ns5:xfrm>
+                        <ns5:off x="0" y="0"/>
+                        <ns5:ext cx="6400800" cy="0"/>
+                      </ns5:xfrm>
+                      <ns5:prstGeom prst="line">
+                        <ns5:avLst/>
+                      </ns5:prstGeom>
+                      <ns5:noFill/>
+                      <ns5:ln w="6350" cap="flat" cmpd="sng" algn="ctr">
+                        <ns5:solidFill>
+                          <ns5:srgbClr val="5B9BD5"/>
+                        </ns5:solidFill>
+                        <ns5:prstDash val="solid"/>
+                        <ns5:miter lim="800000"/>
+                      </ns5:ln>
+                      <ns5:effectLst/>
+                    </ns6:spPr>
+                    <ns6:bodyPr/>
+                  </ns6:wsp>
+                </ns5:graphicData>
+              </ns5:graphic>
+            </ns3:anchor>
+          </ns0:drawing>
+        </ns1:Choice>
+        <ns1:Fallback>
+          <ns0:pict>
+            <ns8:line ns2:anchorId="256B0012" id="Conector recto 217511060" ns9:spid="_x0000_s1026" style="position:absolute;z-index:251663360;visibility:visible;mso-wrap-style:square;mso-wrap-distance-left:9pt;mso-wrap-distance-top:0;mso-wrap-distance-right:9pt;mso-wrap-distance-bottom:0;mso-position-horizontal:absolute;mso-position-horizontal-relative:text;mso-position-vertical:absolute;mso-position-vertical-relative:text" from="18pt,8.85pt" to="522pt,8.85pt" ns9:gfxdata="UEsDBBQABgAIAAAAIQC2gziS/gAAAOEBAAATAAAAW0NvbnRlbnRfVHlwZXNdLnhtbJSRQU7DMBBF 90jcwfIWJU67QAgl6YK0S0CoHGBkTxKLZGx5TGhvj5O2G0SRWNoz/78nu9wcxkFMGNg6quQqL6RA 0s5Y6ir5vt9lD1JwBDIwOMJKHpHlpr69KfdHjyxSmriSfYz+USnWPY7AufNIadK6MEJMx9ApD/oD OlTrorhX2lFEilmcO2RdNtjC5xDF9pCuTyYBB5bi6bQ4syoJ3g9WQ0ymaiLzg5KdCXlKLjvcW893 SUOqXwnz5DrgnHtJTxOsQfEKIT7DmDSUCaxw7Rqn8787ZsmRM9e2VmPeBN4uqYvTtW7jvijg9N/y JsXecLq0q+WD6m8AAAD//wMAUEsDBBQABgAIAAAAIQA4/SH/1gAAAJQBAAALAAAAX3JlbHMvLnJl bHOkkMFqwzAMhu+DvYPRfXGawxijTi+j0GvpHsDYimMaW0Yy2fr2M4PBMnrbUb/Q94l/f/hMi1qR JVI2sOt6UJgd+ZiDgffL8ekFlFSbvV0oo4EbChzGx4f9GRdb25HMsYhqlCwG5lrLq9biZkxWOiqY 22YiTra2kYMu1l1tQD30/bPm3wwYN0x18gb45AdQl1tp5j/sFB2T0FQ7R0nTNEV3j6o9feQzro1i OWA14Fm+Q8a1a8+Bvu/d/dMb2JY5uiPbhG/ktn4cqGU/er3pcvwCAAD//wMAUEsDBBQABgAIAAAA IQASzCNUqwEAAEUDAAAOAAAAZHJzL2Uyb0RvYy54bWysUk1v2zAMvQ/YfxB0X+x2S9EZcQq0QXsp tgLbfgAjS7YAfYHU4uTfl1LStOtuw3yQKZF65Ht6q5u9d2KnkWwMvbxYtFLooOJgw9jLXz/vP11L QRnCAC4G3cuDJnmz/vhhNadOX8YpukGjYJBA3Zx6OeWcuqYhNWkPtIhJB06aiB4yb3FsBoSZ0b1r Ltv2qpkjDgmj0kR8ujkm5briG6NV/m4M6SxcL3m2XFes67aszXoF3YiQJqtOY8A/TOHBBm56htpA BvEb7V9Q3iqMFE1eqOibaIxVunJgNhftOzY/Jki6cmFxKJ1lov8Hq77t7sITsgxzoo7SExYWe4O+ /Hk+sa9iHc5i6X0Wig+vvrTtdcuaqpdc83oxIeUHHb0oQS+dDYUHdLB7pMzNuPSlpByHeG+dq2/h gpgZ/POyIAM7wjjIHPo09JLCKAW4ka2mMlZEis4O5XbBIRy3dw7FDvi5l7dfbzfL8sLc7Y+y0noD NB3raupoBG8zu9FZ30umxt/ptgsFXVc/nQi8ylWibRwOVcWm7PitatOTr4oZ3u45fuv+9TMAAAD/ /wMAUEsDBBQABgAIAAAAIQAyLg083QAAAAkBAAAPAAAAZHJzL2Rvd25yZXYueG1sTI9BSwMxEIXv gv8hjODNJmptZd1sKYJQQQqtgnrLbsbdxWSyJGm7/nun9KDH+d7jzXvlYvRO7DGmPpCG64kCgdQE 21Or4e316eoeRMqGrHGBUMMPJlhU52elKWw40Ab329wKDqFUGA1dzkMhZWo69CZNwoDE2leI3mQ+ YyttNAcO907eKDWT3vTEHzoz4GOHzfd25zXU6xg/7j7fB7d82aj1mFYhPq+0vrwYlw8gMo75zwzH +lwdKu5Uhx3ZJJyG2xlPyczncxBHXU2nTOoTkVUp/y+ofgEAAP//AwBQSwECLQAUAAYACAAAACEA toM4kv4AAADhAQAAEwAAAAAAAAAAAAAAAAAAAAAAW0NvbnRlbnRfVHlwZXNdLnhtbFBLAQItABQA BgAIAAAAIQA4/SH/1gAAAJQBAAALAAAAAAAAAAAAAAAAAC8BAABfcmVscy8ucmVsc1BLAQItABQA BgAIAAAAIQASzCNUqwEAAEUDAAAOAAAAAAAAAAAAAAAAAC4CAABkcnMvZTJvRG9jLnhtbFBLAQIt ABQABgAIAAAAIQAyLg083QAAAAkBAAAPAAAAAAAAAAAAAAAAAAUEAABkcnMvZG93bnJldi54bWxQ SwUGAAAAAAQABADzAAAADwUAAAAA " strokecolor="#5b9bd5" strokeweight=".5pt">
+              <ns8:stroke joinstyle="miter"/>
+            </ns8:line>
+          </ns0:pict>
+        </ns1:Fallback>
+      </ns1:AlternateContent>
+    </ns0:r>
+  </ns0:p>
+  <ns0:p ns2:paraId="36D66F2B" ns2:textId="77777777" ns0:rsidR="008C47A6" ns0:rsidRDefault="00000000" ns0:rsidP="00E74375">
+    <ns0:r>
+      <ns0:rPr>
+        <ns0:noProof/>
+      </ns0:rPr>
+      <ns1:AlternateContent>
+        <ns1:Choice Requires="wps">
+          <ns0:drawing>
+            <ns3:anchor distT="0" distB="0" distL="114300" distR="114300" simplePos="0" relativeHeight="251664384" behindDoc="0" locked="0" layoutInCell="1" allowOverlap="1" ns4:anchorId="60968E5B" ns4:editId="0AE01EE4">
+              <ns3:simplePos x="0" y="0"/>
+              <ns3:positionH relativeFrom="page">
+                <ns3:posOffset>5890716</ns3:posOffset>
+              </ns3:positionH>
+              <ns3:positionV relativeFrom="page">
+                <ns3:posOffset>10161905</ns3:posOffset>
+              </ns3:positionV>
+              <ns3:extent cx="1047115" cy="313690"/>
+              <ns3:effectExtent l="0" t="0" r="0" b="0"/>
+              <ns3:wrapThrough wrapText="bothSides">
+                <ns3:wrapPolygon edited="0">
+                  <ns3:start x="786" y="0"/>
+                  <ns3:lineTo x="786" y="19676"/>
+                  <ns3:lineTo x="20434" y="19676"/>
+                  <ns3:lineTo x="20434" y="0"/>
+                  <ns3:lineTo x="786" y="0"/>
+                </ns3:wrapPolygon>
+              </ns3:wrapThrough>
+              <ns3:docPr id="34" name="Text Box 10"/>
+              <ns3:cNvGraphicFramePr>
+                <ns5:graphicFrameLocks/>
+              </ns3:cNvGraphicFramePr>
+              <ns5:graphic>
+                <ns5:graphicData uri="http://schemas.microsoft.com/office/word/2010/wordprocessingShape">
+                  <ns6:wsp>
+                    <ns6:cNvSpPr txBox="1">
+                      <ns5:spLocks/>
+                    </ns6:cNvSpPr>
+                    <ns6:spPr>
+                      <ns5:xfrm>
+                        <ns5:off x="0" y="0"/>
+                        <ns5:ext cx="1047115" cy="313690"/>
+                      </ns5:xfrm>
+                      <ns5:prstGeom prst="rect">
+                        <ns5:avLst/>
+                      </ns5:prstGeom>
+                      <ns5:noFill/>
+                      <ns5:ln>
+                        <ns5:noFill/>
+                      </ns5:ln>
+                      <ns5:effectLst/>
+                      <ns5:extLst>
+                        <ns5:ext uri="{C572A759-6A51-4108-AA02-DFA0A04FC94B}">
+                          <ns7:wrappingTextBoxFlag/>
+                        </ns5:ext>
+                      </ns5:extLst>
+                    </ns6:spPr>
+                    <ns6:txbx>
+                      <ns0:txbxContent>
+                        <ns0:p ns2:paraId="1A04D46D" ns2:textId="77777777" ns0:rsidR="008C47A6" ns0:rsidRPr="00C954D2" ns0:rsidRDefault="00000000" ns0:rsidP="001E1BF6">
+                          <ns0:pPr>
+                            <ns0:jc ns0:val="right"/>
+                            <ns0:rPr>
+                              <ns0:i/>
+                              <ns0:color ns0:val="0070C0"/>
+                              <ns0:sz ns0:val="14"/>
+                              <ns0:szCs ns0:val="14"/>
+                            </ns0:rPr>
+                          </ns0:pPr>
+                          <ns0:r ns0:rsidRPr="00C954D2">
+                            <ns0:rPr>
+                              <ns0:i/>
+                              <ns0:color ns0:val="0070C0"/>
+                              <ns0:sz ns0:val="14"/>
+                              <ns0:szCs ns0:val="14"/>
+                            </ns0:rPr>
+                            <ns0:t xml:space="preserve">Página </ns0:t>
+                          </ns0:r>
+                          <ns0:r ns0:rsidRPr="00C954D2">
+                            <ns0:rPr>
+                              <ns0:i/>
+                              <ns0:color ns0:val="0070C0"/>
+                              <ns0:sz ns0:val="14"/>
+                              <ns0:szCs ns0:val="14"/>
+                            </ns0:rPr>
+                            <ns0:fldChar ns0:fldCharType="begin"/>
+                          </ns0:r>
+                          <ns0:r ns0:rsidRPr="00C954D2">
+                            <ns0:rPr>
+                              <ns0:i/>
+                              <ns0:color ns0:val="0070C0"/>
+                              <ns0:sz ns0:val="14"/>
+                              <ns0:szCs ns0:val="14"/>
+                            </ns0:rPr>
+                            <ns0:instrText>PAGE   \* MERGEFORMAT</ns0:instrText>
+                          </ns0:r>
+                          <ns0:r ns0:rsidRPr="00C954D2">
+                            <ns0:rPr>
+                              <ns0:i/>
+                              <ns0:color ns0:val="0070C0"/>
+                              <ns0:sz ns0:val="14"/>
+                              <ns0:szCs ns0:val="14"/>
+                            </ns0:rPr>
+                            <ns0:fldChar ns0:fldCharType="separate"/>
+                          </ns0:r>
+                          <ns0:r ns0:rsidRPr="00C954D2">
+                            <ns0:rPr>
+                              <ns0:i/>
+                              <ns0:noProof/>
+                              <ns0:color ns0:val="0070C0"/>
+                              <ns0:sz ns0:val="14"/>
+                              <ns0:szCs ns0:val="14"/>
+                            </ns0:rPr>
+                            <ns0:t>19</ns0:t>
+                          </ns0:r>
+                          <ns0:r ns0:rsidRPr="00C954D2">
+                            <ns0:rPr>
+                              <ns0:i/>
+                              <ns0:color ns0:val="0070C0"/>
+                              <ns0:sz ns0:val="14"/>
+                              <ns0:szCs ns0:val="14"/>
+                            </ns0:rPr>
+                            <ns0:fldChar ns0:fldCharType="end"/>
+                          </ns0:r>
+                        </ns0:p>
+                        <ns0:p ns2:paraId="4656104C" ns2:textId="77777777" ns0:rsidR="008C47A6" ns0:rsidRPr="00C954D2" ns0:rsidRDefault="00000000" ns0:rsidP="001E1BF6">
+                          <ns0:pPr>
+                            <ns0:jc ns0:val="right"/>
+                            <ns0:rPr>
+                              <ns0:i/>
+                              <ns0:color ns0:val="0070C0"/>
+                              <ns0:sz ns0:val="14"/>
+                              <ns0:szCs ns0:val="14"/>
+                            </ns0:rPr>
+                          </ns0:pPr>
+                          <ns0:r ns0:rsidRPr="00C954D2">
+                            <ns0:rPr>
+                              <ns0:i/>
+                              <ns0:color ns0:val="0070C0"/>
+                              <ns0:sz ns0:val="14"/>
+                              <ns0:szCs ns0:val="14"/>
+                            </ns0:rPr>
+                            <ns0:t>5</ns0:t>
+                          </ns0:r>
+                          <ns0:r>
+                            <ns0:rPr>
+                              <ns0:i/>
+                              <ns0:color ns0:val="0070C0"/>
+                              <ns0:sz ns0:val="14"/>
+                              <ns0:szCs ns0:val="14"/>
+                            </ns0:rPr>
+                            <ns0:t>35.2.1</ns0:t>
+                          </ns0:r>
+                        </ns0:p>
+                      </ns0:txbxContent>
+                    </ns6:txbx>
+                    <ns6:bodyPr rot="0" spcFirstLastPara="0" vertOverflow="overflow" horzOverflow="overflow" vert="horz" wrap="square" lIns="91440" tIns="45720" rIns="91440" bIns="45720" numCol="1" spcCol="0" rtlCol="0" fromWordArt="0" anchor="ctr" anchorCtr="0" forceAA="0" compatLnSpc="1">
+                      <ns5:prstTxWarp prst="textNoShape">
+                        <ns5:avLst/>
+                      </ns5:prstTxWarp>
+                      <ns5:noAutofit/>
+                    </ns6:bodyPr>
+                  </ns6:wsp>
+                </ns5:graphicData>
+              </ns5:graphic>
+              <ns4:sizeRelH relativeFrom="margin">
+                <ns4:pctWidth>0</ns4:pctWidth>
+              </ns4:sizeRelH>
+              <ns4:sizeRelV relativeFrom="margin">
+                <ns4:pctHeight>0</ns4:pctHeight>
+              </ns4:sizeRelV>
+            </ns3:anchor>
+          </ns0:drawing>
+        </ns1:Choice>
+        <ns1:Fallback>
+          <ns0:pict>
+            <ns8:shape ns2:anchorId="60968E5B" id="_x0000_s1030" type="#_x0000_t202" style="position:absolute;left:0;text-align:left;margin-left:463.85pt;margin-top:800.15pt;width:82.45pt;height:24.7pt;z-index:251664384;visibility:visible;mso-wrap-style:square;mso-width-percent:0;mso-height-percent:0;mso-wrap-distance-left:9pt;mso-wrap-distance-top:0;mso-wrap-distance-right:9pt;mso-wrap-distance-bottom:0;mso-position-horizontal:absolute;mso-position-horizontal-relative:page;mso-position-vertical:absolute;mso-position-vertical-relative:page;mso-width-percent:0;mso-height-percent:0;mso-width-relative:margin;mso-height-relative:margin;v-text-anchor:middle" ns9:gfxdata="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" filled="f" stroked="f">
+              <ns8:textbox>
+                <ns0:txbxContent>
+                  <ns0:p ns2:paraId="1A04D46D" ns2:textId="77777777" ns0:rsidR="008C47A6" ns0:rsidRPr="00C954D2" ns0:rsidRDefault="00000000" ns0:rsidP="001E1BF6">
+                    <ns0:pPr>
+                      <ns0:jc ns0:val="right"/>
+                      <ns0:rPr>
+                        <ns0:i/>
+                        <ns0:color ns0:val="0070C0"/>
+                        <ns0:sz ns0:val="14"/>
+                        <ns0:szCs ns0:val="14"/>
+                      </ns0:rPr>
+                    </ns0:pPr>
+                    <ns0:r ns0:rsidRPr="00C954D2">
+                      <ns0:rPr>
+                        <ns0:i/>
+                        <ns0:color ns0:val="0070C0"/>
+                        <ns0:sz ns0:val="14"/>
+                        <ns0:szCs ns0:val="14"/>
+                      </ns0:rPr>
+                      <ns0:t xml:space="preserve">Página </ns0:t>
+                    </ns0:r>
+                    <ns0:r ns0:rsidRPr="00C954D2">
+                      <ns0:rPr>
+                        <ns0:i/>
+                        <ns0:color ns0:val="0070C0"/>
+                        <ns0:sz ns0:val="14"/>
+                        <ns0:szCs ns0:val="14"/>
+                      </ns0:rPr>
+                      <ns0:fldChar ns0:fldCharType="begin"/>
+                    </ns0:r>
+                    <ns0:r ns0:rsidRPr="00C954D2">
+                      <ns0:rPr>
+                        <ns0:i/>
+                        <ns0:color ns0:val="0070C0"/>
+                        <ns0:sz ns0:val="14"/>
+                        <ns0:szCs ns0:val="14"/>
+                      </ns0:rPr>
+                      <ns0:instrText>PAGE   \* MERGEFORMAT</ns0:instrText>
+                    </ns0:r>
+                    <ns0:r ns0:rsidRPr="00C954D2">
+                      <ns0:rPr>
+                        <ns0:i/>
+                        <ns0:color ns0:val="0070C0"/>
+                        <ns0:sz ns0:val="14"/>
+                        <ns0:szCs ns0:val="14"/>
+                      </ns0:rPr>
+                      <ns0:fldChar ns0:fldCharType="separate"/>
+                    </ns0:r>
+                    <ns0:r ns0:rsidRPr="00C954D2">
+                      <ns0:rPr>
+                        <ns0:i/>
+                        <ns0:noProof/>
+                        <ns0:color ns0:val="0070C0"/>
+                        <ns0:sz ns0:val="14"/>
+                        <ns0:szCs ns0:val="14"/>
+                      </ns0:rPr>
+                      <ns0:t>19</ns0:t>
+                    </ns0:r>
+                    <ns0:r ns0:rsidRPr="00C954D2">
+                      <ns0:rPr>
+                        <ns0:i/>
+                        <ns0:color ns0:val="0070C0"/>
+                        <ns0:sz ns0:val="14"/>
+                        <ns0:szCs ns0:val="14"/>
+                      </ns0:rPr>
+                      <ns0:fldChar ns0:fldCharType="end"/>
+                    </ns0:r>
+                  </ns0:p>
+                  <ns0:p ns2:paraId="4656104C" ns2:textId="77777777" ns0:rsidR="008C47A6" ns0:rsidRPr="00C954D2" ns0:rsidRDefault="00000000" ns0:rsidP="001E1BF6">
+                    <ns0:pPr>
+                      <ns0:jc ns0:val="right"/>
+                      <ns0:rPr>
+                        <ns0:i/>
+                        <ns0:color ns0:val="0070C0"/>
+                        <ns0:sz ns0:val="14"/>
+                        <ns0:szCs ns0:val="14"/>
+                      </ns0:rPr>
+                    </ns0:pPr>
+                    <ns0:r ns0:rsidRPr="00C954D2">
+                      <ns0:rPr>
+                        <ns0:i/>
+                        <ns0:color ns0:val="0070C0"/>
+                        <ns0:sz ns0:val="14"/>
+                        <ns0:szCs ns0:val="14"/>
+                      </ns0:rPr>
+                      <ns0:t>5</ns0:t>
+                    </ns0:r>
+                    <ns0:r>
+                      <ns0:rPr>
+                        <ns0:i/>
+                        <ns0:color ns0:val="0070C0"/>
+                        <ns0:sz ns0:val="14"/>
+                        <ns0:szCs ns0:val="14"/>
+                      </ns0:rPr>
+                      <ns0:t>35.2.1</ns0:t>
+                    </ns0:r>
+                  </ns0:p>
+                </ns0:txbxContent>
+              </ns8:textbox>
+              <ns10:wrap type="through" anchorx="page" anchory="page"/>
+            </ns8:shape>
+          </ns0:pict>
+        </ns1:Fallback>
+      </ns1:AlternateContent>
+    </ns0:r>
+    <ns0:r>
+      <ns0:rPr>
+        <ns0:noProof/>
+      </ns0:rPr>
+      <ns1:AlternateContent>
+        <ns1:Choice Requires="wps">
+          <ns0:drawing>
+            <ns3:anchor distT="0" distB="0" distL="114300" distR="114300" simplePos="0" relativeHeight="251658240" behindDoc="0" locked="0" layoutInCell="1" allowOverlap="1" ns4:anchorId="530DBE89" ns4:editId="51535FF7">
+              <ns3:simplePos x="0" y="0"/>
+              <ns3:positionH relativeFrom="column">
+                <ns3:posOffset>1562100</ns3:posOffset>
+              </ns3:positionH>
+              <ns3:positionV relativeFrom="paragraph">
+                <ns3:posOffset>51435</ns3:posOffset>
+              </ns3:positionV>
+              <ns3:extent cx="0" cy="457200"/>
+              <ns3:effectExtent l="0" t="0" r="38100" b="19050"/>
+              <ns3:wrapNone/>
+              <ns3:docPr id="30" name="Conector recto 30"/>
+              <ns3:cNvGraphicFramePr/>
+              <ns5:graphic>
+                <ns5:graphicData uri="http://schemas.microsoft.com/office/word/2010/wordprocessingShape">
+                  <ns6:wsp>
+                    <ns6:cNvCnPr/>
+                    <ns6:spPr>
+                      <ns5:xfrm>
+                        <ns5:off x="0" y="0"/>
+                        <ns5:ext cx="0" cy="457200"/>
+                      </ns5:xfrm>
+                      <ns5:prstGeom prst="line">
+                        <ns5:avLst/>
+                      </ns5:prstGeom>
+                      <ns5:noFill/>
+                      <ns5:ln w="6350" cap="flat" cmpd="sng" algn="ctr">
+                        <ns5:solidFill>
+                          <ns5:sysClr val="windowText" lastClr="000000"/>
+                        </ns5:solidFill>
+                        <ns5:prstDash val="solid"/>
+                        <ns5:miter lim="800000"/>
+                      </ns5:ln>
+                      <ns5:effectLst/>
+                    </ns6:spPr>
+                    <ns6:bodyPr/>
+                  </ns6:wsp>
+                </ns5:graphicData>
+              </ns5:graphic>
+            </ns3:anchor>
+          </ns0:drawing>
+        </ns1:Choice>
+        <ns1:Fallback>
+          <ns0:pict>
+            <ns8:line ns2:anchorId="29C75443" id="Conector recto 30" ns9:spid="_x0000_s1026" style="position:absolute;z-index:251666432;visibility:visible;mso-wrap-style:square;mso-wrap-distance-left:9pt;mso-wrap-distance-top:0;mso-wrap-distance-right:9pt;mso-wrap-distance-bottom:0;mso-position-horizontal:absolute;mso-position-horizontal-relative:text;mso-position-vertical:absolute;mso-position-vertical-relative:text" from="123pt,4.05pt" to="123pt,40.05pt" ns9:gfxdata="UEsDBBQABgAIAAAAIQC2gziS/gAAAOEBAAATAAAAW0NvbnRlbnRfVHlwZXNdLnhtbJSRQU7DMBBF 90jcwfIWJU67QAgl6YK0S0CoHGBkTxKLZGx5TGhvj5O2G0SRWNoz/78nu9wcxkFMGNg6quQqL6RA 0s5Y6ir5vt9lD1JwBDIwOMJKHpHlpr69KfdHjyxSmriSfYz+USnWPY7AufNIadK6MEJMx9ApD/oD OlTrorhX2lFEilmcO2RdNtjC5xDF9pCuTyYBB5bi6bQ4syoJ3g9WQ0ymaiLzg5KdCXlKLjvcW893 SUOqXwnz5DrgnHtJTxOsQfEKIT7DmDSUCaxw7Rqn8787ZsmRM9e2VmPeBN4uqYvTtW7jvijg9N/y JsXecLq0q+WD6m8AAAD//wMAUEsDBBQABgAIAAAAIQA4/SH/1gAAAJQBAAALAAAAX3JlbHMvLnJl bHOkkMFqwzAMhu+DvYPRfXGawxijTi+j0GvpHsDYimMaW0Yy2fr2M4PBMnrbUb/Q94l/f/hMi1qR JVI2sOt6UJgd+ZiDgffL8ekFlFSbvV0oo4EbChzGx4f9GRdb25HMsYhqlCwG5lrLq9biZkxWOiqY 22YiTra2kYMu1l1tQD30/bPm3wwYN0x18gb45AdQl1tp5j/sFB2T0FQ7R0nTNEV3j6o9feQzro1i OWA14Fm+Q8a1a8+Bvu/d/dMb2JY5uiPbhG/ktn4cqGU/er3pcvwCAAD//wMAUEsDBBQABgAIAAAA IQB2XM8xrwEAAFgDAAAOAAAAZHJzL2Uyb0RvYy54bWysU01vEzEQvSPxHyzfidNCS7WK00OjckFQ ifIDpv7YteQveUw2+feMvSENcEPswWvPeN7Oe/N2c38Inu1NQZei5FerNWcmqqRdHCX//vz47o4z rBA1+BSN5EeD/H779s1mzoO5TlPy2hRGIBGHOUs+1ZoHIVBNJgCuUjaRkjaVAJWOZRS6wEzowYvr 9fpWzKnoXJIyiBTdLUm+7fjWGlW/WoumMi859Vb7Wvr60lax3cAwFsiTU6c24B+6COAiffQMtYMK 7Edxf0EFp0rCZOtKpSCStU6ZzoHYXK3/YPNtgmw6FxIH81km/H+w6sv+IT4VkmHOOGB+Ko3FwZbQ 3tQfO3SxjmexzKEytQQVRT/cfKQ5NB3Fa10uWD+ZFFjbSO5dbDRggP1nrMvVX1daOKZH530fhY9s lvz2/Q0NSwEZwnqotA1ZS45x5Az8SE5TtXRETN7pVt1w8IgPvrA90LDJIzrNz9QtZx6wUoIo9OfU 7G+lrZ0d4LQU99TijeAqGdS7IPndZbWP7YumW+xE6lXBtntJ+tiFFe1E4+sKnazW/HF5pv3lD7H9 CQAA//8DAFBLAwQUAAYACAAAACEA3Ghnn9wAAAAIAQAADwAAAGRycy9kb3ducmV2LnhtbEyPy07D MBBF90j9B2sqsaN2WlSqEKeqWnXBrgSQWLrx5AHxOIqdNvw9g1jA8uiO7pybbSfXiQsOofWkIVko EEilty3VGl5fjncbECEasqbzhBq+MMA2n91kJrX+Ss94KWItuIRCajQ0MfaplKFs0Jmw8D0SZ5Uf nImMQy3tYK5c7jq5VGotnWmJPzSmx32D5WcxOg3jaV+p9riaPt5XhRyfHk5vh6rW+nY+7R5BRJzi 3zH86LM65Ox09iPZIDoNy/s1b4kaNgkIzn/5zKwSkHkm/w/IvwEAAP//AwBQSwECLQAUAAYACAAA ACEAtoM4kv4AAADhAQAAEwAAAAAAAAAAAAAAAAAAAAAAW0NvbnRlbnRfVHlwZXNdLnhtbFBLAQIt ABQABgAIAAAAIQA4/SH/1gAAAJQBAAALAAAAAAAAAAAAAAAAAC8BAABfcmVscy8ucmVsc1BLAQIt ABQABgAIAAAAIQB2XM8xrwEAAFgDAAAOAAAAAAAAAAAAAAAAAC4CAABkcnMvZTJvRG9jLnhtbFBL AQItABQABgAIAAAAIQDcaGef3AAAAAgBAAAPAAAAAAAAAAAAAAAAAAkEAABkcnMvZG93bnJldi54 bWxQSwUGAAAAAAQABADzAAAAEgUAAAAA " strokecolor="windowText" strokeweight=".5pt">
+              <ns8:stroke joinstyle="miter"/>
+            </ns8:line>
+          </ns0:pict>
+        </ns1:Fallback>
+      </ns1:AlternateContent>
+    </ns0:r>
+    <ns0:r>
+      <ns0:rPr>
+        <ns0:noProof/>
+      </ns0:rPr>
+      <ns1:AlternateContent>
+        <ns1:Choice Requires="wps">
+          <ns0:drawing>
+            <ns3:anchor distT="0" distB="0" distL="114300" distR="114300" simplePos="0" relativeHeight="251654144" behindDoc="0" locked="0" layoutInCell="1" allowOverlap="1" ns4:anchorId="06956A8A" ns4:editId="2D24E183">
+              <ns3:simplePos x="0" y="0"/>
+              <ns3:positionH relativeFrom="column">
+                <ns3:posOffset>304800</ns3:posOffset>
+              </ns3:positionH>
+              <ns3:positionV relativeFrom="paragraph">
+                <ns3:posOffset>51435</ns3:posOffset>
+              </ns3:positionV>
+              <ns3:extent cx="0" cy="457200"/>
+              <ns3:effectExtent l="0" t="0" r="38100" b="19050"/>
+              <ns3:wrapNone/>
+              <ns3:docPr id="31" name="Conector recto 31"/>
+              <ns3:cNvGraphicFramePr/>
+              <ns5:graphic>
+                <ns5:graphicData uri="http://schemas.microsoft.com/office/word/2010/wordprocessingShape">
+                  <ns6:wsp>
+                    <ns6:cNvCnPr/>
+                    <ns6:spPr>
+                      <ns5:xfrm>
+                        <ns5:off x="0" y="0"/>
+                        <ns5:ext cx="0" cy="457200"/>
+                      </ns5:xfrm>
+                      <ns5:prstGeom prst="line">
+                        <ns5:avLst/>
+                      </ns5:prstGeom>
+                      <ns5:noFill/>
+                      <ns5:ln w="6350" cap="flat" cmpd="sng" algn="ctr">
+                        <ns5:solidFill>
+                          <ns5:sysClr val="windowText" lastClr="000000"/>
+                        </ns5:solidFill>
+                        <ns5:prstDash val="solid"/>
+                        <ns5:miter lim="800000"/>
+                      </ns5:ln>
+                      <ns5:effectLst/>
+                    </ns6:spPr>
+                    <ns6:bodyPr/>
+                  </ns6:wsp>
+                </ns5:graphicData>
+              </ns5:graphic>
+            </ns3:anchor>
+          </ns0:drawing>
+        </ns1:Choice>
+        <ns1:Fallback>
+          <ns0:pict>
+            <ns8:line ns2:anchorId="26AC4FCA" id="Conector recto 31" ns9:spid="_x0000_s1026" style="position:absolute;z-index:251664384;visibility:visible;mso-wrap-style:square;mso-wrap-distance-left:9pt;mso-wrap-distance-top:0;mso-wrap-distance-right:9pt;mso-wrap-distance-bottom:0;mso-position-horizontal:absolute;mso-position-horizontal-relative:text;mso-position-vertical:absolute;mso-position-vertical-relative:text" from="24pt,4.05pt" to="24pt,40.05pt" ns9:gfxdata="UEsDBBQABgAIAAAAIQC2gziS/gAAAOEBAAATAAAAW0NvbnRlbnRfVHlwZXNdLnhtbJSRQU7DMBBF 90jcwfIWJU67QAgl6YK0S0CoHGBkTxKLZGx5TGhvj5O2G0SRWNoz/78nu9wcxkFMGNg6quQqL6RA 0s5Y6ir5vt9lD1JwBDIwOMJKHpHlpr69KfdHjyxSmriSfYz+USnWPY7AufNIadK6MEJMx9ApD/oD OlTrorhX2lFEilmcO2RdNtjC5xDF9pCuTyYBB5bi6bQ4syoJ3g9WQ0ymaiLzg5KdCXlKLjvcW893 SUOqXwnz5DrgnHtJTxOsQfEKIT7DmDSUCaxw7Rqn8787ZsmRM9e2VmPeBN4uqYvTtW7jvijg9N/y JsXecLq0q+WD6m8AAAD//wMAUEsDBBQABgAIAAAAIQA4/SH/1gAAAJQBAAALAAAAX3JlbHMvLnJl bHOkkMFqwzAMhu+DvYPRfXGawxijTi+j0GvpHsDYimMaW0Yy2fr2M4PBMnrbUb/Q94l/f/hMi1qR JVI2sOt6UJgd+ZiDgffL8ekFlFSbvV0oo4EbChzGx4f9GRdb25HMsYhqlCwG5lrLq9biZkxWOiqY 22YiTra2kYMu1l1tQD30/bPm3wwYN0x18gb45AdQl1tp5j/sFB2T0FQ7R0nTNEV3j6o9feQzro1i OWA14Fm+Q8a1a8+Bvu/d/dMb2JY5uiPbhG/ktn4cqGU/er3pcvwCAAD//wMAUEsDBBQABgAIAAAA IQB2XM8xrwEAAFgDAAAOAAAAZHJzL2Uyb0RvYy54bWysU01vEzEQvSPxHyzfidNCS7WK00OjckFQ ifIDpv7YteQveUw2+feMvSENcEPswWvPeN7Oe/N2c38Inu1NQZei5FerNWcmqqRdHCX//vz47o4z rBA1+BSN5EeD/H779s1mzoO5TlPy2hRGIBGHOUs+1ZoHIVBNJgCuUjaRkjaVAJWOZRS6wEzowYvr 9fpWzKnoXJIyiBTdLUm+7fjWGlW/WoumMi859Vb7Wvr60lax3cAwFsiTU6c24B+6COAiffQMtYMK 7Edxf0EFp0rCZOtKpSCStU6ZzoHYXK3/YPNtgmw6FxIH81km/H+w6sv+IT4VkmHOOGB+Ko3FwZbQ 3tQfO3SxjmexzKEytQQVRT/cfKQ5NB3Fa10uWD+ZFFjbSO5dbDRggP1nrMvVX1daOKZH530fhY9s lvz2/Q0NSwEZwnqotA1ZS45x5Az8SE5TtXRETN7pVt1w8IgPvrA90LDJIzrNz9QtZx6wUoIo9OfU 7G+lrZ0d4LQU99TijeAqGdS7IPndZbWP7YumW+xE6lXBtntJ+tiFFe1E4+sKnazW/HF5pv3lD7H9 CQAA//8DAFBLAwQUAAYACAAAACEAHxfvLNoAAAAGAQAADwAAAGRycy9kb3ducmV2LnhtbEyPy07D MBBF90j9B2sqsaN2WgRRiFNVRV2wKwEklm48eUA8jmKnDX/PwAaWR3d075l8O7tenHEMnScNyUqB QKq87ajR8PpyuElBhGjImt4TavjCANticZWbzPoLPeO5jI3gEgqZ0dDGOGRShqpFZ8LKD0ic1X50 JjKOjbSjuXC56+VaqTvpTEe80JoB9y1Wn+XkNEzHfa26w2b+eN+Ucnq6P7491o3W18t59wAi4hz/ juFHn9WhYKeTn8gG0Wu4TfmVqCFNQHD8iydGlYAscvlfv/gGAAD//wMAUEsBAi0AFAAGAAgAAAAh ALaDOJL+AAAA4QEAABMAAAAAAAAAAAAAAAAAAAAAAFtDb250ZW50X1R5cGVzXS54bWxQSwECLQAU AAYACAAAACEAOP0h/9YAAACUAQAACwAAAAAAAAAAAAAAAAAvAQAAX3JlbHMvLnJlbHNQSwECLQAU AAYACAAAACEAdlzPMa8BAABYAwAADgAAAAAAAAAAAAAAAAAuAgAAZHJzL2Uyb0RvYy54bWxQSwEC LQAUAAYACAAAACEAHxfvLNoAAAAGAQAADwAAAAAAAAAAAAAAAAAJBAAAZHJzL2Rvd25yZXYueG1s UEsFBgAAAAAEAAQA8wAAABAFAAAAAA== " strokecolor="windowText" strokeweight=".5pt">
+              <ns8:stroke joinstyle="miter"/>
+            </ns8:line>
+          </ns0:pict>
+        </ns1:Fallback>
+      </ns1:AlternateContent>
+    </ns0:r>
+  </ns0:p>
+</ns0:ftr>
 </file>
 
 <file path=word/footer2.xml><?xml version="1.0" encoding="utf-8"?>
-<w:ftr xmlns:wpc="http://schemas.microsoft.com/office/word/2010/wordprocessingCanvas" xmlns:cx="http://schemas.microsoft.com/office/drawing/2014/chartex" xmlns:cx1="http://schemas.microsoft.com/office/drawing/2015/9/8/chartex" xmlns:cx2="http://schemas.microsoft.com/office/drawing/2015/10/21/chartex" xmlns:cx3="http://schemas.microsoft.com/office/drawing/2016/5/9/chartex" xmlns:cx4="http://schemas.microsoft.com/office/drawing/2016/5/10/chartex" xmlns:cx5="http://schemas.microsoft.com/office/drawing/2016/5/11/chartex" xmlns:cx6="http://schemas.microsoft.com/office/drawing/2016/5/12/chartex" xmlns:cx7="http://schemas.microsoft.com/office/drawing/2016/5/13/chartex" xmlns:cx8="http://schemas.microsoft.com/office/drawing/2016/5/14/chartex" xmlns:mc="http://schemas.openxmlformats.org/markup-compatibility/2006" xmlns:aink="http://schemas.microsoft.com/office/drawing/2016/ink" xmlns:am3d="http://schemas.microsoft.com/office/drawing/2017/model3d" xmlns:o="urn:schemas-microsoft-com:office:office" xmlns:oel="http://schemas.microsoft.com/office/2019/extlst" xmlns:r="http://schemas.openxmlformats.org/officeDocument/2006/relationships" xmlns:m="http://schemas.openxmlformats.org/officeDocument/2006/math" xmlns:v="urn:schemas-microsoft-com:vml" xmlns:wp14="http://schemas.microsoft.com/office/word/2010/wordprocessingDrawing" xmlns:wp="http://schemas.openxmlformats.org/drawingml/2006/wordprocessingDrawing" xmlns:w10="urn:schemas-microsoft-com:office:word" xmlns:w="http://schemas.openxmlformats.org/wordprocessingml/2006/main" xmlns:w14="http://schemas.microsoft.com/office/word/2010/wordml" xmlns:w15="http://schemas.microsoft.com/office/word/2012/wordml" xmlns:w16cex="http://schemas.microsoft.com/office/word/2018/wordml/cex" xmlns:w16cid="http://schemas.microsoft.com/office/word/2016/wordml/cid" xmlns:w16="http://schemas.microsoft.com/office/word/2018/wordml" xmlns:w16du="http://schemas.microsoft.com/office/word/2023/wordml/word16du" xmlns:w16sdtdh="http://schemas.microsoft.com/office/word/2020/wordml/sdtdatahash" xmlns:w16sdtfl="http://schemas.microsoft.com/office/word/2024/wordml/sdtformatlock" xmlns:w16se="http://schemas.microsoft.com/office/word/2015/wordml/symex" xmlns:wpg="http://schemas.microsoft.com/office/word/2010/wordprocessingGroup" xmlns:wpi="http://schemas.microsoft.com/office/word/2010/wordprocessingInk" xmlns:wne="http://schemas.microsoft.com/office/word/2006/wordml" xmlns:wps="http://schemas.microsoft.com/office/word/2010/wordprocessingShape" mc:Ignorable="w14 w15 w16se w16cid w16 w16cex w16sdtdh w16sdtfl w16du wp14">
-  <w:p>
-    <w:r>
-      <w:rPr>
-        <w:noProof/>
-      </w:rPr>
-      <mc:AlternateContent>
-        <mc:Choice Requires="wps">
-          <w:drawing>
-            <wp:anchor distT="0" distB="0" distL="114300" distR="114300" simplePos="0" relativeHeight="251661312" behindDoc="0" locked="0" layoutInCell="1" allowOverlap="1" wp14:anchorId="32FBE6F8" wp14:editId="03361862">
-              <wp:simplePos x="0" y="0"/>
-              <wp:positionH relativeFrom="page">
-                <wp:posOffset>4058285</wp:posOffset>
-              </wp:positionH>
-              <wp:positionV relativeFrom="page">
-                <wp:posOffset>10132695</wp:posOffset>
-              </wp:positionV>
-              <wp:extent cx="1714500" cy="342900"/>
-              <wp:effectExtent l="0" t="0" r="0" b="0"/>
-              <wp:wrapThrough wrapText="bothSides">
-                <wp:wrapPolygon edited="0">
-                  <wp:start x="480" y="0"/>
-                  <wp:lineTo x="480" y="20400"/>
-                  <wp:lineTo x="20880" y="20400"/>
-                  <wp:lineTo x="20880" y="0"/>
-                  <wp:lineTo x="480" y="0"/>
-                </wp:wrapPolygon>
-              </wp:wrapThrough>
-              <wp:docPr id="1001260262" name="Text Box 10"/>
-              <wp:cNvGraphicFramePr>
-                <a:graphicFrameLocks xmlns:a="http://schemas.openxmlformats.org/drawingml/2006/main"/>
-              </wp:cNvGraphicFramePr>
-              <a:graphic xmlns:a="http://schemas.openxmlformats.org/drawingml/2006/main">
-                <a:graphicData uri="http://schemas.microsoft.com/office/word/2010/wordprocessingShape">
-                  <wps:wsp>
-                    <wps:cNvSpPr txBox="1">
-                      <a:spLocks/>
-                    </wps:cNvSpPr>
-                    <wps:spPr>
-                      <a:xfrm>
-                        <a:off x="0" y="0"/>
-                        <a:ext cx="1714500" cy="342900"/>
-                      </a:xfrm>
-                      <a:prstGeom prst="rect">
-                        <a:avLst/>
-                      </a:prstGeom>
-                      <a:noFill/>
-                      <a:ln>
-                        <a:noFill/>
-                      </a:ln>
-                      <a:effectLst/>
-                      <a:extLst>
-                        <a:ext uri="{C572A759-6A51-4108-AA02-DFA0A04FC94B}">
-                          <ma14:wrappingTextBoxFlag xmlns:ma14="http://schemas.microsoft.com/office/mac/drawingml/2011/main" xmlns:w="http://schemas.openxmlformats.org/wordprocessingml/2006/main" xmlns:w10="urn:schemas-microsoft-com:office:word" xmlns:v="urn:schemas-microsoft-com:vml" xmlns:o="urn:schemas-microsoft-com:office:office" xmlns:mv="urn:schemas-microsoft-com:mac:vml" xmlns:mo="http://schemas.microsoft.com/office/mac/office/2008/main" xmlns=""/>
-                        </a:ext>
-                      </a:extLst>
-                    </wps:spPr>
-                    <wps:txbx>
-                      <w:txbxContent>
-                        <w:p>
-                          <w:pPr>
-                            <w:rPr>
-                              <w:sz w:val="14"/>
-                              <w:szCs w:val="14"/>
-                              <w:lang w:val="es-ES_tradnl"/>
-                            </w:rPr>
-                          </w:pPr>
-                          <w:r>
-                            <w:rPr>
-                              <w:sz w:val="14"/>
-                              <w:szCs w:val="14"/>
-                              <w:lang w:val="es-ES_tradnl"/>
-                            </w:rPr>
-                            <w:t>Avda. de la Aurora, 55, entreplanta</w:t>
-                          </w:r>
-                        </w:p>
-                        <w:p>
-                          <w:pPr>
-                            <w:rPr>
-                              <w:sz w:val="14"/>
-                              <w:szCs w:val="14"/>
-                              <w:lang w:val="es-ES_tradnl"/>
-                            </w:rPr>
-                          </w:pPr>
-                          <w:r>
-                            <w:rPr>
-                              <w:sz w:val="14"/>
-                              <w:szCs w:val="14"/>
-                              <w:lang w:val="es-ES_tradnl"/>
-                            </w:rPr>
-                            <w:t>29006 Málaga (España)</w:t>
-                          </w:r>
-                        </w:p>
-                      </w:txbxContent>
-                    </wps:txbx>
-                    <wps:bodyPr rot="0" spcFirstLastPara="0" vertOverflow="overflow" horzOverflow="overflow" vert="horz" wrap="square" lIns="91440" tIns="45720" rIns="91440" bIns="45720" numCol="1" spcCol="0" rtlCol="0" fromWordArt="0" anchor="t" anchorCtr="0" forceAA="0" compatLnSpc="1">
-                      <a:prstTxWarp prst="textNoShape">
-                        <a:avLst/>
-                      </a:prstTxWarp>
-                      <a:noAutofit/>
-                    </wps:bodyPr>
-                  </wps:wsp>
-                </a:graphicData>
-              </a:graphic>
-              <wp14:sizeRelH relativeFrom="margin">
-                <wp14:pctWidth>0</wp14:pctWidth>
-              </wp14:sizeRelH>
-              <wp14:sizeRelV relativeFrom="margin">
-                <wp14:pctHeight>0</wp14:pctHeight>
-              </wp14:sizeRelV>
-            </wp:anchor>
-          </w:drawing>
-        </mc:Choice>
-        <mc:Fallback>
-          <w:pict>
-            <v:shapetype w14:anchorId="32FBE6F8" id="_x0000_t202" coordsize="21600,21600" o:spt="202" path="m,l,21600r21600,l21600,xe">
-              <v:stroke joinstyle="miter"/>
-              <v:path gradientshapeok="t" o:connecttype="rect"/>
-            </v:shapetype>
-            <v:shape id="_x0000_s1032" type="#_x0000_t202" style="position:absolute;left:0;text-align:left;margin-left:319.55pt;margin-top:797.85pt;width:135pt;height:27pt;z-index:251661312;visibility:visible;mso-wrap-style:square;mso-width-percent:0;mso-height-percent:0;mso-wrap-distance-left:9pt;mso-wrap-distance-top:0;mso-wrap-distance-right:9pt;mso-wrap-distance-bottom:0;mso-position-horizontal:absolute;mso-position-horizontal-relative:page;mso-position-vertical:absolute;mso-position-vertical-relative:page;mso-width-percent:0;mso-height-percent:0;mso-width-relative:margin;mso-height-relative:margin;v-text-anchor:top" o:gfxdata="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" filled="f" stroked="f">
-              <v:textbox>
-                <w:txbxContent>
-                  <w:p>
-                    <w:pPr>
-                      <w:rPr>
-                        <w:sz w:val="14"/>
-                        <w:szCs w:val="14"/>
-                        <w:lang w:val="es-ES_tradnl"/>
-                      </w:rPr>
-                    </w:pPr>
-                    <w:r>
-                      <w:rPr>
-                        <w:sz w:val="14"/>
-                        <w:szCs w:val="14"/>
-                        <w:lang w:val="es-ES_tradnl"/>
-                      </w:rPr>
-                      <w:t>Avda. de la Aurora, 55, entreplanta</w:t>
-                    </w:r>
-                  </w:p>
-                  <w:p>
-                    <w:pPr>
-                      <w:rPr>
-                        <w:sz w:val="14"/>
-                        <w:szCs w:val="14"/>
-                        <w:lang w:val="es-ES_tradnl"/>
-                      </w:rPr>
-                    </w:pPr>
-                    <w:r>
-                      <w:rPr>
-                        <w:sz w:val="14"/>
-                        <w:szCs w:val="14"/>
-                        <w:lang w:val="es-ES_tradnl"/>
-                      </w:rPr>
-                      <w:t>29006 Málaga (España)</w:t>
-                    </w:r>
-                  </w:p>
-                </w:txbxContent>
-              </v:textbox>
-              <w10:wrap type="through" anchorx="page" anchory="page"/>
-            </v:shape>
-          </w:pict>
-        </mc:Fallback>
-      </mc:AlternateContent>
-    </w:r>
-    <w:r>
-      <w:rPr>
-        <w:noProof/>
-      </w:rPr>
-      <mc:AlternateContent>
-        <mc:Choice Requires="wps">
-          <w:drawing>
-            <wp:anchor distT="0" distB="0" distL="114300" distR="114300" simplePos="0" relativeHeight="251651072" behindDoc="0" locked="0" layoutInCell="1" allowOverlap="1" wp14:anchorId="003E73B6" wp14:editId="76E9C323">
-              <wp:simplePos x="0" y="0"/>
-              <wp:positionH relativeFrom="page">
-                <wp:posOffset>1429385</wp:posOffset>
-              </wp:positionH>
-              <wp:positionV relativeFrom="page">
-                <wp:posOffset>10132695</wp:posOffset>
-              </wp:positionV>
-              <wp:extent cx="800100" cy="342900"/>
-              <wp:effectExtent l="0" t="0" r="0" b="0"/>
-              <wp:wrapThrough wrapText="bothSides">
-                <wp:wrapPolygon edited="0">
-                  <wp:start x="1029" y="0"/>
-                  <wp:lineTo x="1029" y="20400"/>
-                  <wp:lineTo x="20057" y="20400"/>
-                  <wp:lineTo x="20057" y="0"/>
-                  <wp:lineTo x="1029" y="0"/>
-                </wp:wrapPolygon>
-              </wp:wrapThrough>
-              <wp:docPr id="1027357469" name="Text Box 10"/>
-              <wp:cNvGraphicFramePr>
-                <a:graphicFrameLocks xmlns:a="http://schemas.openxmlformats.org/drawingml/2006/main"/>
-              </wp:cNvGraphicFramePr>
-              <a:graphic xmlns:a="http://schemas.openxmlformats.org/drawingml/2006/main">
-                <a:graphicData uri="http://schemas.microsoft.com/office/word/2010/wordprocessingShape">
-                  <wps:wsp>
-                    <wps:cNvSpPr txBox="1">
-                      <a:spLocks/>
-                    </wps:cNvSpPr>
-                    <wps:spPr>
-                      <a:xfrm>
-                        <a:off x="0" y="0"/>
-                        <a:ext cx="800100" cy="342900"/>
-                      </a:xfrm>
-                      <a:prstGeom prst="rect">
-                        <a:avLst/>
-                      </a:prstGeom>
-                      <a:noFill/>
-                      <a:ln>
-                        <a:noFill/>
-                      </a:ln>
-                      <a:effectLst/>
-                      <a:extLst>
-                        <a:ext uri="{C572A759-6A51-4108-AA02-DFA0A04FC94B}">
-                          <ma14:wrappingTextBoxFlag xmlns:ma14="http://schemas.microsoft.com/office/mac/drawingml/2011/main" xmlns:w="http://schemas.openxmlformats.org/wordprocessingml/2006/main" xmlns:w10="urn:schemas-microsoft-com:office:word" xmlns:v="urn:schemas-microsoft-com:vml" xmlns:o="urn:schemas-microsoft-com:office:office" xmlns:mv="urn:schemas-microsoft-com:mac:vml" xmlns:mo="http://schemas.microsoft.com/office/mac/office/2008/main" xmlns=""/>
-                        </a:ext>
-                      </a:extLst>
-                    </wps:spPr>
-                    <wps:txbx>
-                      <w:txbxContent>
-                        <w:p>
-                          <w:pPr>
-                            <w:rPr>
-                              <w:sz w:val="14"/>
-                              <w:szCs w:val="12"/>
-                              <w:lang w:val="es-ES_tradnl"/>
-                            </w:rPr>
-                          </w:pPr>
-                          <w:r>
-                            <w:rPr>
-                              <w:sz w:val="14"/>
-                              <w:szCs w:val="12"/>
-                              <w:lang w:val="es-ES_tradnl"/>
-                            </w:rPr>
-                            <w:t>952 04 10 47</w:t>
-                          </w:r>
-                        </w:p>
-                        <w:p>
-                          <w:pPr>
-                            <w:rPr>
-                              <w:sz w:val="14"/>
-                              <w:szCs w:val="14"/>
-                              <w:lang w:val="es-ES_tradnl"/>
-                            </w:rPr>
-                          </w:pPr>
-                          <w:r>
-                            <w:rPr>
-                              <w:sz w:val="14"/>
-                              <w:szCs w:val="14"/>
-                              <w:lang w:val="es-ES_tradnl"/>
-                            </w:rPr>
-                            <w:t>952 34 41 00</w:t>
-                          </w:r>
-                        </w:p>
-                      </w:txbxContent>
-                    </wps:txbx>
-                    <wps:bodyPr rot="0" spcFirstLastPara="0" vertOverflow="overflow" horzOverflow="overflow" vert="horz" wrap="square" lIns="91440" tIns="45720" rIns="91440" bIns="45720" numCol="1" spcCol="0" rtlCol="0" fromWordArt="0" anchor="t" anchorCtr="0" forceAA="0" compatLnSpc="1">
-                      <a:prstTxWarp prst="textNoShape">
-                        <a:avLst/>
-                      </a:prstTxWarp>
-                      <a:noAutofit/>
-                    </wps:bodyPr>
-                  </wps:wsp>
-                </a:graphicData>
-              </a:graphic>
-              <wp14:sizeRelH relativeFrom="margin">
-                <wp14:pctWidth>0</wp14:pctWidth>
-              </wp14:sizeRelH>
-              <wp14:sizeRelV relativeFrom="margin">
-                <wp14:pctHeight>0</wp14:pctHeight>
-              </wp14:sizeRelV>
-            </wp:anchor>
-          </w:drawing>
-        </mc:Choice>
-        <mc:Fallback>
-          <w:pict>
-            <v:shape w14:anchorId="003E73B6" id="_x0000_s1033" type="#_x0000_t202" style="position:absolute;left:0;text-align:left;margin-left:112.55pt;margin-top:797.85pt;width:63pt;height:27pt;z-index:251651072;visibility:visible;mso-wrap-style:square;mso-width-percent:0;mso-height-percent:0;mso-wrap-distance-left:9pt;mso-wrap-distance-top:0;mso-wrap-distance-right:9pt;mso-wrap-distance-bottom:0;mso-position-horizontal:absolute;mso-position-horizontal-relative:page;mso-position-vertical:absolute;mso-position-vertical-relative:page;mso-width-percent:0;mso-height-percent:0;mso-width-relative:margin;mso-height-relative:margin;v-text-anchor:top" o:gfxdata="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" filled="f" stroked="f">
-              <v:textbox>
-                <w:txbxContent>
-                  <w:p>
-                    <w:pPr>
-                      <w:rPr>
-                        <w:sz w:val="14"/>
-                        <w:szCs w:val="12"/>
-                        <w:lang w:val="es-ES_tradnl"/>
-                      </w:rPr>
-                    </w:pPr>
-                    <w:r>
-                      <w:rPr>
-                        <w:sz w:val="14"/>
-                        <w:szCs w:val="12"/>
-                        <w:lang w:val="es-ES_tradnl"/>
-                      </w:rPr>
-                      <w:t>952 04 10 47</w:t>
-                    </w:r>
-                  </w:p>
-                  <w:p>
-                    <w:pPr>
-                      <w:rPr>
-                        <w:sz w:val="14"/>
-                        <w:szCs w:val="14"/>
-                        <w:lang w:val="es-ES_tradnl"/>
-                      </w:rPr>
-                    </w:pPr>
-                    <w:r>
-                      <w:rPr>
-                        <w:sz w:val="14"/>
-                        <w:szCs w:val="14"/>
-                        <w:lang w:val="es-ES_tradnl"/>
-                      </w:rPr>
-                      <w:t>952 34 41 00</w:t>
-                    </w:r>
-                  </w:p>
-                </w:txbxContent>
-              </v:textbox>
-              <w10:wrap type="through" anchorx="page" anchory="page"/>
-            </v:shape>
-          </w:pict>
-        </mc:Fallback>
-      </mc:AlternateContent>
-    </w:r>
-    <w:r>
-      <w:rPr>
-        <w:noProof/>
-      </w:rPr>
-      <mc:AlternateContent>
-        <mc:Choice Requires="wps">
-          <w:drawing>
-            <wp:anchor distT="0" distB="0" distL="114300" distR="114300" simplePos="0" relativeHeight="251657216" behindDoc="0" locked="0" layoutInCell="1" allowOverlap="1" wp14:anchorId="00F01480" wp14:editId="154F1AE4">
-              <wp:simplePos x="0" y="0"/>
-              <wp:positionH relativeFrom="page">
-                <wp:posOffset>2686685</wp:posOffset>
-              </wp:positionH>
-              <wp:positionV relativeFrom="page">
-                <wp:posOffset>10132695</wp:posOffset>
-              </wp:positionV>
-              <wp:extent cx="1371600" cy="342900"/>
-              <wp:effectExtent l="0" t="0" r="0" b="0"/>
-              <wp:wrapThrough wrapText="bothSides">
-                <wp:wrapPolygon edited="0">
-                  <wp:start x="600" y="0"/>
-                  <wp:lineTo x="600" y="20400"/>
-                  <wp:lineTo x="20700" y="20400"/>
-                  <wp:lineTo x="20700" y="0"/>
-                  <wp:lineTo x="600" y="0"/>
-                </wp:wrapPolygon>
-              </wp:wrapThrough>
-              <wp:docPr id="1609113100" name="Text Box 10"/>
-              <wp:cNvGraphicFramePr>
-                <a:graphicFrameLocks xmlns:a="http://schemas.openxmlformats.org/drawingml/2006/main"/>
-              </wp:cNvGraphicFramePr>
-              <a:graphic xmlns:a="http://schemas.openxmlformats.org/drawingml/2006/main">
-                <a:graphicData uri="http://schemas.microsoft.com/office/word/2010/wordprocessingShape">
-                  <wps:wsp>
-                    <wps:cNvSpPr txBox="1">
-                      <a:spLocks/>
-                    </wps:cNvSpPr>
-                    <wps:spPr>
-                      <a:xfrm>
-                        <a:off x="0" y="0"/>
-                        <a:ext cx="1371600" cy="342900"/>
-                      </a:xfrm>
-                      <a:prstGeom prst="rect">
-                        <a:avLst/>
-                      </a:prstGeom>
-                      <a:noFill/>
-                      <a:ln>
-                        <a:noFill/>
-                      </a:ln>
-                      <a:effectLst/>
-                      <a:extLst>
-                        <a:ext uri="{C572A759-6A51-4108-AA02-DFA0A04FC94B}">
-                          <ma14:wrappingTextBoxFlag xmlns:ma14="http://schemas.microsoft.com/office/mac/drawingml/2011/main" xmlns:w="http://schemas.openxmlformats.org/wordprocessingml/2006/main" xmlns:w10="urn:schemas-microsoft-com:office:word" xmlns:v="urn:schemas-microsoft-com:vml" xmlns:o="urn:schemas-microsoft-com:office:office" xmlns:mv="urn:schemas-microsoft-com:mac:vml" xmlns:mo="http://schemas.microsoft.com/office/mac/office/2008/main" xmlns=""/>
-                        </a:ext>
-                      </a:extLst>
-                    </wps:spPr>
-                    <wps:txbx>
-                      <w:txbxContent>
-                        <w:p>
-                          <w:pPr>
-                            <w:rPr>
-                              <w:sz w:val="14"/>
-                              <w:szCs w:val="14"/>
-                              <w:lang w:val="es-ES_tradnl"/>
-                            </w:rPr>
-                          </w:pPr>
-                          <w:r>
-                            <w:rPr>
-                              <w:sz w:val="14"/>
-                              <w:szCs w:val="14"/>
-                              <w:lang w:val="es-ES_tradnl"/>
-                            </w:rPr>
-                            <w:t>edp@edp-sl.com</w:t>
-                          </w:r>
-                        </w:p>
-                        <w:p>
-                          <w:pPr>
-                            <w:rPr>
-                              <w:color w:val="0070C0"/>
-                              <w:sz w:val="14"/>
-                              <w:szCs w:val="14"/>
-                              <w:lang w:val="es-ES_tradnl"/>
-                            </w:rPr>
-                          </w:pPr>
-                          <w:r>
-                            <w:rPr>
-                              <w:color w:val="0070C0"/>
-                              <w:sz w:val="14"/>
-                              <w:szCs w:val="14"/>
-                              <w:lang w:val="es-ES_tradnl"/>
-                            </w:rPr>
-                            <w:t>www.edp-sl.com</w:t>
-                          </w:r>
-                        </w:p>
-                      </w:txbxContent>
-                    </wps:txbx>
-                    <wps:bodyPr rot="0" spcFirstLastPara="0" vertOverflow="overflow" horzOverflow="overflow" vert="horz" wrap="square" lIns="91440" tIns="45720" rIns="91440" bIns="45720" numCol="1" spcCol="0" rtlCol="0" fromWordArt="0" anchor="t" anchorCtr="0" forceAA="0" compatLnSpc="1">
-                      <a:prstTxWarp prst="textNoShape">
-                        <a:avLst/>
-                      </a:prstTxWarp>
-                      <a:noAutofit/>
-                    </wps:bodyPr>
-                  </wps:wsp>
-                </a:graphicData>
-              </a:graphic>
-              <wp14:sizeRelH relativeFrom="margin">
-                <wp14:pctWidth>0</wp14:pctWidth>
-              </wp14:sizeRelH>
-              <wp14:sizeRelV relativeFrom="margin">
-                <wp14:pctHeight>0</wp14:pctHeight>
-              </wp14:sizeRelV>
-            </wp:anchor>
-          </w:drawing>
-        </mc:Choice>
-        <mc:Fallback>
-          <w:pict>
-            <v:shape w14:anchorId="00F01480" id="_x0000_s1034" type="#_x0000_t202" style="position:absolute;left:0;text-align:left;margin-left:211.55pt;margin-top:797.85pt;width:108pt;height:27pt;z-index:251657216;visibility:visible;mso-wrap-style:square;mso-width-percent:0;mso-height-percent:0;mso-wrap-distance-left:9pt;mso-wrap-distance-top:0;mso-wrap-distance-right:9pt;mso-wrap-distance-bottom:0;mso-position-horizontal:absolute;mso-position-horizontal-relative:page;mso-position-vertical:absolute;mso-position-vertical-relative:page;mso-width-percent:0;mso-height-percent:0;mso-width-relative:margin;mso-height-relative:margin;v-text-anchor:top" o:gfxdata="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" filled="f" stroked="f">
-              <v:textbox>
-                <w:txbxContent>
-                  <w:p>
-                    <w:pPr>
-                      <w:rPr>
-                        <w:sz w:val="14"/>
-                        <w:szCs w:val="14"/>
-                        <w:lang w:val="es-ES_tradnl"/>
-                      </w:rPr>
-                    </w:pPr>
-                    <w:r>
-                      <w:rPr>
-                        <w:sz w:val="14"/>
-                        <w:szCs w:val="14"/>
-                        <w:lang w:val="es-ES_tradnl"/>
-                      </w:rPr>
-                      <w:t>edp@edp-sl.com</w:t>
-                    </w:r>
-                  </w:p>
-                  <w:p>
-                    <w:pPr>
-                      <w:rPr>
-                        <w:color w:val="0070C0"/>
-                        <w:sz w:val="14"/>
-                        <w:szCs w:val="14"/>
-                        <w:lang w:val="es-ES_tradnl"/>
-                      </w:rPr>
-                    </w:pPr>
-                    <w:r>
-                      <w:rPr>
-                        <w:color w:val="0070C0"/>
-                        <w:sz w:val="14"/>
-                        <w:szCs w:val="14"/>
-                        <w:lang w:val="es-ES_tradnl"/>
-                      </w:rPr>
-                      <w:t>www.edp-sl.com</w:t>
-                    </w:r>
-                  </w:p>
-                </w:txbxContent>
-              </v:textbox>
-              <w10:wrap type="through" anchorx="page" anchory="page"/>
-            </v:shape>
-          </w:pict>
-        </mc:Fallback>
-      </mc:AlternateContent>
-    </w:r>
-    <w:r>
-      <w:rPr>
-        <w:noProof/>
-      </w:rPr>
-      <mc:AlternateContent>
-        <mc:Choice Requires="wps">
-          <w:drawing>
-            <wp:anchor distT="0" distB="0" distL="114300" distR="114300" simplePos="0" relativeHeight="251663360" behindDoc="0" locked="0" layoutInCell="1" allowOverlap="1" wp14:anchorId="16C74CA3" wp14:editId="76D3C3D8">
-              <wp:simplePos x="0" y="0"/>
-              <wp:positionH relativeFrom="column">
-                <wp:posOffset>2971800</wp:posOffset>
-              </wp:positionH>
-              <wp:positionV relativeFrom="paragraph">
-                <wp:posOffset>226695</wp:posOffset>
-              </wp:positionV>
-              <wp:extent cx="0" cy="457200"/>
-              <wp:effectExtent l="0" t="0" r="38100" b="19050"/>
-              <wp:wrapNone/>
-              <wp:docPr id="1039025773" name="Conector recto 1039025773"/>
-              <wp:cNvGraphicFramePr/>
-              <a:graphic xmlns:a="http://schemas.openxmlformats.org/drawingml/2006/main">
-                <a:graphicData uri="http://schemas.microsoft.com/office/word/2010/wordprocessingShape">
-                  <wps:wsp>
-                    <wps:cNvCnPr/>
-                    <wps:spPr>
-                      <a:xfrm>
-                        <a:off x="0" y="0"/>
-                        <a:ext cx="0" cy="457200"/>
-                      </a:xfrm>
-                      <a:prstGeom prst="line">
-                        <a:avLst/>
-                      </a:prstGeom>
-                      <a:noFill/>
-                      <a:ln w="6350" cap="flat" cmpd="sng" algn="ctr">
-                        <a:solidFill>
-                          <a:sysClr val="windowText" lastClr="000000"/>
-                        </a:solidFill>
-                        <a:prstDash val="solid"/>
-                        <a:miter lim="800000"/>
-                      </a:ln>
-                      <a:effectLst/>
-                    </wps:spPr>
-                    <wps:bodyPr/>
-                  </wps:wsp>
-                </a:graphicData>
-              </a:graphic>
-            </wp:anchor>
-          </w:drawing>
-        </mc:Choice>
-        <mc:Fallback>
-          <w:pict>
-            <v:line w14:anchorId="3B8E2307" id="Conector recto 28" o:spid="_x0000_s1026" style="position:absolute;z-index:251668480;visibility:visible;mso-wrap-style:square;mso-wrap-distance-left:9pt;mso-wrap-distance-top:0;mso-wrap-distance-right:9pt;mso-wrap-distance-bottom:0;mso-position-horizontal:absolute;mso-position-horizontal-relative:text;mso-position-vertical:absolute;mso-position-vertical-relative:text" from="234pt,17.85pt" to="234pt,53.85pt" o:gfxdata="UEsDBBQABgAIAAAAIQC2gziS/gAAAOEBAAATAAAAW0NvbnRlbnRfVHlwZXNdLnhtbJSRQU7DMBBF 90jcwfIWJU67QAgl6YK0S0CoHGBkTxKLZGx5TGhvj5O2G0SRWNoz/78nu9wcxkFMGNg6quQqL6RA 0s5Y6ir5vt9lD1JwBDIwOMJKHpHlpr69KfdHjyxSmriSfYz+USnWPY7AufNIadK6MEJMx9ApD/oD OlTrorhX2lFEilmcO2RdNtjC5xDF9pCuTyYBB5bi6bQ4syoJ3g9WQ0ymaiLzg5KdCXlKLjvcW893 SUOqXwnz5DrgnHtJTxOsQfEKIT7DmDSUCaxw7Rqn8787ZsmRM9e2VmPeBN4uqYvTtW7jvijg9N/y JsXecLq0q+WD6m8AAAD//wMAUEsDBBQABgAIAAAAIQA4/SH/1gAAAJQBAAALAAAAX3JlbHMvLnJl bHOkkMFqwzAMhu+DvYPRfXGawxijTi+j0GvpHsDYimMaW0Yy2fr2M4PBMnrbUb/Q94l/f/hMi1qR JVI2sOt6UJgd+ZiDgffL8ekFlFSbvV0oo4EbChzGx4f9GRdb25HMsYhqlCwG5lrLq9biZkxWOiqY 22YiTra2kYMu1l1tQD30/bPm3wwYN0x18gb45AdQl1tp5j/sFB2T0FQ7R0nTNEV3j6o9feQzro1i OWA14Fm+Q8a1a8+Bvu/d/dMb2JY5uiPbhG/ktn4cqGU/er3pcvwCAAD//wMAUEsDBBQABgAIAAAA IQB2XM8xrwEAAFgDAAAOAAAAZHJzL2Uyb0RvYy54bWysU01vEzEQvSPxHyzfidNCS7WK00OjckFQ ifIDpv7YteQveUw2+feMvSENcEPswWvPeN7Oe/N2c38Inu1NQZei5FerNWcmqqRdHCX//vz47o4z rBA1+BSN5EeD/H779s1mzoO5TlPy2hRGIBGHOUs+1ZoHIVBNJgCuUjaRkjaVAJWOZRS6wEzowYvr 9fpWzKnoXJIyiBTdLUm+7fjWGlW/WoumMi859Vb7Wvr60lax3cAwFsiTU6c24B+6COAiffQMtYMK 7Edxf0EFp0rCZOtKpSCStU6ZzoHYXK3/YPNtgmw6FxIH81km/H+w6sv+IT4VkmHOOGB+Ko3FwZbQ 3tQfO3SxjmexzKEytQQVRT/cfKQ5NB3Fa10uWD+ZFFjbSO5dbDRggP1nrMvVX1daOKZH530fhY9s lvz2/Q0NSwEZwnqotA1ZS45x5Az8SE5TtXRETN7pVt1w8IgPvrA90LDJIzrNz9QtZx6wUoIo9OfU 7G+lrZ0d4LQU99TijeAqGdS7IPndZbWP7YumW+xE6lXBtntJ+tiFFe1E4+sKnazW/HF5pv3lD7H9 CQAA//8DAFBLAwQUAAYACAAAACEAsPHN7N4AAAAKAQAADwAAAGRycy9kb3ducmV2LnhtbEyPTU/D MAyG70j8h8hI3FgChXXqmk5oaAduo4DEMWvcj9E4VZNu5d9jxAGOth+9ft58M7tenHAMnScNtwsF AqnytqNGw9vr7mYFIkRD1vSeUMMXBtgUlxe5yaw/0wueytgIDqGQGQ1tjEMmZahadCYs/IDEt9qP zkQex0ba0Zw53PXyTqmldKYj/tCaAbctVp/l5DRM+22tul0yHz+SUk7P6f79qW60vr6aH9cgIs7x D4YffVaHgp0OfiIbRK/hfrniLlFD8pCCYOB3cWBSpSnIIpf/KxTfAAAA//8DAFBLAQItABQABgAI AAAAIQC2gziS/gAAAOEBAAATAAAAAAAAAAAAAAAAAAAAAABbQ29udGVudF9UeXBlc10ueG1sUEsB Ai0AFAAGAAgAAAAhADj9If/WAAAAlAEAAAsAAAAAAAAAAAAAAAAALwEAAF9yZWxzLy5yZWxzUEsB Ai0AFAAGAAgAAAAhAHZczzGvAQAAWAMAAA4AAAAAAAAAAAAAAAAALgIAAGRycy9lMm9Eb2MueG1s UEsBAi0AFAAGAAgAAAAhALDxzezeAAAACgEAAA8AAAAAAAAAAAAAAAAACQQAAGRycy9kb3ducmV2 LnhtbFBLBQYAAAAABAAEAPMAAAAUBQAAAAA= " strokecolor="windowText" strokeweight=".5pt">
-              <v:stroke joinstyle="miter"/>
-            </v:line>
-          </w:pict>
-        </mc:Fallback>
-      </mc:AlternateContent>
-    </w:r>
-    <w:r>
-      <w:rPr>
-        <w:noProof/>
-      </w:rPr>
-      <mc:AlternateContent>
-        <mc:Choice Requires="wps">
-          <w:drawing>
-            <wp:anchor distT="0" distB="0" distL="114300" distR="114300" simplePos="0" relativeHeight="251653120" behindDoc="0" locked="0" layoutInCell="1" allowOverlap="1" wp14:anchorId="350D279F" wp14:editId="54B5E171">
-              <wp:simplePos x="0" y="0"/>
-              <wp:positionH relativeFrom="column">
-                <wp:posOffset>228600</wp:posOffset>
-              </wp:positionH>
-              <wp:positionV relativeFrom="paragraph">
-                <wp:posOffset>112395</wp:posOffset>
-              </wp:positionV>
-              <wp:extent cx="6400800" cy="0"/>
-              <wp:effectExtent l="0" t="0" r="25400" b="25400"/>
-              <wp:wrapNone/>
-              <wp:docPr id="1493930639" name="Conector recto 1493930639"/>
-              <wp:cNvGraphicFramePr/>
-              <a:graphic xmlns:a="http://schemas.openxmlformats.org/drawingml/2006/main">
-                <a:graphicData uri="http://schemas.microsoft.com/office/word/2010/wordprocessingShape">
-                  <wps:wsp>
-                    <wps:cNvCnPr/>
-                    <wps:spPr>
-                      <a:xfrm>
-                        <a:off x="0" y="0"/>
-                        <a:ext cx="6400800" cy="0"/>
-                      </a:xfrm>
-                      <a:prstGeom prst="line">
-                        <a:avLst/>
-                      </a:prstGeom>
-                      <a:noFill/>
-                      <a:ln w="6350" cap="flat" cmpd="sng" algn="ctr">
-                        <a:solidFill>
-                          <a:srgbClr val="5B9BD5"/>
-                        </a:solidFill>
-                        <a:prstDash val="solid"/>
-                        <a:miter lim="800000"/>
-                      </a:ln>
-                      <a:effectLst/>
-                    </wps:spPr>
-                    <wps:bodyPr/>
-                  </wps:wsp>
-                </a:graphicData>
-              </a:graphic>
-            </wp:anchor>
-          </w:drawing>
-        </mc:Choice>
-        <mc:Fallback>
-          <w:pict>
-            <v:line w14:anchorId="256B0012" id="Conector recto 217511060" o:spid="_x0000_s1026" style="position:absolute;z-index:251663360;visibility:visible;mso-wrap-style:square;mso-wrap-distance-left:9pt;mso-wrap-distance-top:0;mso-wrap-distance-right:9pt;mso-wrap-distance-bottom:0;mso-position-horizontal:absolute;mso-position-horizontal-relative:text;mso-position-vertical:absolute;mso-position-vertical-relative:text" from="18pt,8.85pt" to="522pt,8.85pt" o:gfxdata="UEsDBBQABgAIAAAAIQC2gziS/gAAAOEBAAATAAAAW0NvbnRlbnRfVHlwZXNdLnhtbJSRQU7DMBBF 90jcwfIWJU67QAgl6YK0S0CoHGBkTxKLZGx5TGhvj5O2G0SRWNoz/78nu9wcxkFMGNg6quQqL6RA 0s5Y6ir5vt9lD1JwBDIwOMJKHpHlpr69KfdHjyxSmriSfYz+USnWPY7AufNIadK6MEJMx9ApD/oD OlTrorhX2lFEilmcO2RdNtjC5xDF9pCuTyYBB5bi6bQ4syoJ3g9WQ0ymaiLzg5KdCXlKLjvcW893 SUOqXwnz5DrgnHtJTxOsQfEKIT7DmDSUCaxw7Rqn8787ZsmRM9e2VmPeBN4uqYvTtW7jvijg9N/y JsXecLq0q+WD6m8AAAD//wMAUEsDBBQABgAIAAAAIQA4/SH/1gAAAJQBAAALAAAAX3JlbHMvLnJl bHOkkMFqwzAMhu+DvYPRfXGawxijTi+j0GvpHsDYimMaW0Yy2fr2M4PBMnrbUb/Q94l/f/hMi1qR JVI2sOt6UJgd+ZiDgffL8ekFlFSbvV0oo4EbChzGx4f9GRdb25HMsYhqlCwG5lrLq9biZkxWOiqY 22YiTra2kYMu1l1tQD30/bPm3wwYN0x18gb45AdQl1tp5j/sFB2T0FQ7R0nTNEV3j6o9feQzro1i OWA14Fm+Q8a1a8+Bvu/d/dMb2JY5uiPbhG/ktn4cqGU/er3pcvwCAAD//wMAUEsDBBQABgAIAAAA IQASzCNUqwEAAEUDAAAOAAAAZHJzL2Uyb0RvYy54bWysUk1v2zAMvQ/YfxB0X+x2S9EZcQq0QXsp tgLbfgAjS7YAfYHU4uTfl1LStOtuw3yQKZF65Ht6q5u9d2KnkWwMvbxYtFLooOJgw9jLXz/vP11L QRnCAC4G3cuDJnmz/vhhNadOX8YpukGjYJBA3Zx6OeWcuqYhNWkPtIhJB06aiB4yb3FsBoSZ0b1r Ltv2qpkjDgmj0kR8ujkm5briG6NV/m4M6SxcL3m2XFes67aszXoF3YiQJqtOY8A/TOHBBm56htpA BvEb7V9Q3iqMFE1eqOibaIxVunJgNhftOzY/Jki6cmFxKJ1lov8Hq77t7sITsgxzoo7SExYWe4O+ /Hk+sa9iHc5i6X0Wig+vvrTtdcuaqpdc83oxIeUHHb0oQS+dDYUHdLB7pMzNuPSlpByHeG+dq2/h gpgZ/POyIAM7wjjIHPo09JLCKAW4ka2mMlZEis4O5XbBIRy3dw7FDvi5l7dfbzfL8sLc7Y+y0noD NB3raupoBG8zu9FZ30umxt/ptgsFXVc/nQi8ylWibRwOVcWm7PitatOTr4oZ3u45fuv+9TMAAAD/ /wMAUEsDBBQABgAIAAAAIQAyLg083QAAAAkBAAAPAAAAZHJzL2Rvd25yZXYueG1sTI9BSwMxEIXv gv8hjODNJmptZd1sKYJQQQqtgnrLbsbdxWSyJGm7/nun9KDH+d7jzXvlYvRO7DGmPpCG64kCgdQE 21Or4e316eoeRMqGrHGBUMMPJlhU52elKWw40Ab329wKDqFUGA1dzkMhZWo69CZNwoDE2leI3mQ+ YyttNAcO907eKDWT3vTEHzoz4GOHzfd25zXU6xg/7j7fB7d82aj1mFYhPq+0vrwYlw8gMo75zwzH +lwdKu5Uhx3ZJJyG2xlPyczncxBHXU2nTOoTkVUp/y+ofgEAAP//AwBQSwECLQAUAAYACAAAACEA toM4kv4AAADhAQAAEwAAAAAAAAAAAAAAAAAAAAAAW0NvbnRlbnRfVHlwZXNdLnhtbFBLAQItABQA BgAIAAAAIQA4/SH/1gAAAJQBAAALAAAAAAAAAAAAAAAAAC8BAABfcmVscy8ucmVsc1BLAQItABQA BgAIAAAAIQASzCNUqwEAAEUDAAAOAAAAAAAAAAAAAAAAAC4CAABkcnMvZTJvRG9jLnhtbFBLAQIt ABQABgAIAAAAIQAyLg083QAAAAkBAAAPAAAAAAAAAAAAAAAAAAUEAABkcnMvZG93bnJldi54bWxQ SwUGAAAAAAQABADzAAAADwUAAAAA " strokecolor="#5b9bd5" strokeweight=".5pt">
-              <v:stroke joinstyle="miter"/>
-            </v:line>
-          </w:pict>
-        </mc:Fallback>
-      </mc:AlternateContent>
-    </w:r>
-  </w:p>
-  <w:p>
-    <w:r>
-      <w:rPr>
-        <w:noProof/>
-      </w:rPr>
-      <mc:AlternateContent>
-        <mc:Choice Requires="wps">
-          <w:drawing>
-            <wp:anchor distT="0" distB="0" distL="114300" distR="114300" simplePos="0" relativeHeight="251665408" behindDoc="0" locked="0" layoutInCell="1" allowOverlap="1" wp14:anchorId="60968E5B" wp14:editId="0AE01EE4">
-              <wp:simplePos x="0" y="0"/>
-              <wp:positionH relativeFrom="page">
-                <wp:posOffset>5890716</wp:posOffset>
-              </wp:positionH>
-              <wp:positionV relativeFrom="page">
-                <wp:posOffset>10161905</wp:posOffset>
-              </wp:positionV>
-              <wp:extent cx="1047115" cy="313690"/>
-              <wp:effectExtent l="0" t="0" r="0" b="0"/>
-              <wp:wrapThrough wrapText="bothSides">
-                <wp:wrapPolygon edited="0">
-                  <wp:start x="786" y="0"/>
-                  <wp:lineTo x="786" y="19676"/>
-                  <wp:lineTo x="20434" y="19676"/>
-                  <wp:lineTo x="20434" y="0"/>
-                  <wp:lineTo x="786" y="0"/>
-                </wp:wrapPolygon>
-              </wp:wrapThrough>
-              <wp:docPr id="15988398" name="Text Box 10"/>
-              <wp:cNvGraphicFramePr>
-                <a:graphicFrameLocks xmlns:a="http://schemas.openxmlformats.org/drawingml/2006/main"/>
-              </wp:cNvGraphicFramePr>
-              <a:graphic xmlns:a="http://schemas.openxmlformats.org/drawingml/2006/main">
-                <a:graphicData uri="http://schemas.microsoft.com/office/word/2010/wordprocessingShape">
-                  <wps:wsp>
-                    <wps:cNvSpPr txBox="1">
-                      <a:spLocks/>
-                    </wps:cNvSpPr>
-                    <wps:spPr>
-                      <a:xfrm>
-                        <a:off x="0" y="0"/>
-                        <a:ext cx="1047115" cy="313690"/>
-                      </a:xfrm>
-                      <a:prstGeom prst="rect">
-                        <a:avLst/>
-                      </a:prstGeom>
-                      <a:noFill/>
-                      <a:ln>
-                        <a:noFill/>
-                      </a:ln>
-                      <a:effectLst/>
-                      <a:extLst>
-                        <a:ext uri="{C572A759-6A51-4108-AA02-DFA0A04FC94B}">
-                          <ma14:wrappingTextBoxFlag xmlns:ma14="http://schemas.microsoft.com/office/mac/drawingml/2011/main" xmlns:w="http://schemas.openxmlformats.org/wordprocessingml/2006/main" xmlns:w10="urn:schemas-microsoft-com:office:word" xmlns:v="urn:schemas-microsoft-com:vml" xmlns:o="urn:schemas-microsoft-com:office:office" xmlns:mv="urn:schemas-microsoft-com:mac:vml" xmlns:mo="http://schemas.microsoft.com/office/mac/office/2008/main" xmlns=""/>
-                        </a:ext>
-                      </a:extLst>
-                    </wps:spPr>
-                    <wps:txbx>
-                      <w:txbxContent>
-                        <w:p>
-                          <w:pPr>
-                            <w:jc w:val="right"/>
-                            <w:rPr>
-                              <w:i/>
-                              <w:color w:val="0070C0"/>
-                              <w:sz w:val="14"/>
-                              <w:szCs w:val="14"/>
-                            </w:rPr>
-                          </w:pPr>
-                          <w:r>
-                            <w:rPr>
-                              <w:i/>
-                              <w:color w:val="0070C0"/>
-                              <w:sz w:val="14"/>
-                              <w:szCs w:val="14"/>
-                            </w:rPr>
-                            <w:t xml:space="preserve">Página </w:t>
-                          </w:r>
-                          <w:r>
-                            <w:rPr>
-                              <w:i/>
-                              <w:color w:val="0070C0"/>
-                              <w:sz w:val="14"/>
-                              <w:szCs w:val="14"/>
-                            </w:rPr>
-                            <w:fldChar w:fldCharType="begin"/>
-                          </w:r>
-                          <w:r>
-                            <w:rPr>
-                              <w:i/>
-                              <w:color w:val="0070C0"/>
-                              <w:sz w:val="14"/>
-                              <w:szCs w:val="14"/>
-                            </w:rPr>
-                            <w:instrText>PAGE   \* MERGEFORMAT</w:instrText>
-                          </w:r>
-                          <w:r>
-                            <w:rPr>
-                              <w:i/>
-                              <w:color w:val="0070C0"/>
-                              <w:sz w:val="14"/>
-                              <w:szCs w:val="14"/>
-                            </w:rPr>
-                            <w:fldChar w:fldCharType="separate"/>
-                          </w:r>
-                          <w:r>
-                            <w:rPr>
-                              <w:i/>
-                              <w:noProof/>
-                              <w:color w:val="0070C0"/>
-                              <w:sz w:val="14"/>
-                              <w:szCs w:val="14"/>
-                            </w:rPr>
-                            <w:t>19</w:t>
-                          </w:r>
-                          <w:r>
-                            <w:rPr>
-                              <w:i/>
-                              <w:color w:val="0070C0"/>
-                              <w:sz w:val="14"/>
-                              <w:szCs w:val="14"/>
-                            </w:rPr>
-                            <w:fldChar w:fldCharType="end"/>
-                          </w:r>
-                        </w:p>
-                        <w:p>
-                          <w:pPr>
-                            <w:jc w:val="right"/>
-                            <w:rPr>
-                              <w:i/>
-                              <w:color w:val="0070C0"/>
-                              <w:sz w:val="14"/>
-                              <w:szCs w:val="14"/>
-                            </w:rPr>
-                          </w:pPr>
-                          <w:r>
-                            <w:rPr>
-                              <w:i/>
-                              <w:color w:val="0070C0"/>
-                              <w:sz w:val="14"/>
-                              <w:szCs w:val="14"/>
-                            </w:rPr>
-                            <w:t>5</w:t>
-                          </w:r>
-                          <w:r>
-                            <w:rPr>
-                              <w:i/>
-                              <w:color w:val="0070C0"/>
-                              <w:sz w:val="14"/>
-                              <w:szCs w:val="14"/>
-                            </w:rPr>
-                            <w:t>35.2.2</w:t>
-                          </w:r>
-                        </w:p>
-                      </w:txbxContent>
-                    </wps:txbx>
-                    <wps:bodyPr rot="0" spcFirstLastPara="0" vertOverflow="overflow" horzOverflow="overflow" vert="horz" wrap="square" lIns="91440" tIns="45720" rIns="91440" bIns="45720" numCol="1" spcCol="0" rtlCol="0" fromWordArt="0" anchor="ctr" anchorCtr="0" forceAA="0" compatLnSpc="1">
-                      <a:prstTxWarp prst="textNoShape">
-                        <a:avLst/>
-                      </a:prstTxWarp>
-                      <a:noAutofit/>
-                    </wps:bodyPr>
-                  </wps:wsp>
-                </a:graphicData>
-              </a:graphic>
-              <wp14:sizeRelH relativeFrom="margin">
-                <wp14:pctWidth>0</wp14:pctWidth>
-              </wp14:sizeRelH>
-              <wp14:sizeRelV relativeFrom="margin">
-                <wp14:pctHeight>0</wp14:pctHeight>
-              </wp14:sizeRelV>
-            </wp:anchor>
-          </w:drawing>
-        </mc:Choice>
-        <mc:Fallback>
-          <w:pict>
-            <v:shape w14:anchorId="60968E5B" id="_x0000_s1035" type="#_x0000_t202" style="position:absolute;left:0;text-align:left;margin-left:463.85pt;margin-top:800.15pt;width:82.45pt;height:24.7pt;z-index:251665408;visibility:visible;mso-wrap-style:square;mso-width-percent:0;mso-height-percent:0;mso-wrap-distance-left:9pt;mso-wrap-distance-top:0;mso-wrap-distance-right:9pt;mso-wrap-distance-bottom:0;mso-position-horizontal:absolute;mso-position-horizontal-relative:page;mso-position-vertical:absolute;mso-position-vertical-relative:page;mso-width-percent:0;mso-height-percent:0;mso-width-relative:margin;mso-height-relative:margin;v-text-anchor:middle" o:gfxdata="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" filled="f" stroked="f">
-              <v:textbox>
-                <w:txbxContent>
-                  <w:p>
-                    <w:pPr>
-                      <w:jc w:val="right"/>
-                      <w:rPr>
-                        <w:i/>
-                        <w:color w:val="0070C0"/>
-                        <w:sz w:val="14"/>
-                        <w:szCs w:val="14"/>
-                      </w:rPr>
-                    </w:pPr>
-                    <w:r>
-                      <w:rPr>
-                        <w:i/>
-                        <w:color w:val="0070C0"/>
-                        <w:sz w:val="14"/>
-                        <w:szCs w:val="14"/>
-                      </w:rPr>
-                      <w:t xml:space="preserve">Página </w:t>
-                    </w:r>
-                    <w:r>
-                      <w:rPr>
-                        <w:i/>
-                        <w:color w:val="0070C0"/>
-                        <w:sz w:val="14"/>
-                        <w:szCs w:val="14"/>
-                      </w:rPr>
-                      <w:fldChar w:fldCharType="begin"/>
-                    </w:r>
-                    <w:r>
-                      <w:rPr>
-                        <w:i/>
-                        <w:color w:val="0070C0"/>
-                        <w:sz w:val="14"/>
-                        <w:szCs w:val="14"/>
-                      </w:rPr>
-                      <w:instrText>PAGE   \* MERGEFORMAT</w:instrText>
-                    </w:r>
-                    <w:r>
-                      <w:rPr>
-                        <w:i/>
-                        <w:color w:val="0070C0"/>
-                        <w:sz w:val="14"/>
-                        <w:szCs w:val="14"/>
-                      </w:rPr>
-                      <w:fldChar w:fldCharType="separate"/>
-                    </w:r>
-                    <w:r>
-                      <w:rPr>
-                        <w:i/>
-                        <w:noProof/>
-                        <w:color w:val="0070C0"/>
-                        <w:sz w:val="14"/>
-                        <w:szCs w:val="14"/>
-                      </w:rPr>
-                      <w:t>19</w:t>
-                    </w:r>
-                    <w:r>
-                      <w:rPr>
-                        <w:i/>
-                        <w:color w:val="0070C0"/>
-                        <w:sz w:val="14"/>
-                        <w:szCs w:val="14"/>
-                      </w:rPr>
-                      <w:fldChar w:fldCharType="end"/>
-                    </w:r>
-                  </w:p>
-                  <w:p>
-                    <w:pPr>
-                      <w:jc w:val="right"/>
-                      <w:rPr>
-                        <w:i/>
-                        <w:color w:val="0070C0"/>
-                        <w:sz w:val="14"/>
-                        <w:szCs w:val="14"/>
-                      </w:rPr>
-                    </w:pPr>
-                    <w:r>
-                      <w:rPr>
-                        <w:i/>
-                        <w:color w:val="0070C0"/>
-                        <w:sz w:val="14"/>
-                        <w:szCs w:val="14"/>
-                      </w:rPr>
-                      <w:t>5</w:t>
-                    </w:r>
-                    <w:r>
-                      <w:rPr>
-                        <w:i/>
-                        <w:color w:val="0070C0"/>
-                        <w:sz w:val="14"/>
-                        <w:szCs w:val="14"/>
-                      </w:rPr>
-                      <w:t>35.2.2</w:t>
-                    </w:r>
-                  </w:p>
-                </w:txbxContent>
-              </v:textbox>
-              <w10:wrap type="through" anchorx="page" anchory="page"/>
-            </v:shape>
-          </w:pict>
-        </mc:Fallback>
-      </mc:AlternateContent>
-    </w:r>
-    <w:r>
-      <w:rPr>
-        <w:noProof/>
-      </w:rPr>
-      <mc:AlternateContent>
-        <mc:Choice Requires="wps">
-          <w:drawing>
-            <wp:anchor distT="0" distB="0" distL="114300" distR="114300" simplePos="0" relativeHeight="251659264" behindDoc="0" locked="0" layoutInCell="1" allowOverlap="1" wp14:anchorId="530DBE89" wp14:editId="51535FF7">
-              <wp:simplePos x="0" y="0"/>
-              <wp:positionH relativeFrom="column">
-                <wp:posOffset>1562100</wp:posOffset>
-              </wp:positionH>
-              <wp:positionV relativeFrom="paragraph">
-                <wp:posOffset>51435</wp:posOffset>
-              </wp:positionV>
-              <wp:extent cx="0" cy="457200"/>
-              <wp:effectExtent l="0" t="0" r="38100" b="19050"/>
-              <wp:wrapNone/>
-              <wp:docPr id="1978811866" name="Conector recto 1978811866"/>
-              <wp:cNvGraphicFramePr/>
-              <a:graphic xmlns:a="http://schemas.openxmlformats.org/drawingml/2006/main">
-                <a:graphicData uri="http://schemas.microsoft.com/office/word/2010/wordprocessingShape">
-                  <wps:wsp>
-                    <wps:cNvCnPr/>
-                    <wps:spPr>
-                      <a:xfrm>
-                        <a:off x="0" y="0"/>
-                        <a:ext cx="0" cy="457200"/>
-                      </a:xfrm>
-                      <a:prstGeom prst="line">
-                        <a:avLst/>
-                      </a:prstGeom>
-                      <a:noFill/>
-                      <a:ln w="6350" cap="flat" cmpd="sng" algn="ctr">
-                        <a:solidFill>
-                          <a:sysClr val="windowText" lastClr="000000"/>
-                        </a:solidFill>
-                        <a:prstDash val="solid"/>
-                        <a:miter lim="800000"/>
-                      </a:ln>
-                      <a:effectLst/>
-                    </wps:spPr>
-                    <wps:bodyPr/>
-                  </wps:wsp>
-                </a:graphicData>
-              </a:graphic>
-            </wp:anchor>
-          </w:drawing>
-        </mc:Choice>
-        <mc:Fallback>
-          <w:pict>
-            <v:line w14:anchorId="29C75443" id="Conector recto 30" o:spid="_x0000_s1026" style="position:absolute;z-index:251666432;visibility:visible;mso-wrap-style:square;mso-wrap-distance-left:9pt;mso-wrap-distance-top:0;mso-wrap-distance-right:9pt;mso-wrap-distance-bottom:0;mso-position-horizontal:absolute;mso-position-horizontal-relative:text;mso-position-vertical:absolute;mso-position-vertical-relative:text" from="123pt,4.05pt" to="123pt,40.05pt" o:gfxdata="UEsDBBQABgAIAAAAIQC2gziS/gAAAOEBAAATAAAAW0NvbnRlbnRfVHlwZXNdLnhtbJSRQU7DMBBF 90jcwfIWJU67QAgl6YK0S0CoHGBkTxKLZGx5TGhvj5O2G0SRWNoz/78nu9wcxkFMGNg6quQqL6RA 0s5Y6ir5vt9lD1JwBDIwOMJKHpHlpr69KfdHjyxSmriSfYz+USnWPY7AufNIadK6MEJMx9ApD/oD OlTrorhX2lFEilmcO2RdNtjC5xDF9pCuTyYBB5bi6bQ4syoJ3g9WQ0ymaiLzg5KdCXlKLjvcW893 SUOqXwnz5DrgnHtJTxOsQfEKIT7DmDSUCaxw7Rqn8787ZsmRM9e2VmPeBN4uqYvTtW7jvijg9N/y JsXecLq0q+WD6m8AAAD//wMAUEsDBBQABgAIAAAAIQA4/SH/1gAAAJQBAAALAAAAX3JlbHMvLnJl bHOkkMFqwzAMhu+DvYPRfXGawxijTi+j0GvpHsDYimMaW0Yy2fr2M4PBMnrbUb/Q94l/f/hMi1qR JVI2sOt6UJgd+ZiDgffL8ekFlFSbvV0oo4EbChzGx4f9GRdb25HMsYhqlCwG5lrLq9biZkxWOiqY 22YiTra2kYMu1l1tQD30/bPm3wwYN0x18gb45AdQl1tp5j/sFB2T0FQ7R0nTNEV3j6o9feQzro1i OWA14Fm+Q8a1a8+Bvu/d/dMb2JY5uiPbhG/ktn4cqGU/er3pcvwCAAD//wMAUEsDBBQABgAIAAAA IQB2XM8xrwEAAFgDAAAOAAAAZHJzL2Uyb0RvYy54bWysU01vEzEQvSPxHyzfidNCS7WK00OjckFQ ifIDpv7YteQveUw2+feMvSENcEPswWvPeN7Oe/N2c38Inu1NQZei5FerNWcmqqRdHCX//vz47o4z rBA1+BSN5EeD/H779s1mzoO5TlPy2hRGIBGHOUs+1ZoHIVBNJgCuUjaRkjaVAJWOZRS6wEzowYvr 9fpWzKnoXJIyiBTdLUm+7fjWGlW/WoumMi859Vb7Wvr60lax3cAwFsiTU6c24B+6COAiffQMtYMK 7Edxf0EFp0rCZOtKpSCStU6ZzoHYXK3/YPNtgmw6FxIH81km/H+w6sv+IT4VkmHOOGB+Ko3FwZbQ 3tQfO3SxjmexzKEytQQVRT/cfKQ5NB3Fa10uWD+ZFFjbSO5dbDRggP1nrMvVX1daOKZH530fhY9s lvz2/Q0NSwEZwnqotA1ZS45x5Az8SE5TtXRETN7pVt1w8IgPvrA90LDJIzrNz9QtZx6wUoIo9OfU 7G+lrZ0d4LQU99TijeAqGdS7IPndZbWP7YumW+xE6lXBtntJ+tiFFe1E4+sKnazW/HF5pv3lD7H9 CQAA//8DAFBLAwQUAAYACAAAACEA3Ghnn9wAAAAIAQAADwAAAGRycy9kb3ducmV2LnhtbEyPy07D MBBF90j9B2sqsaN2WlSqEKeqWnXBrgSQWLrx5AHxOIqdNvw9g1jA8uiO7pybbSfXiQsOofWkIVko EEilty3VGl5fjncbECEasqbzhBq+MMA2n91kJrX+Ss94KWItuIRCajQ0MfaplKFs0Jmw8D0SZ5Uf nImMQy3tYK5c7jq5VGotnWmJPzSmx32D5WcxOg3jaV+p9riaPt5XhRyfHk5vh6rW+nY+7R5BRJzi 3zH86LM65Ox09iPZIDoNy/s1b4kaNgkIzn/5zKwSkHkm/w/IvwEAAP//AwBQSwECLQAUAAYACAAA ACEAtoM4kv4AAADhAQAAEwAAAAAAAAAAAAAAAAAAAAAAW0NvbnRlbnRfVHlwZXNdLnhtbFBLAQIt ABQABgAIAAAAIQA4/SH/1gAAAJQBAAALAAAAAAAAAAAAAAAAAC8BAABfcmVscy8ucmVsc1BLAQIt ABQABgAIAAAAIQB2XM8xrwEAAFgDAAAOAAAAAAAAAAAAAAAAAC4CAABkcnMvZTJvRG9jLnhtbFBL AQItABQABgAIAAAAIQDcaGef3AAAAAgBAAAPAAAAAAAAAAAAAAAAAAkEAABkcnMvZG93bnJldi54 bWxQSwUGAAAAAAQABADzAAAAEgUAAAAA " strokecolor="windowText" strokeweight=".5pt">
-              <v:stroke joinstyle="miter"/>
-            </v:line>
-          </w:pict>
-        </mc:Fallback>
-      </mc:AlternateContent>
-    </w:r>
-    <w:r>
-      <w:rPr>
-        <w:noProof/>
-      </w:rPr>
-      <mc:AlternateContent>
-        <mc:Choice Requires="wps">
-          <w:drawing>
-            <wp:anchor distT="0" distB="0" distL="114300" distR="114300" simplePos="0" relativeHeight="251655168" behindDoc="0" locked="0" layoutInCell="1" allowOverlap="1" wp14:anchorId="06956A8A" wp14:editId="2D24E183">
-              <wp:simplePos x="0" y="0"/>
-              <wp:positionH relativeFrom="column">
-                <wp:posOffset>304800</wp:posOffset>
-              </wp:positionH>
-              <wp:positionV relativeFrom="paragraph">
-                <wp:posOffset>51435</wp:posOffset>
-              </wp:positionV>
-              <wp:extent cx="0" cy="457200"/>
-              <wp:effectExtent l="0" t="0" r="38100" b="19050"/>
-              <wp:wrapNone/>
-              <wp:docPr id="1989076238" name="Conector recto 1989076238"/>
-              <wp:cNvGraphicFramePr/>
-              <a:graphic xmlns:a="http://schemas.openxmlformats.org/drawingml/2006/main">
-                <a:graphicData uri="http://schemas.microsoft.com/office/word/2010/wordprocessingShape">
-                  <wps:wsp>
-                    <wps:cNvCnPr/>
-                    <wps:spPr>
-                      <a:xfrm>
-                        <a:off x="0" y="0"/>
-                        <a:ext cx="0" cy="457200"/>
-                      </a:xfrm>
-                      <a:prstGeom prst="line">
-                        <a:avLst/>
-                      </a:prstGeom>
-                      <a:noFill/>
-                      <a:ln w="6350" cap="flat" cmpd="sng" algn="ctr">
-                        <a:solidFill>
-                          <a:sysClr val="windowText" lastClr="000000"/>
-                        </a:solidFill>
-                        <a:prstDash val="solid"/>
-                        <a:miter lim="800000"/>
-                      </a:ln>
-                      <a:effectLst/>
-                    </wps:spPr>
-                    <wps:bodyPr/>
-                  </wps:wsp>
-                </a:graphicData>
-              </a:graphic>
-            </wp:anchor>
-          </w:drawing>
-        </mc:Choice>
-        <mc:Fallback>
-          <w:pict>
-            <v:line w14:anchorId="26AC4FCA" id="Conector recto 31" o:spid="_x0000_s1026" style="position:absolute;z-index:251664384;visibility:visible;mso-wrap-style:square;mso-wrap-distance-left:9pt;mso-wrap-distance-top:0;mso-wrap-distance-right:9pt;mso-wrap-distance-bottom:0;mso-position-horizontal:absolute;mso-position-horizontal-relative:text;mso-position-vertical:absolute;mso-position-vertical-relative:text" from="24pt,4.05pt" to="24pt,40.05pt" o:gfxdata="UEsDBBQABgAIAAAAIQC2gziS/gAAAOEBAAATAAAAW0NvbnRlbnRfVHlwZXNdLnhtbJSRQU7DMBBF 90jcwfIWJU67QAgl6YK0S0CoHGBkTxKLZGx5TGhvj5O2G0SRWNoz/78nu9wcxkFMGNg6quQqL6RA 0s5Y6ir5vt9lD1JwBDIwOMJKHpHlpr69KfdHjyxSmriSfYz+USnWPY7AufNIadK6MEJMx9ApD/oD OlTrorhX2lFEilmcO2RdNtjC5xDF9pCuTyYBB5bi6bQ4syoJ3g9WQ0ymaiLzg5KdCXlKLjvcW893 SUOqXwnz5DrgnHtJTxOsQfEKIT7DmDSUCaxw7Rqn8787ZsmRM9e2VmPeBN4uqYvTtW7jvijg9N/y JsXecLq0q+WD6m8AAAD//wMAUEsDBBQABgAIAAAAIQA4/SH/1gAAAJQBAAALAAAAX3JlbHMvLnJl bHOkkMFqwzAMhu+DvYPRfXGawxijTi+j0GvpHsDYimMaW0Yy2fr2M4PBMnrbUb/Q94l/f/hMi1qR JVI2sOt6UJgd+ZiDgffL8ekFlFSbvV0oo4EbChzGx4f9GRdb25HMsYhqlCwG5lrLq9biZkxWOiqY 22YiTra2kYMu1l1tQD30/bPm3wwYN0x18gb45AdQl1tp5j/sFB2T0FQ7R0nTNEV3j6o9feQzro1i OWA14Fm+Q8a1a8+Bvu/d/dMb2JY5uiPbhG/ktn4cqGU/er3pcvwCAAD//wMAUEsDBBQABgAIAAAA IQB2XM8xrwEAAFgDAAAOAAAAZHJzL2Uyb0RvYy54bWysU01vEzEQvSPxHyzfidNCS7WK00OjckFQ ifIDpv7YteQveUw2+feMvSENcEPswWvPeN7Oe/N2c38Inu1NQZei5FerNWcmqqRdHCX//vz47o4z rBA1+BSN5EeD/H779s1mzoO5TlPy2hRGIBGHOUs+1ZoHIVBNJgCuUjaRkjaVAJWOZRS6wEzowYvr 9fpWzKnoXJIyiBTdLUm+7fjWGlW/WoumMi859Vb7Wvr60lax3cAwFsiTU6c24B+6COAiffQMtYMK 7Edxf0EFp0rCZOtKpSCStU6ZzoHYXK3/YPNtgmw6FxIH81km/H+w6sv+IT4VkmHOOGB+Ko3FwZbQ 3tQfO3SxjmexzKEytQQVRT/cfKQ5NB3Fa10uWD+ZFFjbSO5dbDRggP1nrMvVX1daOKZH530fhY9s lvz2/Q0NSwEZwnqotA1ZS45x5Az8SE5TtXRETN7pVt1w8IgPvrA90LDJIzrNz9QtZx6wUoIo9OfU 7G+lrZ0d4LQU99TijeAqGdS7IPndZbWP7YumW+xE6lXBtntJ+tiFFe1E4+sKnazW/HF5pv3lD7H9 CQAA//8DAFBLAwQUAAYACAAAACEAHxfvLNoAAAAGAQAADwAAAGRycy9kb3ducmV2LnhtbEyPy07D MBBF90j9B2sqsaN2WgRRiFNVRV2wKwEklm48eUA8jmKnDX/PwAaWR3d075l8O7tenHEMnScNyUqB QKq87ajR8PpyuElBhGjImt4TavjCANticZWbzPoLPeO5jI3gEgqZ0dDGOGRShqpFZ8LKD0ic1X50 JjKOjbSjuXC56+VaqTvpTEe80JoB9y1Wn+XkNEzHfa26w2b+eN+Ucnq6P7491o3W18t59wAi4hz/ juFHn9WhYKeTn8gG0Wu4TfmVqCFNQHD8iydGlYAscvlfv/gGAAD//wMAUEsBAi0AFAAGAAgAAAAh ALaDOJL+AAAA4QEAABMAAAAAAAAAAAAAAAAAAAAAAFtDb250ZW50X1R5cGVzXS54bWxQSwECLQAU AAYACAAAACEAOP0h/9YAAACUAQAACwAAAAAAAAAAAAAAAAAvAQAAX3JlbHMvLnJlbHNQSwECLQAU AAYACAAAACEAdlzPMa8BAABYAwAADgAAAAAAAAAAAAAAAAAuAgAAZHJzL2Uyb0RvYy54bWxQSwEC LQAUAAYACAAAACEAHxfvLNoAAAAGAQAADwAAAAAAAAAAAAAAAAAJBAAAZHJzL2Rvd25yZXYueG1s UEsFBgAAAAAEAAQA8wAAABAFAAAAAA== " strokecolor="windowText" strokeweight=".5pt">
-              <v:stroke joinstyle="miter"/>
-            </v:line>
-          </w:pict>
-        </mc:Fallback>
-      </mc:AlternateContent>
-    </w:r>
-  </w:p>
-</w:ftr>
+<ns0:ftr xmlns:ns0="http://schemas.openxmlformats.org/wordprocessingml/2006/main" xmlns:ns1="http://schemas.openxmlformats.org/markup-compatibility/2006" xmlns:ns10="urn:schemas-microsoft-com:office:word" xmlns:ns2="http://schemas.microsoft.com/office/word/2010/wordml" xmlns:ns3="http://schemas.openxmlformats.org/drawingml/2006/wordprocessingDrawing" xmlns:ns4="http://schemas.microsoft.com/office/word/2010/wordprocessingDrawing" xmlns:ns5="http://schemas.openxmlformats.org/drawingml/2006/main" xmlns:ns6="http://schemas.microsoft.com/office/word/2010/wordprocessingShape" xmlns:ns7="http://schemas.microsoft.com/office/mac/drawingml/2011/main" xmlns:ns8="urn:schemas-microsoft-com:vml" xmlns:ns9="urn:schemas-microsoft-com:office:office" ns1:Ignorable="w14 w15 w16se w16cid w16 w16cex w16sdtdh w16sdtfl w16du wp14">
+  <ns0:p ns2:paraId="03101AA3" ns2:textId="77777777" ns0:rsidR="008C47A6" ns0:rsidRDefault="00000000" ns0:rsidP="00E74375">
+    <ns0:r>
+      <ns0:rPr>
+        <ns0:noProof/>
+      </ns0:rPr>
+      <ns1:AlternateContent>
+        <ns1:Choice Requires="wps">
+          <ns0:drawing>
+            <ns3:anchor distT="0" distB="0" distL="114300" distR="114300" simplePos="0" relativeHeight="251661312" behindDoc="0" locked="0" layoutInCell="1" allowOverlap="1" ns4:anchorId="32FBE6F8" ns4:editId="03361862">
+              <ns3:simplePos x="0" y="0"/>
+              <ns3:positionH relativeFrom="page">
+                <ns3:posOffset>4058285</ns3:posOffset>
+              </ns3:positionH>
+              <ns3:positionV relativeFrom="page">
+                <ns3:posOffset>10132695</ns3:posOffset>
+              </ns3:positionV>
+              <ns3:extent cx="1714500" cy="342900"/>
+              <ns3:effectExtent l="0" t="0" r="0" b="0"/>
+              <ns3:wrapThrough wrapText="bothSides">
+                <ns3:wrapPolygon edited="0">
+                  <ns3:start x="480" y="0"/>
+                  <ns3:lineTo x="480" y="20400"/>
+                  <ns3:lineTo x="20880" y="20400"/>
+                  <ns3:lineTo x="20880" y="0"/>
+                  <ns3:lineTo x="480" y="0"/>
+                </ns3:wrapPolygon>
+              </ns3:wrapThrough>
+              <ns3:docPr id="1001260262" name="Text Box 10"/>
+              <ns3:cNvGraphicFramePr>
+                <ns5:graphicFrameLocks/>
+              </ns3:cNvGraphicFramePr>
+              <ns5:graphic>
+                <ns5:graphicData uri="http://schemas.microsoft.com/office/word/2010/wordprocessingShape">
+                  <ns6:wsp>
+                    <ns6:cNvSpPr txBox="1">
+                      <ns5:spLocks/>
+                    </ns6:cNvSpPr>
+                    <ns6:spPr>
+                      <ns5:xfrm>
+                        <ns5:off x="0" y="0"/>
+                        <ns5:ext cx="1714500" cy="342900"/>
+                      </ns5:xfrm>
+                      <ns5:prstGeom prst="rect">
+                        <ns5:avLst/>
+                      </ns5:prstGeom>
+                      <ns5:noFill/>
+                      <ns5:ln>
+                        <ns5:noFill/>
+                      </ns5:ln>
+                      <ns5:effectLst/>
+                      <ns5:extLst>
+                        <ns5:ext uri="{C572A759-6A51-4108-AA02-DFA0A04FC94B}">
+                          <ns7:wrappingTextBoxFlag/>
+                        </ns5:ext>
+                      </ns5:extLst>
+                    </ns6:spPr>
+                    <ns6:txbx>
+                      <ns0:txbxContent>
+                        <ns0:p ns2:paraId="3D0CA117" ns2:textId="77777777" ns0:rsidR="008C47A6" ns0:rsidRPr="00C954D2" ns0:rsidRDefault="00000000" ns0:rsidP="00E74375">
+                          <ns0:pPr>
+                            <ns0:rPr>
+                              <ns0:sz ns0:val="14"/>
+                              <ns0:szCs ns0:val="14"/>
+                              <ns0:lang ns0:val="es-ES_tradnl"/>
+                            </ns0:rPr>
+                          </ns0:pPr>
+                          <ns0:r ns0:rsidRPr="00C954D2">
+                            <ns0:rPr>
+                              <ns0:sz ns0:val="14"/>
+                              <ns0:szCs ns0:val="14"/>
+                              <ns0:lang ns0:val="es-ES_tradnl"/>
+                            </ns0:rPr>
+                            <ns0:t>Avda. de la Aurora, 55, entreplanta</ns0:t>
+                          </ns0:r>
+                        </ns0:p>
+                        <ns0:p ns2:paraId="288CCDB1" ns2:textId="77777777" ns0:rsidR="008C47A6" ns0:rsidRPr="00C954D2" ns0:rsidRDefault="00000000" ns0:rsidP="00E74375">
+                          <ns0:pPr>
+                            <ns0:rPr>
+                              <ns0:sz ns0:val="14"/>
+                              <ns0:szCs ns0:val="14"/>
+                              <ns0:lang ns0:val="es-ES_tradnl"/>
+                            </ns0:rPr>
+                          </ns0:pPr>
+                          <ns0:r ns0:rsidRPr="00C954D2">
+                            <ns0:rPr>
+                              <ns0:sz ns0:val="14"/>
+                              <ns0:szCs ns0:val="14"/>
+                              <ns0:lang ns0:val="es-ES_tradnl"/>
+                            </ns0:rPr>
+                            <ns0:t>29006 Málaga (España)</ns0:t>
+                          </ns0:r>
+                        </ns0:p>
+                      </ns0:txbxContent>
+                    </ns6:txbx>
+                    <ns6:bodyPr rot="0" spcFirstLastPara="0" vertOverflow="overflow" horzOverflow="overflow" vert="horz" wrap="square" lIns="91440" tIns="45720" rIns="91440" bIns="45720" numCol="1" spcCol="0" rtlCol="0" fromWordArt="0" anchor="t" anchorCtr="0" forceAA="0" compatLnSpc="1">
+                      <ns5:prstTxWarp prst="textNoShape">
+                        <ns5:avLst/>
+                      </ns5:prstTxWarp>
+                      <ns5:noAutofit/>
+                    </ns6:bodyPr>
+                  </ns6:wsp>
+                </ns5:graphicData>
+              </ns5:graphic>
+              <ns4:sizeRelH relativeFrom="margin">
+                <ns4:pctWidth>0</ns4:pctWidth>
+              </ns4:sizeRelH>
+              <ns4:sizeRelV relativeFrom="margin">
+                <ns4:pctHeight>0</ns4:pctHeight>
+              </ns4:sizeRelV>
+            </ns3:anchor>
+          </ns0:drawing>
+        </ns1:Choice>
+        <ns1:Fallback>
+          <ns0:pict>
+            <ns8:shapetype ns2:anchorId="32FBE6F8" id="_x0000_t202" coordsize="21600,21600" ns9:spt="202" path="m,l,21600r21600,l21600,xe">
+              <ns8:stroke joinstyle="miter"/>
+              <ns8:path gradientshapeok="t" ns9:connecttype="rect"/>
+            </ns8:shapetype>
+            <ns8:shape id="_x0000_s1032" type="#_x0000_t202" style="position:absolute;left:0;text-align:left;margin-left:319.55pt;margin-top:797.85pt;width:135pt;height:27pt;z-index:251661312;visibility:visible;mso-wrap-style:square;mso-width-percent:0;mso-height-percent:0;mso-wrap-distance-left:9pt;mso-wrap-distance-top:0;mso-wrap-distance-right:9pt;mso-wrap-distance-bottom:0;mso-position-horizontal:absolute;mso-position-horizontal-relative:page;mso-position-vertical:absolute;mso-position-vertical-relative:page;mso-width-percent:0;mso-height-percent:0;mso-width-relative:margin;mso-height-relative:margin;v-text-anchor:top" ns9:gfxdata="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" filled="f" stroked="f">
+              <ns8:textbox>
+                <ns0:txbxContent>
+                  <ns0:p ns2:paraId="3D0CA117" ns2:textId="77777777" ns0:rsidR="008C47A6" ns0:rsidRPr="00C954D2" ns0:rsidRDefault="00000000" ns0:rsidP="00E74375">
+                    <ns0:pPr>
+                      <ns0:rPr>
+                        <ns0:sz ns0:val="14"/>
+                        <ns0:szCs ns0:val="14"/>
+                        <ns0:lang ns0:val="es-ES_tradnl"/>
+                      </ns0:rPr>
+                    </ns0:pPr>
+                    <ns0:r ns0:rsidRPr="00C954D2">
+                      <ns0:rPr>
+                        <ns0:sz ns0:val="14"/>
+                        <ns0:szCs ns0:val="14"/>
+                        <ns0:lang ns0:val="es-ES_tradnl"/>
+                      </ns0:rPr>
+                      <ns0:t>Avda. de la Aurora, 55, entreplanta</ns0:t>
+                    </ns0:r>
+                  </ns0:p>
+                  <ns0:p ns2:paraId="288CCDB1" ns2:textId="77777777" ns0:rsidR="008C47A6" ns0:rsidRPr="00C954D2" ns0:rsidRDefault="00000000" ns0:rsidP="00E74375">
+                    <ns0:pPr>
+                      <ns0:rPr>
+                        <ns0:sz ns0:val="14"/>
+                        <ns0:szCs ns0:val="14"/>
+                        <ns0:lang ns0:val="es-ES_tradnl"/>
+                      </ns0:rPr>
+                    </ns0:pPr>
+                    <ns0:r ns0:rsidRPr="00C954D2">
+                      <ns0:rPr>
+                        <ns0:sz ns0:val="14"/>
+                        <ns0:szCs ns0:val="14"/>
+                        <ns0:lang ns0:val="es-ES_tradnl"/>
+                      </ns0:rPr>
+                      <ns0:t>29006 Málaga (España)</ns0:t>
+                    </ns0:r>
+                  </ns0:p>
+                </ns0:txbxContent>
+              </ns8:textbox>
+              <ns10:wrap type="through" anchorx="page" anchory="page"/>
+            </ns8:shape>
+          </ns0:pict>
+        </ns1:Fallback>
+      </ns1:AlternateContent>
+    </ns0:r>
+    <ns0:r>
+      <ns0:rPr>
+        <ns0:noProof/>
+      </ns0:rPr>
+      <ns1:AlternateContent>
+        <ns1:Choice Requires="wps">
+          <ns0:drawing>
+            <ns3:anchor distT="0" distB="0" distL="114300" distR="114300" simplePos="0" relativeHeight="251651072" behindDoc="0" locked="0" layoutInCell="1" allowOverlap="1" ns4:anchorId="003E73B6" ns4:editId="76E9C323">
+              <ns3:simplePos x="0" y="0"/>
+              <ns3:positionH relativeFrom="page">
+                <ns3:posOffset>1429385</ns3:posOffset>
+              </ns3:positionH>
+              <ns3:positionV relativeFrom="page">
+                <ns3:posOffset>10132695</ns3:posOffset>
+              </ns3:positionV>
+              <ns3:extent cx="800100" cy="342900"/>
+              <ns3:effectExtent l="0" t="0" r="0" b="0"/>
+              <ns3:wrapThrough wrapText="bothSides">
+                <ns3:wrapPolygon edited="0">
+                  <ns3:start x="1029" y="0"/>
+                  <ns3:lineTo x="1029" y="20400"/>
+                  <ns3:lineTo x="20057" y="20400"/>
+                  <ns3:lineTo x="20057" y="0"/>
+                  <ns3:lineTo x="1029" y="0"/>
+                </ns3:wrapPolygon>
+              </ns3:wrapThrough>
+              <ns3:docPr id="1027357469" name="Text Box 10"/>
+              <ns3:cNvGraphicFramePr>
+                <ns5:graphicFrameLocks/>
+              </ns3:cNvGraphicFramePr>
+              <ns5:graphic>
+                <ns5:graphicData uri="http://schemas.microsoft.com/office/word/2010/wordprocessingShape">
+                  <ns6:wsp>
+                    <ns6:cNvSpPr txBox="1">
+                      <ns5:spLocks/>
+                    </ns6:cNvSpPr>
+                    <ns6:spPr>
+                      <ns5:xfrm>
+                        <ns5:off x="0" y="0"/>
+                        <ns5:ext cx="800100" cy="342900"/>
+                      </ns5:xfrm>
+                      <ns5:prstGeom prst="rect">
+                        <ns5:avLst/>
+                      </ns5:prstGeom>
+                      <ns5:noFill/>
+                      <ns5:ln>
+                        <ns5:noFill/>
+                      </ns5:ln>
+                      <ns5:effectLst/>
+                      <ns5:extLst>
+                        <ns5:ext uri="{C572A759-6A51-4108-AA02-DFA0A04FC94B}">
+                          <ns7:wrappingTextBoxFlag/>
+                        </ns5:ext>
+                      </ns5:extLst>
+                    </ns6:spPr>
+                    <ns6:txbx>
+                      <ns0:txbxContent>
+                        <ns0:p ns2:paraId="0BB74093" ns2:textId="77777777" ns0:rsidR="008C47A6" ns0:rsidRPr="00C954D2" ns0:rsidRDefault="00000000" ns0:rsidP="00E74375">
+                          <ns0:pPr>
+                            <ns0:rPr>
+                              <ns0:sz ns0:val="14"/>
+                              <ns0:szCs ns0:val="12"/>
+                              <ns0:lang ns0:val="es-ES_tradnl"/>
+                            </ns0:rPr>
+                          </ns0:pPr>
+                          <ns0:r ns0:rsidRPr="00C954D2">
+                            <ns0:rPr>
+                              <ns0:sz ns0:val="14"/>
+                              <ns0:szCs ns0:val="12"/>
+                              <ns0:lang ns0:val="es-ES_tradnl"/>
+                            </ns0:rPr>
+                            <ns0:t>952 04 10 47</ns0:t>
+                          </ns0:r>
+                        </ns0:p>
+                        <ns0:p ns2:paraId="103505BF" ns2:textId="77777777" ns0:rsidR="008C47A6" ns0:rsidRPr="00C954D2" ns0:rsidRDefault="00000000" ns0:rsidP="00E74375">
+                          <ns0:pPr>
+                            <ns0:rPr>
+                              <ns0:sz ns0:val="14"/>
+                              <ns0:szCs ns0:val="14"/>
+                              <ns0:lang ns0:val="es-ES_tradnl"/>
+                            </ns0:rPr>
+                          </ns0:pPr>
+                          <ns0:r ns0:rsidRPr="00C954D2">
+                            <ns0:rPr>
+                              <ns0:sz ns0:val="14"/>
+                              <ns0:szCs ns0:val="14"/>
+                              <ns0:lang ns0:val="es-ES_tradnl"/>
+                            </ns0:rPr>
+                            <ns0:t>952 34 41 00</ns0:t>
+                          </ns0:r>
+                        </ns0:p>
+                      </ns0:txbxContent>
+                    </ns6:txbx>
+                    <ns6:bodyPr rot="0" spcFirstLastPara="0" vertOverflow="overflow" horzOverflow="overflow" vert="horz" wrap="square" lIns="91440" tIns="45720" rIns="91440" bIns="45720" numCol="1" spcCol="0" rtlCol="0" fromWordArt="0" anchor="t" anchorCtr="0" forceAA="0" compatLnSpc="1">
+                      <ns5:prstTxWarp prst="textNoShape">
+                        <ns5:avLst/>
+                      </ns5:prstTxWarp>
+                      <ns5:noAutofit/>
+                    </ns6:bodyPr>
+                  </ns6:wsp>
+                </ns5:graphicData>
+              </ns5:graphic>
+              <ns4:sizeRelH relativeFrom="margin">
+                <ns4:pctWidth>0</ns4:pctWidth>
+              </ns4:sizeRelH>
+              <ns4:sizeRelV relativeFrom="margin">
+                <ns4:pctHeight>0</ns4:pctHeight>
+              </ns4:sizeRelV>
+            </ns3:anchor>
+          </ns0:drawing>
+        </ns1:Choice>
+        <ns1:Fallback>
+          <ns0:pict>
+            <ns8:shape ns2:anchorId="003E73B6" id="_x0000_s1033" type="#_x0000_t202" style="position:absolute;left:0;text-align:left;margin-left:112.55pt;margin-top:797.85pt;width:63pt;height:27pt;z-index:251651072;visibility:visible;mso-wrap-style:square;mso-width-percent:0;mso-height-percent:0;mso-wrap-distance-left:9pt;mso-wrap-distance-top:0;mso-wrap-distance-right:9pt;mso-wrap-distance-bottom:0;mso-position-horizontal:absolute;mso-position-horizontal-relative:page;mso-position-vertical:absolute;mso-position-vertical-relative:page;mso-width-percent:0;mso-height-percent:0;mso-width-relative:margin;mso-height-relative:margin;v-text-anchor:top" ns9:gfxdata="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" filled="f" stroked="f">
+              <ns8:textbox>
+                <ns0:txbxContent>
+                  <ns0:p ns2:paraId="0BB74093" ns2:textId="77777777" ns0:rsidR="008C47A6" ns0:rsidRPr="00C954D2" ns0:rsidRDefault="00000000" ns0:rsidP="00E74375">
+                    <ns0:pPr>
+                      <ns0:rPr>
+                        <ns0:sz ns0:val="14"/>
+                        <ns0:szCs ns0:val="12"/>
+                        <ns0:lang ns0:val="es-ES_tradnl"/>
+                      </ns0:rPr>
+                    </ns0:pPr>
+                    <ns0:r ns0:rsidRPr="00C954D2">
+                      <ns0:rPr>
+                        <ns0:sz ns0:val="14"/>
+                        <ns0:szCs ns0:val="12"/>
+                        <ns0:lang ns0:val="es-ES_tradnl"/>
+                      </ns0:rPr>
+                      <ns0:t>952 04 10 47</ns0:t>
+                    </ns0:r>
+                  </ns0:p>
+                  <ns0:p ns2:paraId="103505BF" ns2:textId="77777777" ns0:rsidR="008C47A6" ns0:rsidRPr="00C954D2" ns0:rsidRDefault="00000000" ns0:rsidP="00E74375">
+                    <ns0:pPr>
+                      <ns0:rPr>
+                        <ns0:sz ns0:val="14"/>
+                        <ns0:szCs ns0:val="14"/>
+                        <ns0:lang ns0:val="es-ES_tradnl"/>
+                      </ns0:rPr>
+                    </ns0:pPr>
+                    <ns0:r ns0:rsidRPr="00C954D2">
+                      <ns0:rPr>
+                        <ns0:sz ns0:val="14"/>
+                        <ns0:szCs ns0:val="14"/>
+                        <ns0:lang ns0:val="es-ES_tradnl"/>
+                      </ns0:rPr>
+                      <ns0:t>952 34 41 00</ns0:t>
+                    </ns0:r>
+                  </ns0:p>
+                </ns0:txbxContent>
+              </ns8:textbox>
+              <ns10:wrap type="through" anchorx="page" anchory="page"/>
+            </ns8:shape>
+          </ns0:pict>
+        </ns1:Fallback>
+      </ns1:AlternateContent>
+    </ns0:r>
+    <ns0:r>
+      <ns0:rPr>
+        <ns0:noProof/>
+      </ns0:rPr>
+      <ns1:AlternateContent>
+        <ns1:Choice Requires="wps">
+          <ns0:drawing>
+            <ns3:anchor distT="0" distB="0" distL="114300" distR="114300" simplePos="0" relativeHeight="251657216" behindDoc="0" locked="0" layoutInCell="1" allowOverlap="1" ns4:anchorId="00F01480" ns4:editId="154F1AE4">
+              <ns3:simplePos x="0" y="0"/>
+              <ns3:positionH relativeFrom="page">
+                <ns3:posOffset>2686685</ns3:posOffset>
+              </ns3:positionH>
+              <ns3:positionV relativeFrom="page">
+                <ns3:posOffset>10132695</ns3:posOffset>
+              </ns3:positionV>
+              <ns3:extent cx="1371600" cy="342900"/>
+              <ns3:effectExtent l="0" t="0" r="0" b="0"/>
+              <ns3:wrapThrough wrapText="bothSides">
+                <ns3:wrapPolygon edited="0">
+                  <ns3:start x="600" y="0"/>
+                  <ns3:lineTo x="600" y="20400"/>
+                  <ns3:lineTo x="20700" y="20400"/>
+                  <ns3:lineTo x="20700" y="0"/>
+                  <ns3:lineTo x="600" y="0"/>
+                </ns3:wrapPolygon>
+              </ns3:wrapThrough>
+              <ns3:docPr id="1609113100" name="Text Box 10"/>
+              <ns3:cNvGraphicFramePr>
+                <ns5:graphicFrameLocks/>
+              </ns3:cNvGraphicFramePr>
+              <ns5:graphic>
+                <ns5:graphicData uri="http://schemas.microsoft.com/office/word/2010/wordprocessingShape">
+                  <ns6:wsp>
+                    <ns6:cNvSpPr txBox="1">
+                      <ns5:spLocks/>
+                    </ns6:cNvSpPr>
+                    <ns6:spPr>
+                      <ns5:xfrm>
+                        <ns5:off x="0" y="0"/>
+                        <ns5:ext cx="1371600" cy="342900"/>
+                      </ns5:xfrm>
+                      <ns5:prstGeom prst="rect">
+                        <ns5:avLst/>
+                      </ns5:prstGeom>
+                      <ns5:noFill/>
+                      <ns5:ln>
+                        <ns5:noFill/>
+                      </ns5:ln>
+                      <ns5:effectLst/>
+                      <ns5:extLst>
+                        <ns5:ext uri="{C572A759-6A51-4108-AA02-DFA0A04FC94B}">
+                          <ns7:wrappingTextBoxFlag/>
+                        </ns5:ext>
+                      </ns5:extLst>
+                    </ns6:spPr>
+                    <ns6:txbx>
+                      <ns0:txbxContent>
+                        <ns0:p ns2:paraId="35669EAE" ns2:textId="77777777" ns0:rsidR="008C47A6" ns0:rsidRPr="00C954D2" ns0:rsidRDefault="00000000" ns0:rsidP="00E74375">
+                          <ns0:pPr>
+                            <ns0:rPr>
+                              <ns0:sz ns0:val="14"/>
+                              <ns0:szCs ns0:val="14"/>
+                              <ns0:lang ns0:val="es-ES_tradnl"/>
+                            </ns0:rPr>
+                          </ns0:pPr>
+                          <ns0:r ns0:rsidRPr="00C954D2">
+                            <ns0:rPr>
+                              <ns0:sz ns0:val="14"/>
+                              <ns0:szCs ns0:val="14"/>
+                              <ns0:lang ns0:val="es-ES_tradnl"/>
+                            </ns0:rPr>
+                            <ns0:t>edp@edp-sl.com</ns0:t>
+                          </ns0:r>
+                        </ns0:p>
+                        <ns0:p ns2:paraId="3CE25765" ns2:textId="77777777" ns0:rsidR="008C47A6" ns0:rsidRPr="00C954D2" ns0:rsidRDefault="00000000" ns0:rsidP="00E74375">
+                          <ns0:pPr>
+                            <ns0:rPr>
+                              <ns0:color ns0:val="0070C0"/>
+                              <ns0:sz ns0:val="14"/>
+                              <ns0:szCs ns0:val="14"/>
+                              <ns0:lang ns0:val="es-ES_tradnl"/>
+                            </ns0:rPr>
+                          </ns0:pPr>
+                          <ns0:r ns0:rsidRPr="00C954D2">
+                            <ns0:rPr>
+                              <ns0:color ns0:val="0070C0"/>
+                              <ns0:sz ns0:val="14"/>
+                              <ns0:szCs ns0:val="14"/>
+                              <ns0:lang ns0:val="es-ES_tradnl"/>
+                            </ns0:rPr>
+                            <ns0:t>www.edp-sl.com</ns0:t>
+                          </ns0:r>
+                        </ns0:p>
+                      </ns0:txbxContent>
+                    </ns6:txbx>
+                    <ns6:bodyPr rot="0" spcFirstLastPara="0" vertOverflow="overflow" horzOverflow="overflow" vert="horz" wrap="square" lIns="91440" tIns="45720" rIns="91440" bIns="45720" numCol="1" spcCol="0" rtlCol="0" fromWordArt="0" anchor="t" anchorCtr="0" forceAA="0" compatLnSpc="1">
+                      <ns5:prstTxWarp prst="textNoShape">
+                        <ns5:avLst/>
+                      </ns5:prstTxWarp>
+                      <ns5:noAutofit/>
+                    </ns6:bodyPr>
+                  </ns6:wsp>
+                </ns5:graphicData>
+              </ns5:graphic>
+              <ns4:sizeRelH relativeFrom="margin">
+                <ns4:pctWidth>0</ns4:pctWidth>
+              </ns4:sizeRelH>
+              <ns4:sizeRelV relativeFrom="margin">
+                <ns4:pctHeight>0</ns4:pctHeight>
+              </ns4:sizeRelV>
+            </ns3:anchor>
+          </ns0:drawing>
+        </ns1:Choice>
+        <ns1:Fallback>
+          <ns0:pict>
+            <ns8:shape ns2:anchorId="00F01480" id="_x0000_s1034" type="#_x0000_t202" style="position:absolute;left:0;text-align:left;margin-left:211.55pt;margin-top:797.85pt;width:108pt;height:27pt;z-index:251657216;visibility:visible;mso-wrap-style:square;mso-width-percent:0;mso-height-percent:0;mso-wrap-distance-left:9pt;mso-wrap-distance-top:0;mso-wrap-distance-right:9pt;mso-wrap-distance-bottom:0;mso-position-horizontal:absolute;mso-position-horizontal-relative:page;mso-position-vertical:absolute;mso-position-vertical-relative:page;mso-width-percent:0;mso-height-percent:0;mso-width-relative:margin;mso-height-relative:margin;v-text-anchor:top" ns9:gfxdata="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" filled="f" stroked="f">
+              <ns8:textbox>
+                <ns0:txbxContent>
+                  <ns0:p ns2:paraId="35669EAE" ns2:textId="77777777" ns0:rsidR="008C47A6" ns0:rsidRPr="00C954D2" ns0:rsidRDefault="00000000" ns0:rsidP="00E74375">
+                    <ns0:pPr>
+                      <ns0:rPr>
+                        <ns0:sz ns0:val="14"/>
+                        <ns0:szCs ns0:val="14"/>
+                        <ns0:lang ns0:val="es-ES_tradnl"/>
+                      </ns0:rPr>
+                    </ns0:pPr>
+                    <ns0:r ns0:rsidRPr="00C954D2">
+                      <ns0:rPr>
+                        <ns0:sz ns0:val="14"/>
+                        <ns0:szCs ns0:val="14"/>
+                        <ns0:lang ns0:val="es-ES_tradnl"/>
+                      </ns0:rPr>
+                      <ns0:t>edp@edp-sl.com</ns0:t>
+                    </ns0:r>
+                  </ns0:p>
+                  <ns0:p ns2:paraId="3CE25765" ns2:textId="77777777" ns0:rsidR="008C47A6" ns0:rsidRPr="00C954D2" ns0:rsidRDefault="00000000" ns0:rsidP="00E74375">
+                    <ns0:pPr>
+                      <ns0:rPr>
+                        <ns0:color ns0:val="0070C0"/>
+                        <ns0:sz ns0:val="14"/>
+                        <ns0:szCs ns0:val="14"/>
+                        <ns0:lang ns0:val="es-ES_tradnl"/>
+                      </ns0:rPr>
+                    </ns0:pPr>
+                    <ns0:r ns0:rsidRPr="00C954D2">
+                      <ns0:rPr>
+                        <ns0:color ns0:val="0070C0"/>
+                        <ns0:sz ns0:val="14"/>
+                        <ns0:szCs ns0:val="14"/>
+                        <ns0:lang ns0:val="es-ES_tradnl"/>
+                      </ns0:rPr>
+                      <ns0:t>www.edp-sl.com</ns0:t>
+                    </ns0:r>
+                  </ns0:p>
+                </ns0:txbxContent>
+              </ns8:textbox>
+              <ns10:wrap type="through" anchorx="page" anchory="page"/>
+            </ns8:shape>
+          </ns0:pict>
+        </ns1:Fallback>
+      </ns1:AlternateContent>
+    </ns0:r>
+    <ns0:r>
+      <ns0:rPr>
+        <ns0:noProof/>
+      </ns0:rPr>
+      <ns1:AlternateContent>
+        <ns1:Choice Requires="wps">
+          <ns0:drawing>
+            <ns3:anchor distT="0" distB="0" distL="114300" distR="114300" simplePos="0" relativeHeight="251663360" behindDoc="0" locked="0" layoutInCell="1" allowOverlap="1" ns4:anchorId="16C74CA3" ns4:editId="76D3C3D8">
+              <ns3:simplePos x="0" y="0"/>
+              <ns3:positionH relativeFrom="column">
+                <ns3:posOffset>2971800</ns3:posOffset>
+              </ns3:positionH>
+              <ns3:positionV relativeFrom="paragraph">
+                <ns3:posOffset>226695</ns3:posOffset>
+              </ns3:positionV>
+              <ns3:extent cx="0" cy="457200"/>
+              <ns3:effectExtent l="0" t="0" r="38100" b="19050"/>
+              <ns3:wrapNone/>
+              <ns3:docPr id="1039025773" name="Conector recto 1039025773"/>
+              <ns3:cNvGraphicFramePr/>
+              <ns5:graphic>
+                <ns5:graphicData uri="http://schemas.microsoft.com/office/word/2010/wordprocessingShape">
+                  <ns6:wsp>
+                    <ns6:cNvCnPr/>
+                    <ns6:spPr>
+                      <ns5:xfrm>
+                        <ns5:off x="0" y="0"/>
+                        <ns5:ext cx="0" cy="457200"/>
+                      </ns5:xfrm>
+                      <ns5:prstGeom prst="line">
+                        <ns5:avLst/>
+                      </ns5:prstGeom>
+                      <ns5:noFill/>
+                      <ns5:ln w="6350" cap="flat" cmpd="sng" algn="ctr">
+                        <ns5:solidFill>
+                          <ns5:sysClr val="windowText" lastClr="000000"/>
+                        </ns5:solidFill>
+                        <ns5:prstDash val="solid"/>
+                        <ns5:miter lim="800000"/>
+                      </ns5:ln>
+                      <ns5:effectLst/>
+                    </ns6:spPr>
+                    <ns6:bodyPr/>
+                  </ns6:wsp>
+                </ns5:graphicData>
+              </ns5:graphic>
+            </ns3:anchor>
+          </ns0:drawing>
+        </ns1:Choice>
+        <ns1:Fallback>
+          <ns0:pict>
+            <ns8:line ns2:anchorId="3B8E2307" id="Conector recto 28" ns9:spid="_x0000_s1026" style="position:absolute;z-index:251668480;visibility:visible;mso-wrap-style:square;mso-wrap-distance-left:9pt;mso-wrap-distance-top:0;mso-wrap-distance-right:9pt;mso-wrap-distance-bottom:0;mso-position-horizontal:absolute;mso-position-horizontal-relative:text;mso-position-vertical:absolute;mso-position-vertical-relative:text" from="234pt,17.85pt" to="234pt,53.85pt" ns9:gfxdata="UEsDBBQABgAIAAAAIQC2gziS/gAAAOEBAAATAAAAW0NvbnRlbnRfVHlwZXNdLnhtbJSRQU7DMBBF 90jcwfIWJU67QAgl6YK0S0CoHGBkTxKLZGx5TGhvj5O2G0SRWNoz/78nu9wcxkFMGNg6quQqL6RA 0s5Y6ir5vt9lD1JwBDIwOMJKHpHlpr69KfdHjyxSmriSfYz+USnWPY7AufNIadK6MEJMx9ApD/oD OlTrorhX2lFEilmcO2RdNtjC5xDF9pCuTyYBB5bi6bQ4syoJ3g9WQ0ymaiLzg5KdCXlKLjvcW893 SUOqXwnz5DrgnHtJTxOsQfEKIT7DmDSUCaxw7Rqn8787ZsmRM9e2VmPeBN4uqYvTtW7jvijg9N/y JsXecLq0q+WD6m8AAAD//wMAUEsDBBQABgAIAAAAIQA4/SH/1gAAAJQBAAALAAAAX3JlbHMvLnJl bHOkkMFqwzAMhu+DvYPRfXGawxijTi+j0GvpHsDYimMaW0Yy2fr2M4PBMnrbUb/Q94l/f/hMi1qR JVI2sOt6UJgd+ZiDgffL8ekFlFSbvV0oo4EbChzGx4f9GRdb25HMsYhqlCwG5lrLq9biZkxWOiqY 22YiTra2kYMu1l1tQD30/bPm3wwYN0x18gb45AdQl1tp5j/sFB2T0FQ7R0nTNEV3j6o9feQzro1i OWA14Fm+Q8a1a8+Bvu/d/dMb2JY5uiPbhG/ktn4cqGU/er3pcvwCAAD//wMAUEsDBBQABgAIAAAA IQB2XM8xrwEAAFgDAAAOAAAAZHJzL2Uyb0RvYy54bWysU01vEzEQvSPxHyzfidNCS7WK00OjckFQ ifIDpv7YteQveUw2+feMvSENcEPswWvPeN7Oe/N2c38Inu1NQZei5FerNWcmqqRdHCX//vz47o4z rBA1+BSN5EeD/H779s1mzoO5TlPy2hRGIBGHOUs+1ZoHIVBNJgCuUjaRkjaVAJWOZRS6wEzowYvr 9fpWzKnoXJIyiBTdLUm+7fjWGlW/WoumMi859Vb7Wvr60lax3cAwFsiTU6c24B+6COAiffQMtYMK 7Edxf0EFp0rCZOtKpSCStU6ZzoHYXK3/YPNtgmw6FxIH81km/H+w6sv+IT4VkmHOOGB+Ko3FwZbQ 3tQfO3SxjmexzKEytQQVRT/cfKQ5NB3Fa10uWD+ZFFjbSO5dbDRggP1nrMvVX1daOKZH530fhY9s lvz2/Q0NSwEZwnqotA1ZS45x5Az8SE5TtXRETN7pVt1w8IgPvrA90LDJIzrNz9QtZx6wUoIo9OfU 7G+lrZ0d4LQU99TijeAqGdS7IPndZbWP7YumW+xE6lXBtntJ+tiFFe1E4+sKnazW/HF5pv3lD7H9 CQAA//8DAFBLAwQUAAYACAAAACEAsPHN7N4AAAAKAQAADwAAAGRycy9kb3ducmV2LnhtbEyPTU/D MAyG70j8h8hI3FgChXXqmk5oaAduo4DEMWvcj9E4VZNu5d9jxAGOth+9ft58M7tenHAMnScNtwsF AqnytqNGw9vr7mYFIkRD1vSeUMMXBtgUlxe5yaw/0wueytgIDqGQGQ1tjEMmZahadCYs/IDEt9qP zkQex0ba0Zw53PXyTqmldKYj/tCaAbctVp/l5DRM+22tul0yHz+SUk7P6f79qW60vr6aH9cgIs7x D4YffVaHgp0OfiIbRK/hfrniLlFD8pCCYOB3cWBSpSnIIpf/KxTfAAAA//8DAFBLAQItABQABgAI AAAAIQC2gziS/gAAAOEBAAATAAAAAAAAAAAAAAAAAAAAAABbQ29udGVudF9UeXBlc10ueG1sUEsB Ai0AFAAGAAgAAAAhADj9If/WAAAAlAEAAAsAAAAAAAAAAAAAAAAALwEAAF9yZWxzLy5yZWxzUEsB Ai0AFAAGAAgAAAAhAHZczzGvAQAAWAMAAA4AAAAAAAAAAAAAAAAALgIAAGRycy9lMm9Eb2MueG1s UEsBAi0AFAAGAAgAAAAhALDxzezeAAAACgEAAA8AAAAAAAAAAAAAAAAACQQAAGRycy9kb3ducmV2 LnhtbFBLBQYAAAAABAAEAPMAAAAUBQAAAAA= " strokecolor="windowText" strokeweight=".5pt">
+              <ns8:stroke joinstyle="miter"/>
+            </ns8:line>
+          </ns0:pict>
+        </ns1:Fallback>
+      </ns1:AlternateContent>
+    </ns0:r>
+    <ns0:r>
+      <ns0:rPr>
+        <ns0:noProof/>
+      </ns0:rPr>
+      <ns1:AlternateContent>
+        <ns1:Choice Requires="wps">
+          <ns0:drawing>
+            <ns3:anchor distT="0" distB="0" distL="114300" distR="114300" simplePos="0" relativeHeight="251653120" behindDoc="0" locked="0" layoutInCell="1" allowOverlap="1" ns4:anchorId="350D279F" ns4:editId="54B5E171">
+              <ns3:simplePos x="0" y="0"/>
+              <ns3:positionH relativeFrom="column">
+                <ns3:posOffset>228600</ns3:posOffset>
+              </ns3:positionH>
+              <ns3:positionV relativeFrom="paragraph">
+                <ns3:posOffset>112395</ns3:posOffset>
+              </ns3:positionV>
+              <ns3:extent cx="6400800" cy="0"/>
+              <ns3:effectExtent l="0" t="0" r="25400" b="25400"/>
+              <ns3:wrapNone/>
+              <ns3:docPr id="1493930639" name="Conector recto 1493930639"/>
+              <ns3:cNvGraphicFramePr/>
+              <ns5:graphic>
+                <ns5:graphicData uri="http://schemas.microsoft.com/office/word/2010/wordprocessingShape">
+                  <ns6:wsp>
+                    <ns6:cNvCnPr/>
+                    <ns6:spPr>
+                      <ns5:xfrm>
+                        <ns5:off x="0" y="0"/>
+                        <ns5:ext cx="6400800" cy="0"/>
+                      </ns5:xfrm>
+                      <ns5:prstGeom prst="line">
+                        <ns5:avLst/>
+                      </ns5:prstGeom>
+                      <ns5:noFill/>
+                      <ns5:ln w="6350" cap="flat" cmpd="sng" algn="ctr">
+                        <ns5:solidFill>
+                          <ns5:srgbClr val="5B9BD5"/>
+                        </ns5:solidFill>
+                        <ns5:prstDash val="solid"/>
+                        <ns5:miter lim="800000"/>
+                      </ns5:ln>
+                      <ns5:effectLst/>
+                    </ns6:spPr>
+                    <ns6:bodyPr/>
+                  </ns6:wsp>
+                </ns5:graphicData>
+              </ns5:graphic>
+            </ns3:anchor>
+          </ns0:drawing>
+        </ns1:Choice>
+        <ns1:Fallback>
+          <ns0:pict>
+            <ns8:line ns2:anchorId="256B0012" id="Conector recto 217511060" ns9:spid="_x0000_s1026" style="position:absolute;z-index:251663360;visibility:visible;mso-wrap-style:square;mso-wrap-distance-left:9pt;mso-wrap-distance-top:0;mso-wrap-distance-right:9pt;mso-wrap-distance-bottom:0;mso-position-horizontal:absolute;mso-position-horizontal-relative:text;mso-position-vertical:absolute;mso-position-vertical-relative:text" from="18pt,8.85pt" to="522pt,8.85pt" ns9:gfxdata="UEsDBBQABgAIAAAAIQC2gziS/gAAAOEBAAATAAAAW0NvbnRlbnRfVHlwZXNdLnhtbJSRQU7DMBBF 90jcwfIWJU67QAgl6YK0S0CoHGBkTxKLZGx5TGhvj5O2G0SRWNoz/78nu9wcxkFMGNg6quQqL6RA 0s5Y6ir5vt9lD1JwBDIwOMJKHpHlpr69KfdHjyxSmriSfYz+USnWPY7AufNIadK6MEJMx9ApD/oD OlTrorhX2lFEilmcO2RdNtjC5xDF9pCuTyYBB5bi6bQ4syoJ3g9WQ0ymaiLzg5KdCXlKLjvcW893 SUOqXwnz5DrgnHtJTxOsQfEKIT7DmDSUCaxw7Rqn8787ZsmRM9e2VmPeBN4uqYvTtW7jvijg9N/y JsXecLq0q+WD6m8AAAD//wMAUEsDBBQABgAIAAAAIQA4/SH/1gAAAJQBAAALAAAAX3JlbHMvLnJl bHOkkMFqwzAMhu+DvYPRfXGawxijTi+j0GvpHsDYimMaW0Yy2fr2M4PBMnrbUb/Q94l/f/hMi1qR JVI2sOt6UJgd+ZiDgffL8ekFlFSbvV0oo4EbChzGx4f9GRdb25HMsYhqlCwG5lrLq9biZkxWOiqY 22YiTra2kYMu1l1tQD30/bPm3wwYN0x18gb45AdQl1tp5j/sFB2T0FQ7R0nTNEV3j6o9feQzro1i OWA14Fm+Q8a1a8+Bvu/d/dMb2JY5uiPbhG/ktn4cqGU/er3pcvwCAAD//wMAUEsDBBQABgAIAAAA IQASzCNUqwEAAEUDAAAOAAAAZHJzL2Uyb0RvYy54bWysUk1v2zAMvQ/YfxB0X+x2S9EZcQq0QXsp tgLbfgAjS7YAfYHU4uTfl1LStOtuw3yQKZF65Ht6q5u9d2KnkWwMvbxYtFLooOJgw9jLXz/vP11L QRnCAC4G3cuDJnmz/vhhNadOX8YpukGjYJBA3Zx6OeWcuqYhNWkPtIhJB06aiB4yb3FsBoSZ0b1r Ltv2qpkjDgmj0kR8ujkm5briG6NV/m4M6SxcL3m2XFes67aszXoF3YiQJqtOY8A/TOHBBm56htpA BvEb7V9Q3iqMFE1eqOibaIxVunJgNhftOzY/Jki6cmFxKJ1lov8Hq77t7sITsgxzoo7SExYWe4O+ /Hk+sa9iHc5i6X0Wig+vvrTtdcuaqpdc83oxIeUHHb0oQS+dDYUHdLB7pMzNuPSlpByHeG+dq2/h gpgZ/POyIAM7wjjIHPo09JLCKAW4ka2mMlZEis4O5XbBIRy3dw7FDvi5l7dfbzfL8sLc7Y+y0noD NB3raupoBG8zu9FZ30umxt/ptgsFXVc/nQi8ylWibRwOVcWm7PitatOTr4oZ3u45fuv+9TMAAAD/ /wMAUEsDBBQABgAIAAAAIQAyLg083QAAAAkBAAAPAAAAZHJzL2Rvd25yZXYueG1sTI9BSwMxEIXv gv8hjODNJmptZd1sKYJQQQqtgnrLbsbdxWSyJGm7/nun9KDH+d7jzXvlYvRO7DGmPpCG64kCgdQE 21Or4e316eoeRMqGrHGBUMMPJlhU52elKWw40Ab329wKDqFUGA1dzkMhZWo69CZNwoDE2leI3mQ+ YyttNAcO907eKDWT3vTEHzoz4GOHzfd25zXU6xg/7j7fB7d82aj1mFYhPq+0vrwYlw8gMo75zwzH +lwdKu5Uhx3ZJJyG2xlPyczncxBHXU2nTOoTkVUp/y+ofgEAAP//AwBQSwECLQAUAAYACAAAACEA toM4kv4AAADhAQAAEwAAAAAAAAAAAAAAAAAAAAAAW0NvbnRlbnRfVHlwZXNdLnhtbFBLAQItABQA BgAIAAAAIQA4/SH/1gAAAJQBAAALAAAAAAAAAAAAAAAAAC8BAABfcmVscy8ucmVsc1BLAQItABQA BgAIAAAAIQASzCNUqwEAAEUDAAAOAAAAAAAAAAAAAAAAAC4CAABkcnMvZTJvRG9jLnhtbFBLAQIt ABQABgAIAAAAIQAyLg083QAAAAkBAAAPAAAAAAAAAAAAAAAAAAUEAABkcnMvZG93bnJldi54bWxQ SwUGAAAAAAQABADzAAAADwUAAAAA " strokecolor="#5b9bd5" strokeweight=".5pt">
+              <ns8:stroke joinstyle="miter"/>
+            </ns8:line>
+          </ns0:pict>
+        </ns1:Fallback>
+      </ns1:AlternateContent>
+    </ns0:r>
+  </ns0:p>
+  <ns0:p ns2:paraId="1BDA9624" ns2:textId="77777777" ns0:rsidR="008C47A6" ns0:rsidRDefault="00000000" ns0:rsidP="00E74375">
+    <ns0:r>
+      <ns0:rPr>
+        <ns0:noProof/>
+      </ns0:rPr>
+      <ns1:AlternateContent>
+        <ns1:Choice Requires="wps">
+          <ns0:drawing>
+            <ns3:anchor distT="0" distB="0" distL="114300" distR="114300" simplePos="0" relativeHeight="251665408" behindDoc="0" locked="0" layoutInCell="1" allowOverlap="1" ns4:anchorId="60968E5B" ns4:editId="0AE01EE4">
+              <ns3:simplePos x="0" y="0"/>
+              <ns3:positionH relativeFrom="page">
+                <ns3:posOffset>5890716</ns3:posOffset>
+              </ns3:positionH>
+              <ns3:positionV relativeFrom="page">
+                <ns3:posOffset>10161905</ns3:posOffset>
+              </ns3:positionV>
+              <ns3:extent cx="1047115" cy="313690"/>
+              <ns3:effectExtent l="0" t="0" r="0" b="0"/>
+              <ns3:wrapThrough wrapText="bothSides">
+                <ns3:wrapPolygon edited="0">
+                  <ns3:start x="786" y="0"/>
+                  <ns3:lineTo x="786" y="19676"/>
+                  <ns3:lineTo x="20434" y="19676"/>
+                  <ns3:lineTo x="20434" y="0"/>
+                  <ns3:lineTo x="786" y="0"/>
+                </ns3:wrapPolygon>
+              </ns3:wrapThrough>
+              <ns3:docPr id="15988398" name="Text Box 10"/>
+              <ns3:cNvGraphicFramePr>
+                <ns5:graphicFrameLocks/>
+              </ns3:cNvGraphicFramePr>
+              <ns5:graphic>
+                <ns5:graphicData uri="http://schemas.microsoft.com/office/word/2010/wordprocessingShape">
+                  <ns6:wsp>
+                    <ns6:cNvSpPr txBox="1">
+                      <ns5:spLocks/>
+                    </ns6:cNvSpPr>
+                    <ns6:spPr>
+                      <ns5:xfrm>
+                        <ns5:off x="0" y="0"/>
+                        <ns5:ext cx="1047115" cy="313690"/>
+                      </ns5:xfrm>
+                      <ns5:prstGeom prst="rect">
+                        <ns5:avLst/>
+                      </ns5:prstGeom>
+                      <ns5:noFill/>
+                      <ns5:ln>
+                        <ns5:noFill/>
+                      </ns5:ln>
+                      <ns5:effectLst/>
+                      <ns5:extLst>
+                        <ns5:ext uri="{C572A759-6A51-4108-AA02-DFA0A04FC94B}">
+                          <ns7:wrappingTextBoxFlag/>
+                        </ns5:ext>
+                      </ns5:extLst>
+                    </ns6:spPr>
+                    <ns6:txbx>
+                      <ns0:txbxContent>
+                        <ns0:p ns2:paraId="6E7F58BD" ns2:textId="77777777" ns0:rsidR="008C47A6" ns0:rsidRPr="00C954D2" ns0:rsidRDefault="00000000" ns0:rsidP="001E1BF6">
+                          <ns0:pPr>
+                            <ns0:jc ns0:val="right"/>
+                            <ns0:rPr>
+                              <ns0:i/>
+                              <ns0:color ns0:val="0070C0"/>
+                              <ns0:sz ns0:val="14"/>
+                              <ns0:szCs ns0:val="14"/>
+                            </ns0:rPr>
+                          </ns0:pPr>
+                          <ns0:r ns0:rsidRPr="00C954D2">
+                            <ns0:rPr>
+                              <ns0:i/>
+                              <ns0:color ns0:val="0070C0"/>
+                              <ns0:sz ns0:val="14"/>
+                              <ns0:szCs ns0:val="14"/>
+                            </ns0:rPr>
+                            <ns0:t xml:space="preserve">Página </ns0:t>
+                          </ns0:r>
+                          <ns0:r ns0:rsidRPr="00C954D2">
+                            <ns0:rPr>
+                              <ns0:i/>
+                              <ns0:color ns0:val="0070C0"/>
+                              <ns0:sz ns0:val="14"/>
+                              <ns0:szCs ns0:val="14"/>
+                            </ns0:rPr>
+                            <ns0:fldChar ns0:fldCharType="begin"/>
+                          </ns0:r>
+                          <ns0:r ns0:rsidRPr="00C954D2">
+                            <ns0:rPr>
+                              <ns0:i/>
+                              <ns0:color ns0:val="0070C0"/>
+                              <ns0:sz ns0:val="14"/>
+                              <ns0:szCs ns0:val="14"/>
+                            </ns0:rPr>
+                            <ns0:instrText>PAGE   \* MERGEFORMAT</ns0:instrText>
+                          </ns0:r>
+                          <ns0:r ns0:rsidRPr="00C954D2">
+                            <ns0:rPr>
+                              <ns0:i/>
+                              <ns0:color ns0:val="0070C0"/>
+                              <ns0:sz ns0:val="14"/>
+                              <ns0:szCs ns0:val="14"/>
+                            </ns0:rPr>
+                            <ns0:fldChar ns0:fldCharType="separate"/>
+                          </ns0:r>
+                          <ns0:r ns0:rsidRPr="00C954D2">
+                            <ns0:rPr>
+                              <ns0:i/>
+                              <ns0:noProof/>
+                              <ns0:color ns0:val="0070C0"/>
+                              <ns0:sz ns0:val="14"/>
+                              <ns0:szCs ns0:val="14"/>
+                            </ns0:rPr>
+                            <ns0:t>19</ns0:t>
+                          </ns0:r>
+                          <ns0:r ns0:rsidRPr="00C954D2">
+                            <ns0:rPr>
+                              <ns0:i/>
+                              <ns0:color ns0:val="0070C0"/>
+                              <ns0:sz ns0:val="14"/>
+                              <ns0:szCs ns0:val="14"/>
+                            </ns0:rPr>
+                            <ns0:fldChar ns0:fldCharType="end"/>
+                          </ns0:r>
+                        </ns0:p>
+                        <ns0:p ns2:paraId="267C2E9E" ns2:textId="77777777" ns0:rsidR="008C47A6" ns0:rsidRPr="00C954D2" ns0:rsidRDefault="00000000" ns0:rsidP="001E1BF6">
+                          <ns0:pPr>
+                            <ns0:jc ns0:val="right"/>
+                            <ns0:rPr>
+                              <ns0:i/>
+                              <ns0:color ns0:val="0070C0"/>
+                              <ns0:sz ns0:val="14"/>
+                              <ns0:szCs ns0:val="14"/>
+                            </ns0:rPr>
+                          </ns0:pPr>
+                          <ns0:r ns0:rsidRPr="00C954D2">
+                            <ns0:rPr>
+                              <ns0:i/>
+                              <ns0:color ns0:val="0070C0"/>
+                              <ns0:sz ns0:val="14"/>
+                              <ns0:szCs ns0:val="14"/>
+                            </ns0:rPr>
+                            <ns0:t>5</ns0:t>
+                          </ns0:r>
+                          <ns0:r>
+                            <ns0:rPr>
+                              <ns0:i/>
+                              <ns0:color ns0:val="0070C0"/>
+                              <ns0:sz ns0:val="14"/>
+                              <ns0:szCs ns0:val="14"/>
+                            </ns0:rPr>
+                            <ns0:t>35.2.1</ns0:t>
+                          </ns0:r>
+                        </ns0:p>
+                      </ns0:txbxContent>
+                    </ns6:txbx>
+                    <ns6:bodyPr rot="0" spcFirstLastPara="0" vertOverflow="overflow" horzOverflow="overflow" vert="horz" wrap="square" lIns="91440" tIns="45720" rIns="91440" bIns="45720" numCol="1" spcCol="0" rtlCol="0" fromWordArt="0" anchor="ctr" anchorCtr="0" forceAA="0" compatLnSpc="1">
+                      <ns5:prstTxWarp prst="textNoShape">
+                        <ns5:avLst/>
+                      </ns5:prstTxWarp>
+                      <ns5:noAutofit/>
+                    </ns6:bodyPr>
+                  </ns6:wsp>
+                </ns5:graphicData>
+              </ns5:graphic>
+              <ns4:sizeRelH relativeFrom="margin">
+                <ns4:pctWidth>0</ns4:pctWidth>
+              </ns4:sizeRelH>
+              <ns4:sizeRelV relativeFrom="margin">
+                <ns4:pctHeight>0</ns4:pctHeight>
+              </ns4:sizeRelV>
+            </ns3:anchor>
+          </ns0:drawing>
+        </ns1:Choice>
+        <ns1:Fallback>
+          <ns0:pict>
+            <ns8:shape ns2:anchorId="60968E5B" id="_x0000_s1035" type="#_x0000_t202" style="position:absolute;left:0;text-align:left;margin-left:463.85pt;margin-top:800.15pt;width:82.45pt;height:24.7pt;z-index:251665408;visibility:visible;mso-wrap-style:square;mso-width-percent:0;mso-height-percent:0;mso-wrap-distance-left:9pt;mso-wrap-distance-top:0;mso-wrap-distance-right:9pt;mso-wrap-distance-bottom:0;mso-position-horizontal:absolute;mso-position-horizontal-relative:page;mso-position-vertical:absolute;mso-position-vertical-relative:page;mso-width-percent:0;mso-height-percent:0;mso-width-relative:margin;mso-height-relative:margin;v-text-anchor:middle" ns9:gfxdata="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" filled="f" stroked="f">
+              <ns8:textbox>
+                <ns0:txbxContent>
+                  <ns0:p ns2:paraId="6E7F58BD" ns2:textId="77777777" ns0:rsidR="008C47A6" ns0:rsidRPr="00C954D2" ns0:rsidRDefault="00000000" ns0:rsidP="001E1BF6">
+                    <ns0:pPr>
+                      <ns0:jc ns0:val="right"/>
+                      <ns0:rPr>
+                        <ns0:i/>
+                        <ns0:color ns0:val="0070C0"/>
+                        <ns0:sz ns0:val="14"/>
+                        <ns0:szCs ns0:val="14"/>
+                      </ns0:rPr>
+                    </ns0:pPr>
+                    <ns0:r ns0:rsidRPr="00C954D2">
+                      <ns0:rPr>
+                        <ns0:i/>
+                        <ns0:color ns0:val="0070C0"/>
+                        <ns0:sz ns0:val="14"/>
+                        <ns0:szCs ns0:val="14"/>
+                      </ns0:rPr>
+                      <ns0:t xml:space="preserve">Página </ns0:t>
+                    </ns0:r>
+                    <ns0:r ns0:rsidRPr="00C954D2">
+                      <ns0:rPr>
+                        <ns0:i/>
+                        <ns0:color ns0:val="0070C0"/>
+                        <ns0:sz ns0:val="14"/>
+                        <ns0:szCs ns0:val="14"/>
+                      </ns0:rPr>
+                      <ns0:fldChar ns0:fldCharType="begin"/>
+                    </ns0:r>
+                    <ns0:r ns0:rsidRPr="00C954D2">
+                      <ns0:rPr>
+                        <ns0:i/>
+                        <ns0:color ns0:val="0070C0"/>
+                        <ns0:sz ns0:val="14"/>
+                        <ns0:szCs ns0:val="14"/>
+                      </ns0:rPr>
+                      <ns0:instrText>PAGE   \* MERGEFORMAT</ns0:instrText>
+                    </ns0:r>
+                    <ns0:r ns0:rsidRPr="00C954D2">
+                      <ns0:rPr>
+                        <ns0:i/>
+                        <ns0:color ns0:val="0070C0"/>
+                        <ns0:sz ns0:val="14"/>
+                        <ns0:szCs ns0:val="14"/>
+                      </ns0:rPr>
+                      <ns0:fldChar ns0:fldCharType="separate"/>
+                    </ns0:r>
+                    <ns0:r ns0:rsidRPr="00C954D2">
+                      <ns0:rPr>
+                        <ns0:i/>
+                        <ns0:noProof/>
+                        <ns0:color ns0:val="0070C0"/>
+                        <ns0:sz ns0:val="14"/>
+                        <ns0:szCs ns0:val="14"/>
+                      </ns0:rPr>
+                      <ns0:t>19</ns0:t>
+                    </ns0:r>
+                    <ns0:r ns0:rsidRPr="00C954D2">
+                      <ns0:rPr>
+                        <ns0:i/>
+                        <ns0:color ns0:val="0070C0"/>
+                        <ns0:sz ns0:val="14"/>
+                        <ns0:szCs ns0:val="14"/>
+                      </ns0:rPr>
+                      <ns0:fldChar ns0:fldCharType="end"/>
+                    </ns0:r>
+                  </ns0:p>
+                  <ns0:p ns2:paraId="267C2E9E" ns2:textId="77777777" ns0:rsidR="008C47A6" ns0:rsidRPr="00C954D2" ns0:rsidRDefault="00000000" ns0:rsidP="001E1BF6">
+                    <ns0:pPr>
+                      <ns0:jc ns0:val="right"/>
+                      <ns0:rPr>
+                        <ns0:i/>
+                        <ns0:color ns0:val="0070C0"/>
+                        <ns0:sz ns0:val="14"/>
+                        <ns0:szCs ns0:val="14"/>
+                      </ns0:rPr>
+                    </ns0:pPr>
+                    <ns0:r ns0:rsidRPr="00C954D2">
+                      <ns0:rPr>
+                        <ns0:i/>
+                        <ns0:color ns0:val="0070C0"/>
+                        <ns0:sz ns0:val="14"/>
+                        <ns0:szCs ns0:val="14"/>
+                      </ns0:rPr>
+                      <ns0:t>5</ns0:t>
+                    </ns0:r>
+                    <ns0:r>
+                      <ns0:rPr>
+                        <ns0:i/>
+                        <ns0:color ns0:val="0070C0"/>
+                        <ns0:sz ns0:val="14"/>
+                        <ns0:szCs ns0:val="14"/>
+                      </ns0:rPr>
+                      <ns0:t>35.2.1</ns0:t>
+                    </ns0:r>
+                  </ns0:p>
+                </ns0:txbxContent>
+              </ns8:textbox>
+              <ns10:wrap type="through" anchorx="page" anchory="page"/>
+            </ns8:shape>
+          </ns0:pict>
+        </ns1:Fallback>
+      </ns1:AlternateContent>
+    </ns0:r>
+    <ns0:r>
+      <ns0:rPr>
+        <ns0:noProof/>
+      </ns0:rPr>
+      <ns1:AlternateContent>
+        <ns1:Choice Requires="wps">
+          <ns0:drawing>
+            <ns3:anchor distT="0" distB="0" distL="114300" distR="114300" simplePos="0" relativeHeight="251659264" behindDoc="0" locked="0" layoutInCell="1" allowOverlap="1" ns4:anchorId="530DBE89" ns4:editId="51535FF7">
+              <ns3:simplePos x="0" y="0"/>
+              <ns3:positionH relativeFrom="column">
+                <ns3:posOffset>1562100</ns3:posOffset>
+              </ns3:positionH>
+              <ns3:positionV relativeFrom="paragraph">
+                <ns3:posOffset>51435</ns3:posOffset>
+              </ns3:positionV>
+              <ns3:extent cx="0" cy="457200"/>
+              <ns3:effectExtent l="0" t="0" r="38100" b="19050"/>
+              <ns3:wrapNone/>
+              <ns3:docPr id="1978811866" name="Conector recto 1978811866"/>
+              <ns3:cNvGraphicFramePr/>
+              <ns5:graphic>
+                <ns5:graphicData uri="http://schemas.microsoft.com/office/word/2010/wordprocessingShape">
+                  <ns6:wsp>
+                    <ns6:cNvCnPr/>
+                    <ns6:spPr>
+                      <ns5:xfrm>
+                        <ns5:off x="0" y="0"/>
+                        <ns5:ext cx="0" cy="457200"/>
+                      </ns5:xfrm>
+                      <ns5:prstGeom prst="line">
+                        <ns5:avLst/>
+                      </ns5:prstGeom>
+                      <ns5:noFill/>
+                      <ns5:ln w="6350" cap="flat" cmpd="sng" algn="ctr">
+                        <ns5:solidFill>
+                          <ns5:sysClr val="windowText" lastClr="000000"/>
+                        </ns5:solidFill>
+                        <ns5:prstDash val="solid"/>
+                        <ns5:miter lim="800000"/>
+                      </ns5:ln>
+                      <ns5:effectLst/>
+                    </ns6:spPr>
+                    <ns6:bodyPr/>
+                  </ns6:wsp>
+                </ns5:graphicData>
+              </ns5:graphic>
+            </ns3:anchor>
+          </ns0:drawing>
+        </ns1:Choice>
+        <ns1:Fallback>
+          <ns0:pict>
+            <ns8:line ns2:anchorId="29C75443" id="Conector recto 30" ns9:spid="_x0000_s1026" style="position:absolute;z-index:251666432;visibility:visible;mso-wrap-style:square;mso-wrap-distance-left:9pt;mso-wrap-distance-top:0;mso-wrap-distance-right:9pt;mso-wrap-distance-bottom:0;mso-position-horizontal:absolute;mso-position-horizontal-relative:text;mso-position-vertical:absolute;mso-position-vertical-relative:text" from="123pt,4.05pt" to="123pt,40.05pt" ns9:gfxdata="UEsDBBQABgAIAAAAIQC2gziS/gAAAOEBAAATAAAAW0NvbnRlbnRfVHlwZXNdLnhtbJSRQU7DMBBF 90jcwfIWJU67QAgl6YK0S0CoHGBkTxKLZGx5TGhvj5O2G0SRWNoz/78nu9wcxkFMGNg6quQqL6RA 0s5Y6ir5vt9lD1JwBDIwOMJKHpHlpr69KfdHjyxSmriSfYz+USnWPY7AufNIadK6MEJMx9ApD/oD OlTrorhX2lFEilmcO2RdNtjC5xDF9pCuTyYBB5bi6bQ4syoJ3g9WQ0ymaiLzg5KdCXlKLjvcW893 SUOqXwnz5DrgnHtJTxOsQfEKIT7DmDSUCaxw7Rqn8787ZsmRM9e2VmPeBN4uqYvTtW7jvijg9N/y JsXecLq0q+WD6m8AAAD//wMAUEsDBBQABgAIAAAAIQA4/SH/1gAAAJQBAAALAAAAX3JlbHMvLnJl bHOkkMFqwzAMhu+DvYPRfXGawxijTi+j0GvpHsDYimMaW0Yy2fr2M4PBMnrbUb/Q94l/f/hMi1qR JVI2sOt6UJgd+ZiDgffL8ekFlFSbvV0oo4EbChzGx4f9GRdb25HMsYhqlCwG5lrLq9biZkxWOiqY 22YiTra2kYMu1l1tQD30/bPm3wwYN0x18gb45AdQl1tp5j/sFB2T0FQ7R0nTNEV3j6o9feQzro1i OWA14Fm+Q8a1a8+Bvu/d/dMb2JY5uiPbhG/ktn4cqGU/er3pcvwCAAD//wMAUEsDBBQABgAIAAAA IQB2XM8xrwEAAFgDAAAOAAAAZHJzL2Uyb0RvYy54bWysU01vEzEQvSPxHyzfidNCS7WK00OjckFQ ifIDpv7YteQveUw2+feMvSENcEPswWvPeN7Oe/N2c38Inu1NQZei5FerNWcmqqRdHCX//vz47o4z rBA1+BSN5EeD/H779s1mzoO5TlPy2hRGIBGHOUs+1ZoHIVBNJgCuUjaRkjaVAJWOZRS6wEzowYvr 9fpWzKnoXJIyiBTdLUm+7fjWGlW/WoumMi859Vb7Wvr60lax3cAwFsiTU6c24B+6COAiffQMtYMK 7Edxf0EFp0rCZOtKpSCStU6ZzoHYXK3/YPNtgmw6FxIH81km/H+w6sv+IT4VkmHOOGB+Ko3FwZbQ 3tQfO3SxjmexzKEytQQVRT/cfKQ5NB3Fa10uWD+ZFFjbSO5dbDRggP1nrMvVX1daOKZH530fhY9s lvz2/Q0NSwEZwnqotA1ZS45x5Az8SE5TtXRETN7pVt1w8IgPvrA90LDJIzrNz9QtZx6wUoIo9OfU 7G+lrZ0d4LQU99TijeAqGdS7IPndZbWP7YumW+xE6lXBtntJ+tiFFe1E4+sKnazW/HF5pv3lD7H9 CQAA//8DAFBLAwQUAAYACAAAACEA3Ghnn9wAAAAIAQAADwAAAGRycy9kb3ducmV2LnhtbEyPy07D MBBF90j9B2sqsaN2WlSqEKeqWnXBrgSQWLrx5AHxOIqdNvw9g1jA8uiO7pybbSfXiQsOofWkIVko EEilty3VGl5fjncbECEasqbzhBq+MMA2n91kJrX+Ss94KWItuIRCajQ0MfaplKFs0Jmw8D0SZ5Uf nImMQy3tYK5c7jq5VGotnWmJPzSmx32D5WcxOg3jaV+p9riaPt5XhRyfHk5vh6rW+nY+7R5BRJzi 3zH86LM65Ox09iPZIDoNy/s1b4kaNgkIzn/5zKwSkHkm/w/IvwEAAP//AwBQSwECLQAUAAYACAAA ACEAtoM4kv4AAADhAQAAEwAAAAAAAAAAAAAAAAAAAAAAW0NvbnRlbnRfVHlwZXNdLnhtbFBLAQIt ABQABgAIAAAAIQA4/SH/1gAAAJQBAAALAAAAAAAAAAAAAAAAAC8BAABfcmVscy8ucmVsc1BLAQIt ABQABgAIAAAAIQB2XM8xrwEAAFgDAAAOAAAAAAAAAAAAAAAAAC4CAABkcnMvZTJvRG9jLnhtbFBL AQItABQABgAIAAAAIQDcaGef3AAAAAgBAAAPAAAAAAAAAAAAAAAAAAkEAABkcnMvZG93bnJldi54 bWxQSwUGAAAAAAQABADzAAAAEgUAAAAA " strokecolor="windowText" strokeweight=".5pt">
+              <ns8:stroke joinstyle="miter"/>
+            </ns8:line>
+          </ns0:pict>
+        </ns1:Fallback>
+      </ns1:AlternateContent>
+    </ns0:r>
+    <ns0:r>
+      <ns0:rPr>
+        <ns0:noProof/>
+      </ns0:rPr>
+      <ns1:AlternateContent>
+        <ns1:Choice Requires="wps">
+          <ns0:drawing>
+            <ns3:anchor distT="0" distB="0" distL="114300" distR="114300" simplePos="0" relativeHeight="251655168" behindDoc="0" locked="0" layoutInCell="1" allowOverlap="1" ns4:anchorId="06956A8A" ns4:editId="2D24E183">
+              <ns3:simplePos x="0" y="0"/>
+              <ns3:positionH relativeFrom="column">
+                <ns3:posOffset>304800</ns3:posOffset>
+              </ns3:positionH>
+              <ns3:positionV relativeFrom="paragraph">
+                <ns3:posOffset>51435</ns3:posOffset>
+              </ns3:positionV>
+              <ns3:extent cx="0" cy="457200"/>
+              <ns3:effectExtent l="0" t="0" r="38100" b="19050"/>
+              <ns3:wrapNone/>
+              <ns3:docPr id="1989076238" name="Conector recto 1989076238"/>
+              <ns3:cNvGraphicFramePr/>
+              <ns5:graphic>
+                <ns5:graphicData uri="http://schemas.microsoft.com/office/word/2010/wordprocessingShape">
+                  <ns6:wsp>
+                    <ns6:cNvCnPr/>
+                    <ns6:spPr>
+                      <ns5:xfrm>
+                        <ns5:off x="0" y="0"/>
+                        <ns5:ext cx="0" cy="457200"/>
+                      </ns5:xfrm>
+                      <ns5:prstGeom prst="line">
+                        <ns5:avLst/>
+                      </ns5:prstGeom>
+                      <ns5:noFill/>
+                      <ns5:ln w="6350" cap="flat" cmpd="sng" algn="ctr">
+                        <ns5:solidFill>
+                          <ns5:sysClr val="windowText" lastClr="000000"/>
+                        </ns5:solidFill>
+                        <ns5:prstDash val="solid"/>
+                        <ns5:miter lim="800000"/>
+                      </ns5:ln>
+                      <ns5:effectLst/>
+                    </ns6:spPr>
+                    <ns6:bodyPr/>
+                  </ns6:wsp>
+                </ns5:graphicData>
+              </ns5:graphic>
+            </ns3:anchor>
+          </ns0:drawing>
+        </ns1:Choice>
+        <ns1:Fallback>
+          <ns0:pict>
+            <ns8:line ns2:anchorId="26AC4FCA" id="Conector recto 31" ns9:spid="_x0000_s1026" style="position:absolute;z-index:251664384;visibility:visible;mso-wrap-style:square;mso-wrap-distance-left:9pt;mso-wrap-distance-top:0;mso-wrap-distance-right:9pt;mso-wrap-distance-bottom:0;mso-position-horizontal:absolute;mso-position-horizontal-relative:text;mso-position-vertical:absolute;mso-position-vertical-relative:text" from="24pt,4.05pt" to="24pt,40.05pt" ns9:gfxdata="UEsDBBQABgAIAAAAIQC2gziS/gAAAOEBAAATAAAAW0NvbnRlbnRfVHlwZXNdLnhtbJSRQU7DMBBF 90jcwfIWJU67QAgl6YK0S0CoHGBkTxKLZGx5TGhvj5O2G0SRWNoz/78nu9wcxkFMGNg6quQqL6RA 0s5Y6ir5vt9lD1JwBDIwOMJKHpHlpr69KfdHjyxSmriSfYz+USnWPY7AufNIadK6MEJMx9ApD/oD OlTrorhX2lFEilmcO2RdNtjC5xDF9pCuTyYBB5bi6bQ4syoJ3g9WQ0ymaiLzg5KdCXlKLjvcW893 SUOqXwnz5DrgnHtJTxOsQfEKIT7DmDSUCaxw7Rqn8787ZsmRM9e2VmPeBN4uqYvTtW7jvijg9N/y JsXecLq0q+WD6m8AAAD//wMAUEsDBBQABgAIAAAAIQA4/SH/1gAAAJQBAAALAAAAX3JlbHMvLnJl bHOkkMFqwzAMhu+DvYPRfXGawxijTi+j0GvpHsDYimMaW0Yy2fr2M4PBMnrbUb/Q94l/f/hMi1qR JVI2sOt6UJgd+ZiDgffL8ekFlFSbvV0oo4EbChzGx4f9GRdb25HMsYhqlCwG5lrLq9biZkxWOiqY 22YiTra2kYMu1l1tQD30/bPm3wwYN0x18gb45AdQl1tp5j/sFB2T0FQ7R0nTNEV3j6o9feQzro1i OWA14Fm+Q8a1a8+Bvu/d/dMb2JY5uiPbhG/ktn4cqGU/er3pcvwCAAD//wMAUEsDBBQABgAIAAAA IQB2XM8xrwEAAFgDAAAOAAAAZHJzL2Uyb0RvYy54bWysU01vEzEQvSPxHyzfidNCS7WK00OjckFQ ifIDpv7YteQveUw2+feMvSENcEPswWvPeN7Oe/N2c38Inu1NQZei5FerNWcmqqRdHCX//vz47o4z rBA1+BSN5EeD/H779s1mzoO5TlPy2hRGIBGHOUs+1ZoHIVBNJgCuUjaRkjaVAJWOZRS6wEzowYvr 9fpWzKnoXJIyiBTdLUm+7fjWGlW/WoumMi859Vb7Wvr60lax3cAwFsiTU6c24B+6COAiffQMtYMK 7Edxf0EFp0rCZOtKpSCStU6ZzoHYXK3/YPNtgmw6FxIH81km/H+w6sv+IT4VkmHOOGB+Ko3FwZbQ 3tQfO3SxjmexzKEytQQVRT/cfKQ5NB3Fa10uWD+ZFFjbSO5dbDRggP1nrMvVX1daOKZH530fhY9s lvz2/Q0NSwEZwnqotA1ZS45x5Az8SE5TtXRETN7pVt1w8IgPvrA90LDJIzrNz9QtZx6wUoIo9OfU 7G+lrZ0d4LQU99TijeAqGdS7IPndZbWP7YumW+xE6lXBtntJ+tiFFe1E4+sKnazW/HF5pv3lD7H9 CQAA//8DAFBLAwQUAAYACAAAACEAHxfvLNoAAAAGAQAADwAAAGRycy9kb3ducmV2LnhtbEyPy07D MBBF90j9B2sqsaN2WgRRiFNVRV2wKwEklm48eUA8jmKnDX/PwAaWR3d075l8O7tenHEMnScNyUqB QKq87ajR8PpyuElBhGjImt4TavjCANticZWbzPoLPeO5jI3gEgqZ0dDGOGRShqpFZ8LKD0ic1X50 JjKOjbSjuXC56+VaqTvpTEe80JoB9y1Wn+XkNEzHfa26w2b+eN+Ucnq6P7491o3W18t59wAi4hz/ juFHn9WhYKeTn8gG0Wu4TfmVqCFNQHD8iydGlYAscvlfv/gGAAD//wMAUEsBAi0AFAAGAAgAAAAh ALaDOJL+AAAA4QEAABMAAAAAAAAAAAAAAAAAAAAAAFtDb250ZW50X1R5cGVzXS54bWxQSwECLQAU AAYACAAAACEAOP0h/9YAAACUAQAACwAAAAAAAAAAAAAAAAAvAQAAX3JlbHMvLnJlbHNQSwECLQAU AAYACAAAACEAdlzPMa8BAABYAwAADgAAAAAAAAAAAAAAAAAuAgAAZHJzL2Uyb0RvYy54bWxQSwEC LQAUAAYACAAAACEAHxfvLNoAAAAGAQAADwAAAAAAAAAAAAAAAAAJBAAAZHJzL2Rvd25yZXYueG1s UEsFBgAAAAAEAAQA8wAAABAFAAAAAA== " strokecolor="windowText" strokeweight=".5pt">
+              <ns8:stroke joinstyle="miter"/>
+            </ns8:line>
+          </ns0:pict>
+        </ns1:Fallback>
+      </ns1:AlternateContent>
+    </ns0:r>
+  </ns0:p>
+</ns0:ftr>
 </file>
 
 <file path=word/footnotes.xml><?xml version="1.0" encoding="utf-8"?>
@@ -4833,6 +4865,11 @@
     <w:pPr>
       <w:jc w:val="both"/>
     </w:pPr>
+    <w:rPr>
+      <w:rFonts w:ascii="Montserrat" w:hAnsi="Montserrat" w:eastAsia="Montserrat" w:cs="Montserrat"/>
+      <w:sz w:val="19"/>
+      <w:szCs w:val="19"/>
+    </w:rPr>
   </w:style>
   <w:style w:type="paragraph" w:styleId="Ttulo1">
     <w:name w:val="heading 1"/>

</xml_diff>